<commit_message>
Integrate course presentation material into the assignment
Weave explicit references to the class presentations (behavior as
language, working from connection, staff-member figure, holding/
handling, containment, guide roles) throughout all four answers and add
them to the reference list, as required.

Co-Authored-By: Claude Opus 4.8 <noreply@anthropic.com>
Claude-Session: https://claude.ai/code/session_013eDJJACHg3huLEj7ZFfo9K
</commit_message>
<xml_diff>
--- a/עבודה_מסכמת_נוער_בסיכון_מורה_לחיים.docx
+++ b/עבודה_מסכמת_נוער_בסיכון_מורה_לחיים.docx
@@ -140,7 +140,7 @@
           <w:szCs w:val="24"/>
           <w:rtl w:val="1"/>
         </w:rPr>
-        <w:t>מופע התנהגותי הוא הדרך שבה ילד מראה לעולם את מה שאין לו מילים לומר. ההתנהגות היא שפה, וכשנחסמת היכולת להמשיג ולהסביר, הילד מתנהג את מצוקתו במקום לספר אותה. אצל ילדים שנשאו פגיעה ראשונית, סביבה שלא הצליחה לווסת אותם בראשית חייהם, לא נבנו כלים לעבד חרדה, והיא נותרת מציפה ובלתי מוכלת. לכן המופע קיים. הוא פורקן של דחף שלא עובד, וגם ניסיון נואש לתקשר. אצל האחד יתפרץ זעם, אצל האחר תופיע שקיעה ודכדוך. מה עלינו לעשות? קודם כול לא להיבהל ולא לפעול מתוך העלבון שההתנהגות מעוררת בנו, אלא להתכוונן אליה, לחפש את הסיפור שמתחתיה ולהחזיק אותו עבור הילד עד שנוכל להשיב לו אותו במילים (ביבי, אורן-צ′יפמן ובלנרו-אדיב, 2016; פונגי, אלן וביטמן, 2008).</w:t>
+        <w:t>כפי שנלמד במצגת “מאפייני הנערים.ות”, ההתנהגות היא שפה, ומופע התנהגותי הוא הדרך שבה ילד מראה לעולם את מה שאין לו מילים לומר. כשנחסמת היכולת להמשיג ולהסביר, הילד “מתנהג את מצוקתו” במקום לספר אותה. המופע קיים משום שאצל ילדים שנשאו פגיעה ראשונית, סביבה שלא הצליחה לווסת אותם בראשית חייהם, לא נבנו מנגנוני ויסות וארגון עצמי, והחרדה, עד כדי חרדת כיליון, נותרת מציפה ובלתי מוכלת. לכן המופע הוא בעת ובעונה אחת פורקן של דחף לא מעובד וניסיון נואש לתקשר. במצגת מנו כמה מופעים, ובהם חרדה, פחד מקרבה, עצב וריקנות, מחשבה שאינה נחשבת, והרס וכיליון, ואצל האחד תתפרץ תוקפנות בעוד אצל האחר תופיע שקיעה ודכדוך. מה עלינו לעשות? לא להיבהל ולא לפעול מתוך העלבון, אלא להתכוונן אל המופע, לחפש את הסיפור שמתחתיו ולהחזיק אותו עבור הילד עד שנוכל להשיב לו אותו במילים (מצגות הקורס: “מאפייני הנערים.ות”; ביבי, אורן-צ′יפמן ובלנרו-אדיב, 2016; פונגי, אלן וביטמן, 2008).</w:t>
       </w:r>
     </w:p>
     <w:p>
@@ -170,7 +170,7 @@
           <w:szCs w:val="24"/>
           <w:rtl w:val="1"/>
         </w:rPr>
-        <w:t>המופע הבולט של טיישון הוא הרס ואיום. בימים הראשונים קלארק חוזר לכיתה מחוללת ומושחתת, וטיישון מודה בגאווה שהוא זה שעשה זאת (17:59–19:41). עוד קודם הוא מתגרה “תשעה אותי” (16:41), ובהמשך מסרב לכתוב ביומן החלומות, מתחצף ומאיים לעזוב, אף שכבר יש לו שני “סטרייקים” (31:44, 33:34). הגורמים שהובילו לכך ברורים מרקע הדמות: טיישון חי במשפחת אומנה, שלושה חודשים בעיר בלי שראה בה דבר, ילד שכבר תויג ומצוי בדרך למעצר נוער. מורה חדש שדורש קרבה וכללים הוא בדיוק מה שמאיים עליו. תגובות הסביבה הזינו את ההסלמה: המנהל טרנר נאחז בכללים ומוכן לסלק, מורים קודמים כבר ויתרו (הכיתה החליפה שישה מורים), וההורה האומן מוותר עליו בשימוע (59:23). התוצאה היא שימוע סילוק שהיה מדרדר אותו אל הרחוב, אלא שקלארק מסרב להגיב באותו מטבע, מחזיק את הגבול ברוגע ונלחם נגד הסילוק. וכך המופע, שנועד להרחיק, דווקא מזמן קרבה.</w:t>
+        <w:t>המופע הבולט של טיישון הוא “הרס וכיליון”, על פי הטיפולוגיה שנלמדה. בימים הראשונים קלארק חוזר לכיתה מחוללת ומושחתת, וטיישון מודה בגאווה שהוא זה שעשה זאת (17:59–19:41). עוד קודם הוא מתגרה “תשעה אותי” (16:41), ובהמשך מסרב לכתוב ביומן החלומות, מתחצף ומאיים לעזוב, אף שכבר יש לו שני “סטרייקים” (31:44, 33:34). הגורמים שהובילו לכך ברורים מרקע הדמות: טיישון חי במשפחת אומנה, שלושה חודשים בעיר בלי שראה בה דבר, ילד שכבר תויג ומצוי בדרך למעצר נוער. מורה חדש שדורש קרבה וכללים נחווה כאיום קיומי, והתגובה היא זו של Fight, תקיפה. תגובות הסביבה הזינו את ההסלמה: המנהל טרנר נאחז בכללים ומוכן לסלק, מורים קודמים כבר ויתרו (הכיתה החליפה שישה מורים), וההורה האומן מוותר עליו בשימוע (59:23). התוצאה היא שימוע סילוק שהיה מדרדר אותו אל הרחוב, אלא שקלארק מסרב להגיב באותו מטבע, מחזיק את הגבול ברוגע ונלחם נגד הסילוק. וכך המופע, שנועד להרחיק, דווקא מזמן קרבה (מצגות הקורס: “מאפייני הנערים.ות”).</w:t>
       </w:r>
     </w:p>
     <w:p>
@@ -200,7 +200,7 @@
           <w:szCs w:val="24"/>
           <w:rtl w:val="1"/>
         </w:rPr>
-        <w:t>בעולמה הפנימי של הדמות פועלים יחסי אובייקט מוקדמים של חסך ונטישה. טיישון לא זכה לאם טובה דיה, ונותר בו אותו “חור שחור” של כמיהה לא ממומשת. הוא הפנים אובייקט דוחה ובלתי מהימן, והזדהה עם התוקפן, כלומר הפך להיות זה שהורס לפני שיהרסו או ינטשו אותו. בהעברה הוא פוגש בקלארק עוד מבוגר שיעזוב או ינצל אותו, ולכן הוא בוחן אותו: משחית, מתריס ומאיים לעזוב, כדי לבדוק אם המבוגר ישרוד בלי להשיב מלחמה ובלי לוותר. ההרס הזה הוא, במונחיו של ויניקוט, תקיפה של האובייקט מתוך משאלה שישרוד וימשיך להתקיים עבורו. ההעברה הנגדית גלויה: קלארק מגיע לרגע שפל ואומר למריסה “אני מוותר”, בדיוק הייאוש שהילד משליך עליו דרך הזדהות השלכתית. גם הפחד מקרבה פועל כאן, טיישון משווע לקרבה וחרד ממנה בו-זמנית. כשקלארק שורד, רואה את עבודות האמנות שלו ואומר לו שהן יפהפיות, מתאפשר לראשונה שההרס יוחלף בתלות ובדמעות (1:18:04). מהלך זה עולה בקנה אחד עם ממצאים עדכניים שלפיהם האופן שבו הסביבה משקפת את הנער מעצב את הדימוי העצמי שלו ואת הסתגלותו. נער שמשקפים לו שהוא “לוזר” נושא בתוכו את הדימוי הזה, ומבט אחר מרפה אותו (ויניקוט, 1971; Calheiros et al., 2021).</w:t>
+        <w:t>בעולמה הפנימי של הדמות פועלים יחסי אובייקט מוקדמים של חסך ונטישה. טיישון לא זכה לאם טובה דיה, ונותר בו אותו “חור שחור” של כמיהה לא ממומשת שעליו דובר במצגות. הוא הפנים אובייקט דוחה ובלתי מהימן (הפנמה והזדהות), והזדהה עם התוקפן, כלומר הפך להיות זה שהורס לפני שיהרסו או ינטשו אותו. בהעברה הוא פוגש בקלארק עוד מבוגר שיעזוב או ינצל אותו, ולכן הוא בוחן אותו, בדיוק כפי שתואר במצגת בהקשר של פחד מקרבה: משחית, מתריס ומאיים לעזוב, כדי לבדוק אם כשיש למבוגר כוח וקרבה הוא ינצל אותם נגדו. ההרס הזה הוא, במונחי “הרס האובייקט” של ויניקוט שהובאו בכיתה, תקיפה של האובייקט מתוך משאלה שישרוד וימשיך להתקיים עבורו. ההעברה הנגדית גלויה: קלארק מגיע לרגע שפל ואומר למריסה “אני מוותר”, בדיוק הייאוש שהילד מפקיד בו דרך הזדהות השלכתית (המושג שנלמד במצגת “החזקה והכלה”). כשקלארק שורד את ההרס, רואה את עבודות האמנות של טיישון ואומר לו שהן יפהפיות, מתאפשר לראשונה שההרס יוחלף בתלות ובדמעות (1:18:04). מהלך זה עולה בקנה אחד עם ממצאים עדכניים שלפיהם האופן שבו הסביבה משקפת את הנער מעצב את הדימוי העצמי שלו ואת הסתגלותו. נער שמשקפים לו שהוא “לוזר” נושא בתוכו את הדימוי הזה, ומבט אחר מרפה אותו (מצגות הקורס: “מאפייני הנערים.ות”, “החזקה והכלה”; ויניקוט, 1971; Calheiros et al., 2021).</w:t>
       </w:r>
     </w:p>
     <w:p>
@@ -237,7 +237,7 @@
           <w:szCs w:val="24"/>
           <w:rtl w:val="1"/>
         </w:rPr>
-        <w:t>אחזקה שלמה היא צירוף של שני רבדים שאי אפשר להפריד ביניהם. ה-handling הוא הארגון והניהול הפיזי של הסביבה: ההאכלה, הניקיון, הבגדים, מעקב אחר הגוף וגבולות המציאות שיש להם משמעות התפתחותית. הוא זה שמחבר את הילד לגופו ויוצר “האנשה”. ה-holding הוא ההחזקה הרגשית: נוכחות רציפה ועקבית, אם שחושבת את הילד ומעניקה משמעות לחוויותיו, ומייצרת תחושת רציפות קיום. יחד הם בונים אצל הילד את מה שחסר לו, ביטחון בסיסי, ומתוכו, בהדרגה, יכולת לווסת את עצמו ולהוציא את העצמי האמיתי מהמחבוא. זהו ההיבט ההתפתחותי: מה שהתחיל כטיפול פיזי חיצוני נעשה עם הזמן מבנה פנימי (ביבי, אורן-צ′יפמן ובלנרו-אדיב, 2016; ויניקוט, 1971).</w:t>
+        <w:t>כפי שנלמד במצגת “השאלת האימהות”, אחזקה שלמה היא צירוף של שני רבדים מן הפונקציות האימהיות שאי אפשר להפריד ביניהם. ה-handling הוא הארגון והניהול הפיזי של הסביבה: ההאכלה, הניקיון, הבגדים, מעקב אחר הגוף וגבולות המציאות שיש להם משמעות התפתחותית. הוא זה שמחבר את הילד לגופו ויוצר “האנשה”. ה-holding הוא ההחזקה הרגשית: נוכחות רציפה ועקבית, אם שחושבת את הילד ומעניקה משמעות לחוויותיו, ומייצרת רציפות, עקביות והמשכיות, ובתוכה “מרחב ביניים” שבו הילד יכול לחקור בידיעה שהאם שם. יחד הם בונים אצל הילד את מה שחסר לו, ביטחון בסיסי, ומתוכו, בהדרגה, יכולת לווסת את עצמו ולהוציא את העצמי האמיתי מהמחבוא, במקום להתגונן דרך עצמי כוזב (כפי שהוצג במצגת “החזקה והכלה”). זהו ההיבט ההתפתחותי: מה שהתחיל כטיפול פיזי חיצוני נעשה עם הזמן מבנה פנימי (מצגות הקורס: “השאלת האימהות”, “החזקה והכלה”; ביבי, אורן-צ′יפמן ובלנרו-אדיב, 2016; ויניקוט, 1971).</w:t>
       </w:r>
     </w:p>
     <w:p>
@@ -255,7 +255,7 @@
           <w:szCs w:val="24"/>
           <w:rtl w:val="1"/>
         </w:rPr>
-        <w:t>בקטע (ראו נספח מסומן בשני צבעים) קל לראות איך אתי נעה בין השניים. דוגמה ל-handling: היא עוקבת אחר משקל וגובה, מודדת חום בכף ידה, דואגת לבגדי חורף, לסדר, לניקיון ולתפריט השבועי, ומסכמת ש“מעולם לא ראיתי אמא שלא מחליפה טיטול רטוב ומלוכלך רק כי הילד לא רוצה”. זהו ניהול קונקרטי של המציאות, של הגוף ושל הגבול. דוגמה ל-holding: לפני שהיא נכנסת היא “מגייסת מתוכי את כל הקולות והצבעים של אמא ובית, מביאה אותם איתי פנימה”, ומסיימת ש“ילדים צריכים להרגיש עטופים בחום”. כאן אין ניהול, יש נוכחות שמעניקה משמעות וחום. שני הסוגים משלימים זה את זה: handling בלי holding נותר טכני ונטול נשמה, ו-holding בלי handling נשאר רגש בלי עוגן במציאות. דווקא השילוב, המרק שהושקע בו עמל יחד עם היכולת לשרוד את הבנות שמפרקות אותו, הוא שמאפשר לילד לחוש מוחזק ולהתפתח (ביבי ואח′, 2016).</w:t>
+        <w:t>בקטע (ראו נספח מסומן בשני צבעים) קל לראות איך אתי נעה בין השניים. דוגמה ל-handling: היא עוקבת אחר משקל וגובה, מודדת חום בכף ידה, דואגת לבגדי חורף, לסדר, לניקיון ולתפריט השבועי, ומסכמת ש“מעולם לא ראיתי אמא שלא מחליפה טיטול רטוב ומלוכלך רק כי הילד לא רוצה”. זהו ניהול קונקרטי של המציאות, של הגוף ושל הגבול. דוגמה ל-holding: לפני שהיא נכנסת היא “מגייסת מתוכי את כל הקולות והצבעים של אמא ובית, מביאה אותם איתי פנימה”, ומסיימת ש“ילדים צריכים להרגיש עטופים בחום”. כאן אין ניהול, יש נוכחות שמעניקה משמעות וחום. שני הסוגים משלימים זה את זה: handling בלי holding נותר טכני ונטול נשמה, ו-holding בלי handling נשאר רגש בלי עוגן במציאות. דווקא השילוב, המרק שהושקע בו עמל יחד עם היכולת לשרוד את הבנות שמפרקות אותו, הוא שמאפשר לילד לחוש מוחזק ולהתפתח (מצגות הקורס: “השאלת האימהות”; ביבי ואח′, 2016).</w:t>
       </w:r>
     </w:p>
     <w:p>
@@ -292,7 +292,7 @@
           <w:szCs w:val="24"/>
           <w:rtl w:val="1"/>
         </w:rPr>
-        <w:t>העיקרון המנחה בחיפוש איש הצוות המתאים הוא לחפש אדם שניחן באיכויות אימהיות טבעיות, מן הסוג שאם טובה דיה מעניקה לתינוקה, ושמסוגל ומוכן לפתח אותן לכדי יכולות מקצועיות. איננו מחפשים טכניקה, אלא נכונות להשאיל לילד את המקום האימהי המגדל (ביבי, אורן-צ′יפמן ובלנרו-אדיב, 2016).</w:t>
+        <w:t>העיקרון המנחה, כפי שנלמד במצגת “אנשי הצוות”, הוא לחפש “איש צוות טוב דיו”, אדם שניחן באיכויות אימהיות טבעיות מן הסוג שאם טובה דיה מעניקה לתינוקה, ושמסוגל ומוכן לפתח אותן לכדי יכולות מקצועיות. איננו מחפשים טכניקה, אלא נכונות להשאיל לילד את המקום האימהי המגדל, כלומר “השאלת אימהות” (מצגות הקורס: “אנשי הצוות”; ביבי, אורן-צ′יפמן ובלנרו-אדיב, 2016).</w:t>
       </w:r>
     </w:p>
     <w:p>
@@ -322,7 +322,7 @@
           <w:szCs w:val="24"/>
           <w:rtl w:val="1"/>
         </w:rPr>
-        <w:t>כשטיישון משחית את הכיתה, קלארק אינו מתפרץ אלא אוסף בשקט את המסטיקים לצנצנת ומעמיד את הכללים בלי להתערער (17:59). מנגד הוא גמיש ויצירתי: מלמד דקדוק דרך משחק השוקו, מצטרף לקפיצה בחבל וכותב “ראפ הנשיאים”. הצבת הגבול כאן היא מעשה של אהבה, לא שרירות. ההשפעה על התלמידים היא מעבר מכאוס למבנה, מרחב בטוח עם עוגנים שמחזק אצלם את ה′אני′ (ביבי ואח′, 2016).</w:t>
+        <w:t>כשטיישון משחית את הכיתה, קלארק אינו מתפרץ אלא אוסף בשקט את המסטיקים לצנצנת ומעמיד את הכללים בלי להתערער (17:59). מנגד הוא גמיש ויצירתי: מלמד דקדוק דרך משחק השוקו, מצטרף לקפיצה בחבל וכותב “ראפ הנשיאים”. זו בדיוק היציבות שתוארה במצגת, עקביות מצד אחד וגמישות מצד אחר. הצבת הגבול כאן היא, בלשון המצגת “עבודה מתוך קשר”, “גבולות כנתינה” ו“מעשה של אהבה”, לא שרירות. ההשפעה על התלמידים היא מעבר מכאוס למבנה, סדר יום ורצף שמחזקים אצלם את ה′אני′ (מצגות הקורס: “אנשי הצוות”, “עבודה מתוך קשר”; ביבי ואח′, 2016).</w:t>
       </w:r>
     </w:p>
     <w:p>
@@ -352,7 +352,7 @@
           <w:szCs w:val="24"/>
           <w:rtl w:val="1"/>
         </w:rPr>
-        <w:t>קלארק מחלק לתלמידים את מספר הטלפון שלו וזמין 24/7 (1:00:21), ומכריז מהיום הראשון “אנחנו נהיה משפחה”. הוא מסכים להיות מוקד מכריע בחייהם, דמות שאליה מפנים תלות ואמון. וכך, לראשונה, הם חשים ש“מישהו שומר עליי” ושהם שווים את המאמץ. הדרך שבה הוא רואה אותם משנה את האופן שבו הם רואים את עצמם, מ“לוזרים” לילדים מסוגלים (Calheiros et al., 2021).</w:t>
+        <w:t>קלארק מחלק לתלמידים את מספר הטלפון שלו וזמין 24/7 (1:00:21), ומכריז מהיום הראשון “אנחנו נהיה משפחה”. הוא מסכים להיות מוקד מכריע בחייהם, דמות שאליה מפנים תלות ואמון, ונותן להם, בלשון מצגת “תפקידי המדריך”, את “הביטחון המורגש” שמישהו שומר עליהם. הוא גם משמש כמדריך משקף: המבט שלו על התלמידים הוא המראה שדרכה הם לומדים לראות את עצמם אחרת, מ“לוזרים” לילדים מסוגלים (מצגות הקורס: “אנשי הצוות”; Calheiros et al., 2021).</w:t>
       </w:r>
     </w:p>
     <w:p>
@@ -382,7 +382,7 @@
           <w:szCs w:val="24"/>
           <w:rtl w:val="1"/>
         </w:rPr>
-        <w:t>גם כשהוא חולה בדלקת ריאות קלארק אינו מוותר: הוא מצלם את השיעורים מהמיטה ארבע שעות ביום עד שהוא מתמוטט (1:03:58), ונאבק נגד סילוקו של טיישון כשההורה האומן כבר ויתר עליו (59:23). זו מסירות שאינה מבקשת תמורה. מבחינת התלמידים, דווקא העובדה שהוא שורד את ההרס ואת הדחייה ולא נשבר היא שמאפשרת להם בסופו של דבר לבטוח ולאהוב (ויניקוט, 1971).</w:t>
+        <w:t>גם כשהוא חולה בדלקת ריאות קלארק אינו מוותר: הוא מצלם את השיעורים מהמיטה ארבע שעות ביום עד שהוא מתמוטט (1:03:58), ונאבק נגד סילוקו של טיישון כשההורה האומן כבר ויתר עליו (59:23). זו בדיוק המסירות שתוארה במצגת, טיפול מתוך בחירה ואהבה שאינו מבקש תמורה, ולצידה היכולת להיות משני, להשהות את צרכיו ולמקם את הילד במרכז. מבחינת התלמידים, דווקא העובדה שהוא שורד את ההרס ואת הדחייה ולא נשבר היא שמאפשרת להם בסופו של דבר לבטוח ולאהוב (מצגות הקורס: “אנשי הצוות”; ויניקוט, 1971).</w:t>
       </w:r>
     </w:p>
     <w:p>
@@ -461,7 +461,7 @@
           <w:szCs w:val="24"/>
           <w:rtl w:val="1"/>
         </w:rPr>
-        <w:t>הדבר שחידש לי יותר מכול, ברמה התיאורטית, הוא הרעיון שהתנהגות היא שפה. עד הקורס נטיתי לראות התפרצות או חוצפה כ“בעיית משמעת” שצריך לעצור. היום אני שומע/ת מתחתה שאלה: מה הילד מנסה לספר, ואיזה חוסר הוא מבטא. זה שינוי תפיסה קונקרטי. מול נער שהתפרץ עליי בעבר הייתי מגיב/ה בגבול ובעונש, והיום הייתי מנסה קודם להתכוונן ולהכיל, ורק אז להציב גבול כמעשה מיטיב. ברמה האישית הבנתי כמה מהתגובות שלי לילדים נובעות מיחסי האובייקט המוקדמים שלי עצמי, ושכדי להחזיק אותם אני זקוק/ה בעצמי לסביבה יציבה ולהדרכה. הקשר בין התיאוריה לפרקטיקה מתבטא אצלי בשגרה ובגבולות היומיומיים, שאני מבין/ה עכשיו כ-handling ו-holding ולא כ“רעש במערכת”. מה שהיה חסר לי, והייתי רוצה שנרחיב בו, הוא כלים מעשיים לרגעים של הצפה, ומקום לעבד את מה שהעבודה הזאת מעוררת בנו כאנשי צוות (ביבי, אורן-צ′יפמן ובלנרו-אדיב, 2016; ביון, 1962).</w:t>
+        <w:t>הדבר שחידש לי יותר מכול, ברמה התיאורטית, הוא הרעיון שהתנהגות היא שפה. עד הקורס נטיתי לראות התפרצות או חוצפה כ“בעיית משמעת” שצריך לעצור. היום אני שומע/ת מתחתה שאלה: מה הילד מנסה לספר, ואיזה חוסר הוא מבטא. זה שינוי תפיסה קונקרטי. מול נער שהתפרץ עליי בעבר הייתי מגיב/ה בגבול ובעונש, והיום הייתי מנסה קודם להתכוונן ולהכיל, ורק אז להציב גבול כמעשה מיטיב. ברמה האישית הבנתי כמה מהתגובות שלי לילדים נובעות מיחסי האובייקט המוקדמים שלי עצמי, ושכדי להחזיק אותם אני זקוק/ה בעצמי לסביבה יציבה ולהדרכה. הקשר בין התיאוריה לפרקטיקה מתבטא אצלי בשגרה ובגבולות היומיומיים, שאני מבין/ה עכשיו כ-handling ו-holding ולא כ“רעש במערכת”, מושגים שנלמדו במצגות “עבודה מתוך קשר” ו“השאלת האימהות”. מה שהיה חסר לי, והייתי רוצה שנרחיב בו, הוא כלים מעשיים לרגעים של הצפה, ומקום לעבד את מה שהעבודה הזאת מעוררת בנו כאנשי צוות (מצגות הקורס; ביבי, אורן-צ′יפמן ובלנרו-אדיב, 2016; ביון, 1962).</w:t>
       </w:r>
     </w:p>
     <w:p>
@@ -481,6 +481,24 @@
           <w:rtl w:val="1"/>
         </w:rPr>
         <w:t>רשימת מקורות</w:t>
+      </w:r>
+    </w:p>
+    <w:p>
+      <w:pPr>
+        <w:spacing w:line="360" w:lineRule="auto" w:before="0" w:after="60"/>
+        <w:jc w:val="right"/>
+        <w:bidi w:val="1"/>
+      </w:pPr>
+      <w:r>
+        <w:rPr>
+          <w:rFonts w:ascii="David" w:hAnsi="David"/>
+          <w:b w:val="0"/>
+          <w:sz w:val="22"/>
+          <w:rFonts w:ascii="David" w:hAnsi="David" w:cs="David"/>
+          <w:szCs w:val="22"/>
+          <w:rtl w:val="1"/>
+        </w:rPr>
+        <w:t>אנשל, א′ (תשפ“ו). מצגות הקורס “נוער בסיכון: נושאים מתקדמים”: “עבודה מתוך קשר”, “מאפייני הנערים.ות”, “אנשי הצוות” (“השאלת האימהות”, “החזקה והכלה”, “תפקידי המדריך”). חומר לימוד לא מפורסם.</w:t>
       </w:r>
     </w:p>
     <w:p>

</xml_diff>

<commit_message>
Restructure Q3 and Q4 to follow assignment sub-sections
Q3 now maps to sub-parts a/b/c: guiding principle, three staff-member
traits each with situation + how it demonstrates the trait + effect on
students, and a personal reflection using course terms. Q4 maps to
a/b/c/d following the reflection prompt's structure.

Co-Authored-By: Claude Opus 4.8 <noreply@anthropic.com>
Claude-Session: https://claude.ai/code/session_013eDJJACHg3huLEj7ZFfo9K
</commit_message>
<xml_diff>
--- a/עבודה_מסכמת_נוער_בסיכון_מורה_לחיים.docx
+++ b/עבודה_מסכמת_נוער_בסיכון_מורה_לחיים.docx
@@ -286,6 +286,18 @@
       <w:r>
         <w:rPr>
           <w:rFonts w:ascii="David" w:hAnsi="David"/>
+          <w:b/>
+          <w:sz w:val="24"/>
+          <w:rFonts w:ascii="David" w:hAnsi="David" w:cs="David"/>
+          <w:szCs w:val="24"/>
+          <w:bCs/>
+          <w:rtl w:val="1"/>
+        </w:rPr>
+        <w:t xml:space="preserve">א. </w:t>
+      </w:r>
+      <w:r>
+        <w:rPr>
+          <w:rFonts w:ascii="David" w:hAnsi="David"/>
           <w:b w:val="0"/>
           <w:sz w:val="24"/>
           <w:rFonts w:ascii="David" w:hAnsi="David" w:cs="David"/>
@@ -311,7 +323,7 @@
           <w:bCs/>
           <w:rtl w:val="1"/>
         </w:rPr>
-        <w:t xml:space="preserve">היכולת ליציבות, בין עמידה לתנועה. </w:t>
+        <w:t xml:space="preserve">ב. </w:t>
       </w:r>
       <w:r>
         <w:rPr>
@@ -322,7 +334,7 @@
           <w:szCs w:val="24"/>
           <w:rtl w:val="1"/>
         </w:rPr>
-        <w:t>כשטיישון משחית את הכיתה, קלארק אינו מתפרץ אלא אוסף בשקט את המסטיקים לצנצנת ומעמיד את הכללים בלי להתערער (17:59). מנגד הוא גמיש ויצירתי: מלמד דקדוק דרך משחק השוקו, מצטרף לקפיצה בחבל וכותב “ראפ הנשיאים”. זו בדיוק היציבות שתוארה במצגת, עקביות מצד אחד וגמישות מצד אחר. הצבת הגבול כאן היא, בלשון המצגת “עבודה מתוך קשר”, “גבולות כנתינה” ו“מעשה של אהבה”, לא שרירות. ההשפעה על התלמידים היא מעבר מכאוס למבנה, סדר יום ורצף שמחזקים אצלם את ה′אני′ (מצגות הקורס: “אנשי הצוות”, “עבודה מתוך קשר”; ביבי ואח′, 2016).</w:t>
+        <w:t>המאפיינים המרכזיים הנדרשים מאיש צוות, כפי שנלמדו במצגת “אנשי הצוות”, הם ארבע יכולות: יציבות, משניות, משמעותיות והתמסרות. אדגים שלוש מהן דרך דמותו של המורה קלארק, ולכל אחת אביא סיטואציה מהסרט, אסביר כיצד היא מדגימה את המאפיין ואנתח את השפעת ההתנהלות על התלמידים.</w:t>
       </w:r>
     </w:p>
     <w:p>
@@ -341,7 +353,7 @@
           <w:bCs/>
           <w:rtl w:val="1"/>
         </w:rPr>
-        <w:t xml:space="preserve">היכולת להיות משמעותי ולשאת תלות. </w:t>
+        <w:t xml:space="preserve">מאפיין ראשון – היכולת ליציבות, בין עמידה לתנועה. </w:t>
       </w:r>
       <w:r>
         <w:rPr>
@@ -352,7 +364,7 @@
           <w:szCs w:val="24"/>
           <w:rtl w:val="1"/>
         </w:rPr>
-        <w:t>קלארק מחלק לתלמידים את מספר הטלפון שלו וזמין 24/7 (1:00:21), ומכריז מהיום הראשון “אנחנו נהיה משפחה”. הוא מסכים להיות מוקד מכריע בחייהם, דמות שאליה מפנים תלות ואמון, ונותן להם, בלשון מצגת “תפקידי המדריך”, את “הביטחון המורגש” שמישהו שומר עליהם. הוא גם משמש כמדריך משקף: המבט שלו על התלמידים הוא המראה שדרכה הם לומדים לראות את עצמם אחרת, מ“לוזרים” לילדים מסוגלים (מצגות הקורס: “אנשי הצוות”; Calheiros et al., 2021).</w:t>
+        <w:t>סיטואציה: כשטיישון משחית את הכיתה, קלארק אינו מתפרץ אלא אוסף בשקט את המסטיקים לצנצנת ומעמיד את הכללים בלי להתערער (17:59), ובמקביל הוא גמיש ויצירתי, מלמד דקדוק דרך משחק השוקו, מצטרף לקפיצה בחבל וכותב “ראפ הנשיאים”. כיצד זה מדגים את המאפיין: זו היציבות שתוארה במצגת, עמדה פנימית ברורה ועקבית לצד גמישות והתאמה, בלי “הליכה אל הקצוות”, והצבת הגבול כאן היא “גבול כנתינה” ו“מעשה של אהבה” (“עבודה מתוך קשר”), לא שרירות. השפעה על התלמידים: מעבר מכאוס למבנה, סדר יום ורצף שמייצרים מרחב בטוח עם עוגנים ומחזקים אצלם את ה′אני′ (מצגות הקורס: “אנשי הצוות”, “עבודה מתוך קשר”; ביבי ואח′, 2016).</w:t>
       </w:r>
     </w:p>
     <w:p>
@@ -371,7 +383,7 @@
           <w:bCs/>
           <w:rtl w:val="1"/>
         </w:rPr>
-        <w:t xml:space="preserve">היכולת להתמסר, הבחירה להעניק. </w:t>
+        <w:t xml:space="preserve">מאפיין שני – היכולת להיות משמעותי ולשאת תלות. </w:t>
       </w:r>
       <w:r>
         <w:rPr>
@@ -382,7 +394,7 @@
           <w:szCs w:val="24"/>
           <w:rtl w:val="1"/>
         </w:rPr>
-        <w:t>גם כשהוא חולה בדלקת ריאות קלארק אינו מוותר: הוא מצלם את השיעורים מהמיטה ארבע שעות ביום עד שהוא מתמוטט (1:03:58), ונאבק נגד סילוקו של טיישון כשההורה האומן כבר ויתר עליו (59:23). זו בדיוק המסירות שתוארה במצגת, טיפול מתוך בחירה ואהבה שאינו מבקש תמורה, ולצידה היכולת להיות משני, להשהות את צרכיו ולמקם את הילד במרכז. מבחינת התלמידים, דווקא העובדה שהוא שורד את ההרס ואת הדחייה ולא נשבר היא שמאפשרת להם בסופו של דבר לבטוח ולאהוב (מצגות הקורס: “אנשי הצוות”; ויניקוט, 1971).</w:t>
+        <w:t>סיטואציה: קלארק מחלק לתלמידים את מספר הטלפון שלו וזמין 24/7 (1:00:21), ומכריז מהיום הראשון “אנחנו נהיה משפחה”. כיצד זה מדגים את המאפיין: הוא מסכים להיות מוקד מכריע בחייהם, דמות שאליה מפנים תלות ואמון, ופועל כ“מדריך משקף” שהמבט שלו הוא המראה שדרכה הם רואים את עצמם. השפעה על התלמידים: הם מקבלים “ביטחון מורגש” ש“מישהו שומר עליהם”, חשים שהם שווים את המאמץ, והדימוי העצמי שלהם משתנה מ“לוזרים” לילדים מסוגלים (מצגות הקורס: “אנשי הצוות”; Calheiros et al., 2021).</w:t>
       </w:r>
     </w:p>
     <w:p>
@@ -401,7 +413,7 @@
           <w:bCs/>
           <w:rtl w:val="1"/>
         </w:rPr>
-        <w:t xml:space="preserve">ומה אתי? (רפלקציה אישית). </w:t>
+        <w:t xml:space="preserve">מאפיין שלישי – היכולת להתמסר, הבחירה להעניק. </w:t>
       </w:r>
       <w:r>
         <w:rPr>
@@ -412,7 +424,37 @@
           <w:szCs w:val="24"/>
           <w:rtl w:val="1"/>
         </w:rPr>
-        <w:t>[חלק זה יש להתאים אישית] מבין המאפיינים אני מרגיש/ה שקיימת בי היכולת ליציבות. אני נוטה להחזיק גבול ברוגע גם כשסוער, ולחפש דרך יצירתית במקום להיגרר למאבק כוח. לעומת זאת קשה לי יותר עם היכולת לשאת תלות ולהיות משמעותי. יש בי חשש להיות המוקד שאליו נער מפנה תלות מוחלטת, ולעיתים אני שומר/ת מרחק כדי לא להסתכן. אני מבין/ה שזה קשור גם לצורך שלי בתגמול חיצוני, בעוד שבעבודה הזאת התגמול הוא לרוב פנימי (ביבי ואח′, 2016).</w:t>
+        <w:t>סיטואציה: גם כשהוא חולה בדלקת ריאות קלארק מצלם את השיעורים מהמיטה ארבע שעות ביום עד שהוא מתמוטט (1:03:58), ונאבק נגד סילוקו של טיישון כשההורה האומן כבר ויתר עליו (59:23). כיצד זה מדגים את המאפיין: זו מסירות מתוך בחירה ואהבה שאינה מבקשת תמורה, ולצידה היכולת להיות משני, להשהות את צרכיו ולמקם את הילד במרכז. השפעה על התלמידים: דווקא העובדה שהוא שורד את ההרס ואת הדחייה ולא נשבר היא שמאפשרת להם בסופו של דבר לבטוח ולאהוב (מצגות הקורס: “אנשי הצוות”; ויניקוט, 1971).</w:t>
+      </w:r>
+    </w:p>
+    <w:p>
+      <w:pPr>
+        <w:spacing w:line="360" w:lineRule="auto" w:before="0" w:after="120"/>
+        <w:jc w:val="both"/>
+        <w:bidi w:val="1"/>
+      </w:pPr>
+      <w:r>
+        <w:rPr>
+          <w:rFonts w:ascii="David" w:hAnsi="David"/>
+          <w:b/>
+          <w:sz w:val="24"/>
+          <w:rFonts w:ascii="David" w:hAnsi="David" w:cs="David"/>
+          <w:szCs w:val="24"/>
+          <w:bCs/>
+          <w:rtl w:val="1"/>
+        </w:rPr>
+        <w:t xml:space="preserve">ג. ומה אתי? (רפלקציה אישית). </w:t>
+      </w:r>
+      <w:r>
+        <w:rPr>
+          <w:rFonts w:ascii="David" w:hAnsi="David"/>
+          <w:b w:val="0"/>
+          <w:sz w:val="24"/>
+          <w:rFonts w:ascii="David" w:hAnsi="David" w:cs="David"/>
+          <w:szCs w:val="24"/>
+          <w:rtl w:val="1"/>
+        </w:rPr>
+        <w:t>[חלק זה יש להתאים אישית] מאפיין שאני מרגיש/ה שקיים בי הוא היכולת ליציבות. אני נוטה להחזיק גבול ברוגע גם כשסוער, ולחפש דרך יצירתית במקום להיגרר ל“מאבק כוחות”, כלומר לנוע בין עמידה לתנועה בלי ליפול ל“הליכה אל הקצוות”. מאפיין שחסר לי, לפחות חלקית, הוא היכולת לשאת תלות ולהיות משמעותי. יש בי חשש להיות המוקד שאליו נער מפנה תלות מוחלטת, ולעיתים אני שומר/ת מרחק כדי לא להסתכן. אני מבין/ה שזה קשור גם לצורך שלי ב“תגמול חיצוני”, בעוד שבעבודה הזאת ה“תגמול הפנימי” הוא הכוח המניע, וכדי לפתח את היכולת הזאת אני זקוק/ה בעצמי לסביבה יציבה ולהדרכה (מצגות הקורס: “אנשי הצוות”; ביבי ואח′, 2016).</w:t>
       </w:r>
     </w:p>
     <w:p>
@@ -431,7 +473,26 @@
           <w:bCs/>
           <w:rtl w:val="1"/>
         </w:rPr>
-        <w:t>שאלה 4 – רפלקציה על תהליך הלמידה</w:t>
+        <w:t>שאלה 4 – שאלת רפלקציה</w:t>
+      </w:r>
+    </w:p>
+    <w:p>
+      <w:pPr>
+        <w:spacing w:line="360" w:lineRule="auto" w:before="0" w:after="80"/>
+        <w:jc w:val="right"/>
+        <w:bidi w:val="1"/>
+      </w:pPr>
+      <w:r>
+        <w:rPr>
+          <w:rFonts w:ascii="David" w:hAnsi="David"/>
+          <w:b/>
+          <w:sz w:val="22"/>
+          <w:rFonts w:ascii="David" w:hAnsi="David" w:cs="David"/>
+          <w:szCs w:val="22"/>
+          <w:bCs/>
+          <w:rtl w:val="1"/>
+        </w:rPr>
+        <w:t>[חלק זה יש להתאים אישית] בעקבות שלוש השאלות של אתי אברמוביץ, מה שהפתיע אותי, נגע לליבי והשפיע עליי במהלך הקורס.</w:t>
       </w:r>
     </w:p>
     <w:p>
@@ -450,7 +511,19 @@
           <w:bCs/>
           <w:rtl w:val="1"/>
         </w:rPr>
-        <w:t xml:space="preserve">[חלק זה יש להתאים אישית] </w:t>
+        <w:t xml:space="preserve">א. </w:t>
+      </w:r>
+      <w:r>
+        <w:rPr>
+          <w:rFonts w:ascii="David" w:hAnsi="David"/>
+          <w:b/>
+          <w:sz w:val="24"/>
+          <w:rFonts w:ascii="David" w:hAnsi="David" w:cs="David"/>
+          <w:szCs w:val="24"/>
+          <w:bCs/>
+          <w:rtl w:val="1"/>
+        </w:rPr>
+        <w:t xml:space="preserve">מה שחידש לי. </w:t>
       </w:r>
       <w:r>
         <w:rPr>
@@ -461,7 +534,133 @@
           <w:szCs w:val="24"/>
           <w:rtl w:val="1"/>
         </w:rPr>
-        <w:t>הדבר שחידש לי יותר מכול, ברמה התיאורטית, הוא הרעיון שהתנהגות היא שפה. עד הקורס נטיתי לראות התפרצות או חוצפה כ“בעיית משמעת” שצריך לעצור. היום אני שומע/ת מתחתה שאלה: מה הילד מנסה לספר, ואיזה חוסר הוא מבטא. זה שינוי תפיסה קונקרטי. מול נער שהתפרץ עליי בעבר הייתי מגיב/ה בגבול ובעונש, והיום הייתי מנסה קודם להתכוונן ולהכיל, ורק אז להציב גבול כמעשה מיטיב. ברמה האישית הבנתי כמה מהתגובות שלי לילדים נובעות מיחסי האובייקט המוקדמים שלי עצמי, ושכדי להחזיק אותם אני זקוק/ה בעצמי לסביבה יציבה ולהדרכה. הקשר בין התיאוריה לפרקטיקה מתבטא אצלי בשגרה ובגבולות היומיומיים, שאני מבין/ה עכשיו כ-handling ו-holding ולא כ“רעש במערכת”, מושגים שנלמדו במצגות “עבודה מתוך קשר” ו“השאלת האימהות”. מה שהיה חסר לי, והייתי רוצה שנרחיב בו, הוא כלים מעשיים לרגעים של הצפה, ומקום לעבד את מה שהעבודה הזאת מעוררת בנו כאנשי צוות (מצגות הקורס; ביבי, אורן-צ′יפמן ובלנרו-אדיב, 2016; ביון, 1962).</w:t>
+        <w:t>ברמה התיאורטית, הדבר שחידש והפתיע אותי יותר מכול הוא הרעיון ש“התנהגות היא שפה”. עד הקורס נטיתי לראות התפרצות או חוצפה כ“בעיית משמעת” שצריך לעצור, והיום אני שומע/ת מתחתה שאלה: מה הילד מנסה לספר ואיזה חוסר הוא מבטא. ברמה האישית נגע לליבי להבין כמה מהתגובות שלי לילדים נובעות מיחסי האובייקט המוקדמים שלי עצמי, ושגם אני, כאיש צוות, זקוק/ה להיות מוחזק/ת. דוגמה קונקרטית לשינוי תפיסה: מול נער שהתפרץ עליי בעבר הייתי מגיב/ה מיד בגבול ובעונש, והיום הייתי מתכוונן/ת ומכיל/ה קודם, ורק אז מציב/ה גבול כמעשה מיטיב (מצגות הקורס: “מאפייני הנערים.ות”).</w:t>
+      </w:r>
+    </w:p>
+    <w:p>
+      <w:pPr>
+        <w:spacing w:line="360" w:lineRule="auto" w:before="0" w:after="120"/>
+        <w:jc w:val="both"/>
+        <w:bidi w:val="1"/>
+      </w:pPr>
+      <w:r>
+        <w:rPr>
+          <w:rFonts w:ascii="David" w:hAnsi="David"/>
+          <w:b/>
+          <w:sz w:val="24"/>
+          <w:rFonts w:ascii="David" w:hAnsi="David" w:cs="David"/>
+          <w:szCs w:val="24"/>
+          <w:bCs/>
+          <w:rtl w:val="1"/>
+        </w:rPr>
+        <w:t xml:space="preserve">ב. </w:t>
+      </w:r>
+      <w:r>
+        <w:rPr>
+          <w:rFonts w:ascii="David" w:hAnsi="David"/>
+          <w:b/>
+          <w:sz w:val="24"/>
+          <w:rFonts w:ascii="David" w:hAnsi="David" w:cs="David"/>
+          <w:szCs w:val="24"/>
+          <w:bCs/>
+          <w:rtl w:val="1"/>
+        </w:rPr>
+        <w:t xml:space="preserve">הקשר בין התיאוריה לפרקטיקה. </w:t>
+      </w:r>
+      <w:r>
+        <w:rPr>
+          <w:rFonts w:ascii="David" w:hAnsi="David"/>
+          <w:b w:val="0"/>
+          <w:sz w:val="24"/>
+          <w:rFonts w:ascii="David" w:hAnsi="David" w:cs="David"/>
+          <w:szCs w:val="24"/>
+          <w:rtl w:val="1"/>
+        </w:rPr>
+        <w:t>בעבודתי עם הנוער הקשר הזה מתבטא בשגרה, בסדר היום ובגבולות היומיומיים, שאני מבין/ה עכשיו כ-handling ו-holding ולא כ“רעש במערכת”, ובהבנה שהצבת גבול היא “נתינה”. גם מול הרס אני מנסה “לשרוד” בלי להישבר ולראות בהתנהגות מופע שמספר סיפור, במקום עבירת משמעת שיש להעניש (מצגות הקורס: “עבודה מתוך קשר”, “השאלת האימהות”).</w:t>
+      </w:r>
+    </w:p>
+    <w:p>
+      <w:pPr>
+        <w:spacing w:line="360" w:lineRule="auto" w:before="0" w:after="120"/>
+        <w:jc w:val="both"/>
+        <w:bidi w:val="1"/>
+      </w:pPr>
+      <w:r>
+        <w:rPr>
+          <w:rFonts w:ascii="David" w:hAnsi="David"/>
+          <w:b/>
+          <w:sz w:val="24"/>
+          <w:rFonts w:ascii="David" w:hAnsi="David" w:cs="David"/>
+          <w:szCs w:val="24"/>
+          <w:bCs/>
+          <w:rtl w:val="1"/>
+        </w:rPr>
+        <w:t xml:space="preserve">ג. </w:t>
+      </w:r>
+      <w:r>
+        <w:rPr>
+          <w:rFonts w:ascii="David" w:hAnsi="David"/>
+          <w:b/>
+          <w:sz w:val="24"/>
+          <w:rFonts w:ascii="David" w:hAnsi="David" w:cs="David"/>
+          <w:szCs w:val="24"/>
+          <w:bCs/>
+          <w:rtl w:val="1"/>
+        </w:rPr>
+        <w:t xml:space="preserve">מה שהיה חסר. </w:t>
+      </w:r>
+      <w:r>
+        <w:rPr>
+          <w:rFonts w:ascii="David" w:hAnsi="David"/>
+          <w:b w:val="0"/>
+          <w:sz w:val="24"/>
+          <w:rFonts w:ascii="David" w:hAnsi="David" w:cs="David"/>
+          <w:szCs w:val="24"/>
+          <w:rtl w:val="1"/>
+        </w:rPr>
+        <w:t>הייתי רוצה שנרחיב בכלים מעשיים לרגעים של הצפה בזמן אמת, וכן במקום מובנה לעבד את מה שהעבודה הזאת מעוררת בנו כאנשי צוות, אולי דרך הדרכה קבוצתית כ-on-going-process.</w:t>
+      </w:r>
+    </w:p>
+    <w:p>
+      <w:pPr>
+        <w:spacing w:line="360" w:lineRule="auto" w:before="0" w:after="120"/>
+        <w:jc w:val="both"/>
+        <w:bidi w:val="1"/>
+      </w:pPr>
+      <w:r>
+        <w:rPr>
+          <w:rFonts w:ascii="David" w:hAnsi="David"/>
+          <w:b/>
+          <w:sz w:val="24"/>
+          <w:rFonts w:ascii="David" w:hAnsi="David" w:cs="David"/>
+          <w:szCs w:val="24"/>
+          <w:bCs/>
+          <w:rtl w:val="1"/>
+        </w:rPr>
+        <w:t xml:space="preserve">ד. </w:t>
+      </w:r>
+      <w:r>
+        <w:rPr>
+          <w:rFonts w:ascii="David" w:hAnsi="David"/>
+          <w:b/>
+          <w:sz w:val="24"/>
+          <w:rFonts w:ascii="David" w:hAnsi="David" w:cs="David"/>
+          <w:szCs w:val="24"/>
+          <w:bCs/>
+          <w:rtl w:val="1"/>
+        </w:rPr>
+        <w:t xml:space="preserve">הערה לסיום. </w:t>
+      </w:r>
+      <w:r>
+        <w:rPr>
+          <w:rFonts w:ascii="David" w:hAnsi="David"/>
+          <w:b w:val="0"/>
+          <w:sz w:val="24"/>
+          <w:rFonts w:ascii="David" w:hAnsi="David" w:cs="David"/>
+          <w:szCs w:val="24"/>
+          <w:rtl w:val="1"/>
+        </w:rPr>
+        <w:t>מה שהשפיע עליי יותר מכול הוא שהקורס נתן לי שפה למה שכבר עשיתי באינטואיציה, וההבנה שהעבודה הפשוטה והיומיומית היא עצמה הטיפול (מצגות הקורס; ביון, 1962; ביבי ואח′, 2016).</w:t>
       </w:r>
     </w:p>
     <w:p>

</xml_diff>

<commit_message>
Switch course-material references to first-person voice
Replace impersonal passive lead-ins ("as was learned in the
presentation") with first-person phrasing ("as I learned in the
course" / "that we learned"), so the paper reads in the student's own
voice.

Co-Authored-By: Claude Opus 4.8 <noreply@anthropic.com>
Claude-Session: https://claude.ai/code/session_013eDJJACHg3huLEj7ZFfo9K
</commit_message>
<xml_diff>
--- a/עבודה_מסכמת_נוער_בסיכון_מורה_לחיים.docx
+++ b/עבודה_מסכמת_נוער_בסיכון_מורה_לחיים.docx
@@ -140,7 +140,7 @@
           <w:szCs w:val="24"/>
           <w:rtl w:val="1"/>
         </w:rPr>
-        <w:t>כפי שנלמד במצגת “מאפייני הנערים.ות”, ההתנהגות היא שפה, ומופע התנהגותי הוא הדרך שבה ילד מראה לעולם את מה שאין לו מילים לומר. כשנחסמת היכולת להמשיג ולהסביר, הילד “מתנהג את מצוקתו” במקום לספר אותה. המופע קיים משום שאצל ילדים שנשאו פגיעה ראשונית, סביבה שלא הצליחה לווסת אותם בראשית חייהם, לא נבנו מנגנוני ויסות וארגון עצמי, והחרדה, עד כדי חרדת כיליון, נותרת מציפה ובלתי מוכלת. לכן המופע הוא בעת ובעונה אחת פורקן של דחף לא מעובד וניסיון נואש לתקשר. במצגת מנו כמה מופעים, ובהם חרדה, פחד מקרבה, עצב וריקנות, מחשבה שאינה נחשבת, והרס וכיליון, ואצל האחד תתפרץ תוקפנות בעוד אצל האחר תופיע שקיעה ודכדוך. מה עלינו לעשות? לא להיבהל ולא לפעול מתוך העלבון, אלא להתכוונן אל המופע, לחפש את הסיפור שמתחתיו ולהחזיק אותו עבור הילד עד שנוכל להשיב לו אותו במילים (מצגות הקורס: “מאפייני הנערים.ות”; ביבי, אורן-צ′יפמן ובלנרו-אדיב, 2016; פונגי, אלן וביטמן, 2008).</w:t>
+        <w:t>כפי שלמדתי בקורס, במצגת “מאפייני הנערים.ות”, ההתנהגות היא שפה, ומופע התנהגותי הוא הדרך שבה ילד מראה לעולם את מה שאין לו מילים לומר. כשנחסמת היכולת להמשיג ולהסביר, הילד “מתנהג את מצוקתו” במקום לספר אותה. המופע קיים משום שאצל ילדים שנשאו פגיעה ראשונית, סביבה שלא הצליחה לווסת אותם בראשית חייהם, לא נבנו מנגנוני ויסות וארגון עצמי, והחרדה, עד כדי חרדת כיליון, נותרת מציפה ובלתי מוכלת. לכן המופע הוא בעת ובעונה אחת פורקן של דחף לא מעובד וניסיון נואש לתקשר. במצגת מנו כמה מופעים, ובהם חרדה, פחד מקרבה, עצב וריקנות, מחשבה שאינה נחשבת, והרס וכיליון, ואצל האחד תתפרץ תוקפנות בעוד אצל האחר תופיע שקיעה ודכדוך. מה עלינו לעשות? לא להיבהל ולא לפעול מתוך העלבון, אלא להתכוונן אל המופע, לחפש את הסיפור שמתחתיו ולהחזיק אותו עבור הילד עד שנוכל להשיב לו אותו במילים (מצגות הקורס: “מאפייני הנערים.ות”; ביבי, אורן-צ′יפמן ובלנרו-אדיב, 2016; פונגי, אלן וביטמן, 2008).</w:t>
       </w:r>
     </w:p>
     <w:p>
@@ -170,7 +170,7 @@
           <w:szCs w:val="24"/>
           <w:rtl w:val="1"/>
         </w:rPr>
-        <w:t>המופע הבולט של טיישון הוא “הרס וכיליון”, על פי הטיפולוגיה שנלמדה. בימים הראשונים קלארק חוזר לכיתה מחוללת ומושחתת, וטיישון מודה בגאווה שהוא זה שעשה זאת (17:59–19:41). עוד קודם הוא מתגרה “תשעה אותי” (16:41), ובהמשך מסרב לכתוב ביומן החלומות, מתחצף ומאיים לעזוב, אף שכבר יש לו שני “סטרייקים” (31:44, 33:34). הגורמים שהובילו לכך ברורים מרקע הדמות: טיישון חי במשפחת אומנה, שלושה חודשים בעיר בלי שראה בה דבר, ילד שכבר תויג ומצוי בדרך למעצר נוער. מורה חדש שדורש קרבה וכללים נחווה כאיום קיומי, והתגובה היא זו של Fight, תקיפה. תגובות הסביבה הזינו את ההסלמה: המנהל טרנר נאחז בכללים ומוכן לסלק, מורים קודמים כבר ויתרו (הכיתה החליפה שישה מורים), וההורה האומן מוותר עליו בשימוע (59:23). התוצאה היא שימוע סילוק שהיה מדרדר אותו אל הרחוב, אלא שקלארק מסרב להגיב באותו מטבע, מחזיק את הגבול ברוגע ונלחם נגד הסילוק. וכך המופע, שנועד להרחיק, דווקא מזמן קרבה (מצגות הקורס: “מאפייני הנערים.ות”).</w:t>
+        <w:t>המופע הבולט של טיישון הוא “הרס וכיליון”, על פי הטיפולוגיה שלמדנו. בימים הראשונים קלארק חוזר לכיתה מחוללת ומושחתת, וטיישון מודה בגאווה שהוא זה שעשה זאת (17:59–19:41). עוד קודם הוא מתגרה “תשעה אותי” (16:41), ובהמשך מסרב לכתוב ביומן החלומות, מתחצף ומאיים לעזוב, אף שכבר יש לו שני “סטרייקים” (31:44, 33:34). הגורמים שהובילו לכך ברורים מרקע הדמות: טיישון חי במשפחת אומנה, שלושה חודשים בעיר בלי שראה בה דבר, ילד שכבר תויג ומצוי בדרך למעצר נוער. מורה חדש שדורש קרבה וכללים נחווה כאיום קיומי, והתגובה היא זו של Fight, תקיפה. תגובות הסביבה הזינו את ההסלמה: המנהל טרנר נאחז בכללים ומוכן לסלק, מורים קודמים כבר ויתרו (הכיתה החליפה שישה מורים), וההורה האומן מוותר עליו בשימוע (59:23). התוצאה היא שימוע סילוק שהיה מדרדר אותו אל הרחוב, אלא שקלארק מסרב להגיב באותו מטבע, מחזיק את הגבול ברוגע ונלחם נגד הסילוק. וכך המופע, שנועד להרחיק, דווקא מזמן קרבה (מצגות הקורס: “מאפייני הנערים.ות”).</w:t>
       </w:r>
     </w:p>
     <w:p>
@@ -200,7 +200,7 @@
           <w:szCs w:val="24"/>
           <w:rtl w:val="1"/>
         </w:rPr>
-        <w:t>בעולמה הפנימי של הדמות פועלים יחסי אובייקט מוקדמים של חסך ונטישה. טיישון לא זכה לאם טובה דיה, ונותר בו אותו “חור שחור” של כמיהה לא ממומשת שעליו דובר במצגות. הוא הפנים אובייקט דוחה ובלתי מהימן (הפנמה והזדהות), והזדהה עם התוקפן, כלומר הפך להיות זה שהורס לפני שיהרסו או ינטשו אותו. בהעברה הוא פוגש בקלארק עוד מבוגר שיעזוב או ינצל אותו, ולכן הוא בוחן אותו, בדיוק כפי שתואר במצגת בהקשר של פחד מקרבה: משחית, מתריס ומאיים לעזוב, כדי לבדוק אם כשיש למבוגר כוח וקרבה הוא ינצל אותם נגדו. ההרס הזה הוא, במונחי “הרס האובייקט” של ויניקוט שהובאו בכיתה, תקיפה של האובייקט מתוך משאלה שישרוד וימשיך להתקיים עבורו. ההעברה הנגדית גלויה: קלארק מגיע לרגע שפל ואומר למריסה “אני מוותר”, בדיוק הייאוש שהילד מפקיד בו דרך הזדהות השלכתית (המושג שנלמד במצגת “החזקה והכלה”). כשקלארק שורד את ההרס, רואה את עבודות האמנות של טיישון ואומר לו שהן יפהפיות, מתאפשר לראשונה שההרס יוחלף בתלות ובדמעות (1:18:04). מהלך זה עולה בקנה אחד עם ממצאים עדכניים שלפיהם האופן שבו הסביבה משקפת את הנער מעצב את הדימוי העצמי שלו ואת הסתגלותו. נער שמשקפים לו שהוא “לוזר” נושא בתוכו את הדימוי הזה, ומבט אחר מרפה אותו (מצגות הקורס: “מאפייני הנערים.ות”, “החזקה והכלה”; ויניקוט, 1971; Calheiros et al., 2021).</w:t>
+        <w:t>בעולמה הפנימי של הדמות פועלים יחסי אובייקט מוקדמים של חסך ונטישה. טיישון לא זכה לאם טובה דיה, ונותר בו אותו “חור שחור” של כמיהה לא ממומשת שעליו למדנו בכיתה. הוא הפנים אובייקט דוחה ובלתי מהימן (הפנמה והזדהות), והזדהה עם התוקפן, כלומר הפך להיות זה שהורס לפני שיהרסו או ינטשו אותו. בהעברה הוא פוגש בקלארק עוד מבוגר שיעזוב או ינצל אותו, ולכן הוא בוחן אותו, בדיוק כפי שלמדתי בהקשר של פחד מקרבה: משחית, מתריס ומאיים לעזוב, כדי לבדוק אם כשיש למבוגר כוח וקרבה הוא ינצל אותם נגדו. ההרס הזה הוא, במונחי “הרס האובייקט” של ויניקוט שהובאו בכיתה, תקיפה של האובייקט מתוך משאלה שישרוד וימשיך להתקיים עבורו. ההעברה הנגדית גלויה: קלארק מגיע לרגע שפל ואומר למריסה “אני מוותר”, בדיוק הייאוש שהילד מפקיד בו דרך הזדהות השלכתית (מושג שלמדתי במצגת “החזקה והכלה”). כשקלארק שורד את ההרס, רואה את עבודות האמנות של טיישון ואומר לו שהן יפהפיות, מתאפשר לראשונה שההרס יוחלף בתלות ובדמעות (1:18:04). מהלך זה עולה בקנה אחד עם ממצאים עדכניים שלפיהם האופן שבו הסביבה משקפת את הנער מעצב את הדימוי העצמי שלו ואת הסתגלותו. נער שמשקפים לו שהוא “לוזר” נושא בתוכו את הדימוי הזה, ומבט אחר מרפה אותו (מצגות הקורס: “מאפייני הנערים.ות”, “החזקה והכלה”; ויניקוט, 1971; Calheiros et al., 2021).</w:t>
       </w:r>
     </w:p>
     <w:p>
@@ -237,7 +237,7 @@
           <w:szCs w:val="24"/>
           <w:rtl w:val="1"/>
         </w:rPr>
-        <w:t>כפי שנלמד במצגת “השאלת האימהות”, אחזקה שלמה היא צירוף של שני רבדים מן הפונקציות האימהיות שאי אפשר להפריד ביניהם. ה-handling הוא הארגון והניהול הפיזי של הסביבה: ההאכלה, הניקיון, הבגדים, מעקב אחר הגוף וגבולות המציאות שיש להם משמעות התפתחותית. הוא זה שמחבר את הילד לגופו ויוצר “האנשה”. ה-holding הוא ההחזקה הרגשית: נוכחות רציפה ועקבית, אם שחושבת את הילד ומעניקה משמעות לחוויותיו, ומייצרת רציפות, עקביות והמשכיות, ובתוכה “מרחב ביניים” שבו הילד יכול לחקור בידיעה שהאם שם. יחד הם בונים אצל הילד את מה שחסר לו, ביטחון בסיסי, ומתוכו, בהדרגה, יכולת לווסת את עצמו ולהוציא את העצמי האמיתי מהמחבוא, במקום להתגונן דרך עצמי כוזב (כפי שהוצג במצגת “החזקה והכלה”). זהו ההיבט ההתפתחותי: מה שהתחיל כטיפול פיזי חיצוני נעשה עם הזמן מבנה פנימי (מצגות הקורס: “השאלת האימהות”, “החזקה והכלה”; ביבי, אורן-צ′יפמן ובלנרו-אדיב, 2016; ויניקוט, 1971).</w:t>
+        <w:t>כפי שלמדתי בקורס, במצגת “השאלת האימהות”, אחזקה שלמה היא צירוף של שני רבדים מן הפונקציות האימהיות שאי אפשר להפריד ביניהם. ה-handling הוא הארגון והניהול הפיזי של הסביבה: ההאכלה, הניקיון, הבגדים, מעקב אחר הגוף וגבולות המציאות שיש להם משמעות התפתחותית. הוא זה שמחבר את הילד לגופו ויוצר “האנשה”. ה-holding הוא ההחזקה הרגשית: נוכחות רציפה ועקבית, אם שחושבת את הילד ומעניקה משמעות לחוויותיו, ומייצרת רציפות, עקביות והמשכיות, ובתוכה “מרחב ביניים” שבו הילד יכול לחקור בידיעה שהאם שם. יחד הם בונים אצל הילד את מה שחסר לו, ביטחון בסיסי, ומתוכו, בהדרגה, יכולת לווסת את עצמו ולהוציא את העצמי האמיתי מהמחבוא, במקום להתגונן דרך עצמי כוזב (כפי שלמדתי במצגת “החזקה והכלה”). זהו ההיבט ההתפתחותי: מה שהתחיל כטיפול פיזי חיצוני נעשה עם הזמן מבנה פנימי (מצגות הקורס: “השאלת האימהות”, “החזקה והכלה”; ביבי, אורן-צ′יפמן ובלנרו-אדיב, 2016; ויניקוט, 1971).</w:t>
       </w:r>
     </w:p>
     <w:p>
@@ -304,7 +304,7 @@
           <w:szCs w:val="24"/>
           <w:rtl w:val="1"/>
         </w:rPr>
-        <w:t>העיקרון המנחה, כפי שנלמד במצגת “אנשי הצוות”, הוא לחפש “איש צוות טוב דיו”, אדם שניחן באיכויות אימהיות טבעיות מן הסוג שאם טובה דיה מעניקה לתינוקה, ושמסוגל ומוכן לפתח אותן לכדי יכולות מקצועיות. איננו מחפשים טכניקה, אלא נכונות להשאיל לילד את המקום האימהי המגדל, כלומר “השאלת אימהות” (מצגות הקורס: “אנשי הצוות”; ביבי, אורן-צ′יפמן ובלנרו-אדיב, 2016).</w:t>
+        <w:t>העיקרון המנחה, כפי שלמדתי בקורס במצגת “אנשי הצוות”, הוא לחפש “איש צוות טוב דיו”, אדם שניחן באיכויות אימהיות טבעיות מן הסוג שאם טובה דיה מעניקה לתינוקה, ושמסוגל ומוכן לפתח אותן לכדי יכולות מקצועיות. איננו מחפשים טכניקה, אלא נכונות להשאיל לילד את המקום האימהי המגדל, כלומר “השאלת אימהות” (מצגות הקורס: “אנשי הצוות”; ביבי, אורן-צ′יפמן ובלנרו-אדיב, 2016).</w:t>
       </w:r>
     </w:p>
     <w:p>
@@ -334,7 +334,7 @@
           <w:szCs w:val="24"/>
           <w:rtl w:val="1"/>
         </w:rPr>
-        <w:t>המאפיינים המרכזיים הנדרשים מאיש צוות, כפי שנלמדו במצגת “אנשי הצוות”, הם ארבע יכולות: יציבות, משניות, משמעותיות והתמסרות. אדגים שלוש מהן דרך דמותו של המורה קלארק, ולכל אחת אביא סיטואציה מהסרט, אסביר כיצד היא מדגימה את המאפיין ואנתח את השפעת ההתנהלות על התלמידים.</w:t>
+        <w:t>המאפיינים המרכזיים הנדרשים מאיש צוות, כפי שלמדתי במצגת “אנשי הצוות”, הם ארבע יכולות: יציבות, משניות, משמעותיות והתמסרות. אדגים שלוש מהן דרך דמותו של המורה קלארק, ולכל אחת אביא סיטואציה מהסרט, אסביר כיצד היא מדגימה את המאפיין ואנתח את השפעת ההתנהלות על התלמידים.</w:t>
       </w:r>
     </w:p>
     <w:p>
@@ -364,7 +364,7 @@
           <w:szCs w:val="24"/>
           <w:rtl w:val="1"/>
         </w:rPr>
-        <w:t>סיטואציה: כשטיישון משחית את הכיתה, קלארק אינו מתפרץ אלא אוסף בשקט את המסטיקים לצנצנת ומעמיד את הכללים בלי להתערער (17:59), ובמקביל הוא גמיש ויצירתי, מלמד דקדוק דרך משחק השוקו, מצטרף לקפיצה בחבל וכותב “ראפ הנשיאים”. כיצד זה מדגים את המאפיין: זו היציבות שתוארה במצגת, עמדה פנימית ברורה ועקבית לצד גמישות והתאמה, בלי “הליכה אל הקצוות”, והצבת הגבול כאן היא “גבול כנתינה” ו“מעשה של אהבה” (“עבודה מתוך קשר”), לא שרירות. השפעה על התלמידים: מעבר מכאוס למבנה, סדר יום ורצף שמייצרים מרחב בטוח עם עוגנים ומחזקים אצלם את ה′אני′ (מצגות הקורס: “אנשי הצוות”, “עבודה מתוך קשר”; ביבי ואח′, 2016).</w:t>
+        <w:t>סיטואציה: כשטיישון משחית את הכיתה, קלארק אינו מתפרץ אלא אוסף בשקט את המסטיקים לצנצנת ומעמיד את הכללים בלי להתערער (17:59), ובמקביל הוא גמיש ויצירתי, מלמד דקדוק דרך משחק השוקו, מצטרף לקפיצה בחבל וכותב “ראפ הנשיאים”. כיצד זה מדגים את המאפיין: זו היציבות שלמדנו עליה, עמדה פנימית ברורה ועקבית לצד גמישות והתאמה, בלי “הליכה אל הקצוות”, והצבת הגבול כאן היא “גבול כנתינה” ו“מעשה של אהבה” (“עבודה מתוך קשר”), לא שרירות. השפעה על התלמידים: מעבר מכאוס למבנה, סדר יום ורצף שמייצרים מרחב בטוח עם עוגנים ומחזקים אצלם את ה′אני′ (מצגות הקורס: “אנשי הצוות”, “עבודה מתוך קשר”; ביבי ואח′, 2016).</w:t>
       </w:r>
     </w:p>
     <w:p>

</xml_diff>

<commit_message>
Drop course presentations as a cited source; feminize reflection
Course-presentation material is treated as learned content referenced in
first person in the prose, not as a bibliographic source: remove all
"course presentations" parenthetical citations and the reference-list
entry. Convert the personal reflection to feminine grammatical forms.

Co-Authored-By: Claude Opus 4.8 <noreply@anthropic.com>
Claude-Session: https://claude.ai/code/session_013eDJJACHg3huLEj7ZFfo9K
</commit_message>
<xml_diff>
--- a/עבודה_מסכמת_נוער_בסיכון_מורה_לחיים.docx
+++ b/עבודה_מסכמת_נוער_בסיכון_מורה_לחיים.docx
@@ -140,7 +140,7 @@
           <w:szCs w:val="24"/>
           <w:rtl w:val="1"/>
         </w:rPr>
-        <w:t>כפי שלמדתי בקורס, במצגת “מאפייני הנערים.ות”, ההתנהגות היא שפה, ומופע התנהגותי הוא הדרך שבה ילד מראה לעולם את מה שאין לו מילים לומר. כשנחסמת היכולת להמשיג ולהסביר, הילד “מתנהג את מצוקתו” במקום לספר אותה. המופע קיים משום שאצל ילדים שנשאו פגיעה ראשונית, סביבה שלא הצליחה לווסת אותם בראשית חייהם, לא נבנו מנגנוני ויסות וארגון עצמי, והחרדה, עד כדי חרדת כיליון, נותרת מציפה ובלתי מוכלת. לכן המופע הוא בעת ובעונה אחת פורקן של דחף לא מעובד וניסיון נואש לתקשר. במצגת מנו כמה מופעים, ובהם חרדה, פחד מקרבה, עצב וריקנות, מחשבה שאינה נחשבת, והרס וכיליון, ואצל האחד תתפרץ תוקפנות בעוד אצל האחר תופיע שקיעה ודכדוך. מה עלינו לעשות? לא להיבהל ולא לפעול מתוך העלבון, אלא להתכוונן אל המופע, לחפש את הסיפור שמתחתיו ולהחזיק אותו עבור הילד עד שנוכל להשיב לו אותו במילים (מצגות הקורס: “מאפייני הנערים.ות”; ביבי, אורן-צ′יפמן ובלנרו-אדיב, 2016; פונגי, אלן וביטמן, 2008).</w:t>
+        <w:t>כפי שלמדתי בקורס, במצגת “מאפייני הנערים.ות”, ההתנהגות היא שפה, ומופע התנהגותי הוא הדרך שבה ילד מראה לעולם את מה שאין לו מילים לומר. כשנחסמת היכולת להמשיג ולהסביר, הילד “מתנהג את מצוקתו” במקום לספר אותה. המופע קיים משום שאצל ילדים שנשאו פגיעה ראשונית, סביבה שלא הצליחה לווסת אותם בראשית חייהם, לא נבנו מנגנוני ויסות וארגון עצמי, והחרדה, עד כדי חרדת כיליון, נותרת מציפה ובלתי מוכלת. לכן המופע הוא בעת ובעונה אחת פורקן של דחף לא מעובד וניסיון נואש לתקשר. במצגת מנו כמה מופעים, ובהם חרדה, פחד מקרבה, עצב וריקנות, מחשבה שאינה נחשבת, והרס וכיליון, ואצל האחד תתפרץ תוקפנות בעוד אצל האחר תופיע שקיעה ודכדוך. מה עלינו לעשות? לא להיבהל ולא לפעול מתוך העלבון, אלא להתכוונן אל המופע, לחפש את הסיפור שמתחתיו ולהחזיק אותו עבור הילד עד שנוכל להשיב לו אותו במילים (ביבי, אורן-צ′יפמן ובלנרו-אדיב, 2016; פונגי, אלן וביטמן, 2008).</w:t>
       </w:r>
     </w:p>
     <w:p>
@@ -170,7 +170,7 @@
           <w:szCs w:val="24"/>
           <w:rtl w:val="1"/>
         </w:rPr>
-        <w:t>המופע הבולט של טיישון הוא “הרס וכיליון”, על פי הטיפולוגיה שלמדנו. בימים הראשונים קלארק חוזר לכיתה מחוללת ומושחתת, וטיישון מודה בגאווה שהוא זה שעשה זאת (17:59–19:41). עוד קודם הוא מתגרה “תשעה אותי” (16:41), ובהמשך מסרב לכתוב ביומן החלומות, מתחצף ומאיים לעזוב, אף שכבר יש לו שני “סטרייקים” (31:44, 33:34). הגורמים שהובילו לכך ברורים מרקע הדמות: טיישון חי במשפחת אומנה, שלושה חודשים בעיר בלי שראה בה דבר, ילד שכבר תויג ומצוי בדרך למעצר נוער. מורה חדש שדורש קרבה וכללים נחווה כאיום קיומי, והתגובה היא זו של Fight, תקיפה. תגובות הסביבה הזינו את ההסלמה: המנהל טרנר נאחז בכללים ומוכן לסלק, מורים קודמים כבר ויתרו (הכיתה החליפה שישה מורים), וההורה האומן מוותר עליו בשימוע (59:23). התוצאה היא שימוע סילוק שהיה מדרדר אותו אל הרחוב, אלא שקלארק מסרב להגיב באותו מטבע, מחזיק את הגבול ברוגע ונלחם נגד הסילוק. וכך המופע, שנועד להרחיק, דווקא מזמן קרבה (מצגות הקורס: “מאפייני הנערים.ות”).</w:t>
+        <w:t>המופע הבולט של טיישון הוא “הרס וכיליון”, על פי הטיפולוגיה שלמדנו. בימים הראשונים קלארק חוזר לכיתה מחוללת ומושחתת, וטיישון מודה בגאווה שהוא זה שעשה זאת (17:59–19:41). עוד קודם הוא מתגרה “תשעה אותי” (16:41), ובהמשך מסרב לכתוב ביומן החלומות, מתחצף ומאיים לעזוב, אף שכבר יש לו שני “סטרייקים” (31:44, 33:34). הגורמים שהובילו לכך ברורים מרקע הדמות: טיישון חי במשפחת אומנה, שלושה חודשים בעיר בלי שראה בה דבר, ילד שכבר תויג ומצוי בדרך למעצר נוער. מורה חדש שדורש קרבה וכללים נחווה כאיום קיומי, והתגובה היא זו של Fight, תקיפה. תגובות הסביבה הזינו את ההסלמה: המנהל טרנר נאחז בכללים ומוכן לסלק, מורים קודמים כבר ויתרו (הכיתה החליפה שישה מורים), וההורה האומן מוותר עליו בשימוע (59:23). התוצאה היא שימוע סילוק שהיה מדרדר אותו אל הרחוב, אלא שקלארק מסרב להגיב באותו מטבע, מחזיק את הגבול ברוגע ונלחם נגד הסילוק. וכך המופע, שנועד להרחיק, דווקא מזמן קרבה.</w:t>
       </w:r>
     </w:p>
     <w:p>
@@ -200,7 +200,7 @@
           <w:szCs w:val="24"/>
           <w:rtl w:val="1"/>
         </w:rPr>
-        <w:t>בעולמה הפנימי של הדמות פועלים יחסי אובייקט מוקדמים של חסך ונטישה. טיישון לא זכה לאם טובה דיה, ונותר בו אותו “חור שחור” של כמיהה לא ממומשת שעליו למדנו בכיתה. הוא הפנים אובייקט דוחה ובלתי מהימן (הפנמה והזדהות), והזדהה עם התוקפן, כלומר הפך להיות זה שהורס לפני שיהרסו או ינטשו אותו. בהעברה הוא פוגש בקלארק עוד מבוגר שיעזוב או ינצל אותו, ולכן הוא בוחן אותו, בדיוק כפי שלמדתי בהקשר של פחד מקרבה: משחית, מתריס ומאיים לעזוב, כדי לבדוק אם כשיש למבוגר כוח וקרבה הוא ינצל אותם נגדו. ההרס הזה הוא, במונחי “הרס האובייקט” של ויניקוט שהובאו בכיתה, תקיפה של האובייקט מתוך משאלה שישרוד וימשיך להתקיים עבורו. ההעברה הנגדית גלויה: קלארק מגיע לרגע שפל ואומר למריסה “אני מוותר”, בדיוק הייאוש שהילד מפקיד בו דרך הזדהות השלכתית (מושג שלמדתי במצגת “החזקה והכלה”). כשקלארק שורד את ההרס, רואה את עבודות האמנות של טיישון ואומר לו שהן יפהפיות, מתאפשר לראשונה שההרס יוחלף בתלות ובדמעות (1:18:04). מהלך זה עולה בקנה אחד עם ממצאים עדכניים שלפיהם האופן שבו הסביבה משקפת את הנער מעצב את הדימוי העצמי שלו ואת הסתגלותו. נער שמשקפים לו שהוא “לוזר” נושא בתוכו את הדימוי הזה, ומבט אחר מרפה אותו (מצגות הקורס: “מאפייני הנערים.ות”, “החזקה והכלה”; ויניקוט, 1971; Calheiros et al., 2021).</w:t>
+        <w:t>בעולמה הפנימי של הדמות פועלים יחסי אובייקט מוקדמים של חסך ונטישה. טיישון לא זכה לאם טובה דיה, ונותר בו אותו “חור שחור” של כמיהה לא ממומשת שעליו למדנו בכיתה. הוא הפנים אובייקט דוחה ובלתי מהימן (הפנמה והזדהות), והזדהה עם התוקפן, כלומר הפך להיות זה שהורס לפני שיהרסו או ינטשו אותו. בהעברה הוא פוגש בקלארק עוד מבוגר שיעזוב או ינצל אותו, ולכן הוא בוחן אותו, בדיוק כפי שלמדתי בהקשר של פחד מקרבה: משחית, מתריס ומאיים לעזוב, כדי לבדוק אם כשיש למבוגר כוח וקרבה הוא ינצל אותם נגדו. ההרס הזה הוא, במונחי “הרס האובייקט” של ויניקוט שהובאו בכיתה, תקיפה של האובייקט מתוך משאלה שישרוד וימשיך להתקיים עבורו. ההעברה הנגדית גלויה: קלארק מגיע לרגע שפל ואומר למריסה “אני מוותר”, בדיוק הייאוש שהילד מפקיד בו דרך הזדהות השלכתית (מושג שלמדתי במצגת “החזקה והכלה”). כשקלארק שורד את ההרס, רואה את עבודות האמנות של טיישון ואומר לו שהן יפהפיות, מתאפשר לראשונה שההרס יוחלף בתלות ובדמעות (1:18:04). מהלך זה עולה בקנה אחד עם ממצאים עדכניים שלפיהם האופן שבו הסביבה משקפת את הנער מעצב את הדימוי העצמי שלו ואת הסתגלותו. נער שמשקפים לו שהוא “לוזר” נושא בתוכו את הדימוי הזה, ומבט אחר מרפה אותו (ויניקוט, 1971; Calheiros et al., 2021).</w:t>
       </w:r>
     </w:p>
     <w:p>
@@ -237,7 +237,7 @@
           <w:szCs w:val="24"/>
           <w:rtl w:val="1"/>
         </w:rPr>
-        <w:t>כפי שלמדתי בקורס, במצגת “השאלת האימהות”, אחזקה שלמה היא צירוף של שני רבדים מן הפונקציות האימהיות שאי אפשר להפריד ביניהם. ה-handling הוא הארגון והניהול הפיזי של הסביבה: ההאכלה, הניקיון, הבגדים, מעקב אחר הגוף וגבולות המציאות שיש להם משמעות התפתחותית. הוא זה שמחבר את הילד לגופו ויוצר “האנשה”. ה-holding הוא ההחזקה הרגשית: נוכחות רציפה ועקבית, אם שחושבת את הילד ומעניקה משמעות לחוויותיו, ומייצרת רציפות, עקביות והמשכיות, ובתוכה “מרחב ביניים” שבו הילד יכול לחקור בידיעה שהאם שם. יחד הם בונים אצל הילד את מה שחסר לו, ביטחון בסיסי, ומתוכו, בהדרגה, יכולת לווסת את עצמו ולהוציא את העצמי האמיתי מהמחבוא, במקום להתגונן דרך עצמי כוזב (כפי שלמדתי במצגת “החזקה והכלה”). זהו ההיבט ההתפתחותי: מה שהתחיל כטיפול פיזי חיצוני נעשה עם הזמן מבנה פנימי (מצגות הקורס: “השאלת האימהות”, “החזקה והכלה”; ביבי, אורן-צ′יפמן ובלנרו-אדיב, 2016; ויניקוט, 1971).</w:t>
+        <w:t>כפי שלמדתי בקורס, במצגת “השאלת האימהות”, אחזקה שלמה היא צירוף של שני רבדים מן הפונקציות האימהיות שאי אפשר להפריד ביניהם. ה-handling הוא הארגון והניהול הפיזי של הסביבה: ההאכלה, הניקיון, הבגדים, מעקב אחר הגוף וגבולות המציאות שיש להם משמעות התפתחותית. הוא זה שמחבר את הילד לגופו ויוצר “האנשה”. ה-holding הוא ההחזקה הרגשית: נוכחות רציפה ועקבית, אם שחושבת את הילד ומעניקה משמעות לחוויותיו, ומייצרת רציפות, עקביות והמשכיות, ובתוכה “מרחב ביניים” שבו הילד יכול לחקור בידיעה שהאם שם. יחד הם בונים אצל הילד את מה שחסר לו, ביטחון בסיסי, ומתוכו, בהדרגה, יכולת לווסת את עצמו ולהוציא את העצמי האמיתי מהמחבוא, במקום להתגונן דרך עצמי כוזב (כפי שלמדתי במצגת “החזקה והכלה”). זהו ההיבט ההתפתחותי: מה שהתחיל כטיפול פיזי חיצוני נעשה עם הזמן מבנה פנימי (ביבי, אורן-צ′יפמן ובלנרו-אדיב, 2016; ויניקוט, 1971).</w:t>
       </w:r>
     </w:p>
     <w:p>
@@ -255,7 +255,7 @@
           <w:szCs w:val="24"/>
           <w:rtl w:val="1"/>
         </w:rPr>
-        <w:t>בקטע (ראו נספח מסומן בשני צבעים) קל לראות איך אתי נעה בין השניים. דוגמה ל-handling: היא עוקבת אחר משקל וגובה, מודדת חום בכף ידה, דואגת לבגדי חורף, לסדר, לניקיון ולתפריט השבועי, ומסכמת ש“מעולם לא ראיתי אמא שלא מחליפה טיטול רטוב ומלוכלך רק כי הילד לא רוצה”. זהו ניהול קונקרטי של המציאות, של הגוף ושל הגבול. דוגמה ל-holding: לפני שהיא נכנסת היא “מגייסת מתוכי את כל הקולות והצבעים של אמא ובית, מביאה אותם איתי פנימה”, ומסיימת ש“ילדים צריכים להרגיש עטופים בחום”. כאן אין ניהול, יש נוכחות שמעניקה משמעות וחום. שני הסוגים משלימים זה את זה: handling בלי holding נותר טכני ונטול נשמה, ו-holding בלי handling נשאר רגש בלי עוגן במציאות. דווקא השילוב, המרק שהושקע בו עמל יחד עם היכולת לשרוד את הבנות שמפרקות אותו, הוא שמאפשר לילד לחוש מוחזק ולהתפתח (מצגות הקורס: “השאלת האימהות”; ביבי ואח′, 2016).</w:t>
+        <w:t>בקטע (ראו נספח מסומן בשני צבעים) קל לראות איך אתי נעה בין השניים. דוגמה ל-handling: היא עוקבת אחר משקל וגובה, מודדת חום בכף ידה, דואגת לבגדי חורף, לסדר, לניקיון ולתפריט השבועי, ומסכמת ש“מעולם לא ראיתי אמא שלא מחליפה טיטול רטוב ומלוכלך רק כי הילד לא רוצה”. זהו ניהול קונקרטי של המציאות, של הגוף ושל הגבול. דוגמה ל-holding: לפני שהיא נכנסת היא “מגייסת מתוכי את כל הקולות והצבעים של אמא ובית, מביאה אותם איתי פנימה”, ומסיימת ש“ילדים צריכים להרגיש עטופים בחום”. כאן אין ניהול, יש נוכחות שמעניקה משמעות וחום. שני הסוגים משלימים זה את זה: handling בלי holding נותר טכני ונטול נשמה, ו-holding בלי handling נשאר רגש בלי עוגן במציאות. דווקא השילוב, המרק שהושקע בו עמל יחד עם היכולת לשרוד את הבנות שמפרקות אותו, הוא שמאפשר לילד לחוש מוחזק ולהתפתח (ביבי ואח′, 2016).</w:t>
       </w:r>
     </w:p>
     <w:p>
@@ -304,7 +304,7 @@
           <w:szCs w:val="24"/>
           <w:rtl w:val="1"/>
         </w:rPr>
-        <w:t>העיקרון המנחה, כפי שלמדתי בקורס במצגת “אנשי הצוות”, הוא לחפש “איש צוות טוב דיו”, אדם שניחן באיכויות אימהיות טבעיות מן הסוג שאם טובה דיה מעניקה לתינוקה, ושמסוגל ומוכן לפתח אותן לכדי יכולות מקצועיות. איננו מחפשים טכניקה, אלא נכונות להשאיל לילד את המקום האימהי המגדל, כלומר “השאלת אימהות” (מצגות הקורס: “אנשי הצוות”; ביבי, אורן-צ′יפמן ובלנרו-אדיב, 2016).</w:t>
+        <w:t>העיקרון המנחה, כפי שלמדתי בקורס במצגת “אנשי הצוות”, הוא לחפש “איש צוות טוב דיו”, אדם שניחן באיכויות אימהיות טבעיות מן הסוג שאם טובה דיה מעניקה לתינוקה, ושמסוגל ומוכן לפתח אותן לכדי יכולות מקצועיות. איננו מחפשים טכניקה, אלא נכונות להשאיל לילד את המקום האימהי המגדל, כלומר “השאלת אימהות” (ביבי, אורן-צ′יפמן ובלנרו-אדיב, 2016).</w:t>
       </w:r>
     </w:p>
     <w:p>
@@ -364,7 +364,7 @@
           <w:szCs w:val="24"/>
           <w:rtl w:val="1"/>
         </w:rPr>
-        <w:t>סיטואציה: כשטיישון משחית את הכיתה, קלארק אינו מתפרץ אלא אוסף בשקט את המסטיקים לצנצנת ומעמיד את הכללים בלי להתערער (17:59), ובמקביל הוא גמיש ויצירתי, מלמד דקדוק דרך משחק השוקו, מצטרף לקפיצה בחבל וכותב “ראפ הנשיאים”. כיצד זה מדגים את המאפיין: זו היציבות שלמדנו עליה, עמדה פנימית ברורה ועקבית לצד גמישות והתאמה, בלי “הליכה אל הקצוות”, והצבת הגבול כאן היא “גבול כנתינה” ו“מעשה של אהבה” (“עבודה מתוך קשר”), לא שרירות. השפעה על התלמידים: מעבר מכאוס למבנה, סדר יום ורצף שמייצרים מרחב בטוח עם עוגנים ומחזקים אצלם את ה′אני′ (מצגות הקורס: “אנשי הצוות”, “עבודה מתוך קשר”; ביבי ואח′, 2016).</w:t>
+        <w:t>סיטואציה: כשטיישון משחית את הכיתה, קלארק אינו מתפרץ אלא אוסף בשקט את המסטיקים לצנצנת ומעמיד את הכללים בלי להתערער (17:59), ובמקביל הוא גמיש ויצירתי, מלמד דקדוק דרך משחק השוקו, מצטרף לקפיצה בחבל וכותב “ראפ הנשיאים”. כיצד זה מדגים את המאפיין: זו היציבות שלמדנו עליה, עמדה פנימית ברורה ועקבית לצד גמישות והתאמה, בלי “הליכה אל הקצוות”, והצבת הגבול כאן היא “גבול כנתינה” ו“מעשה של אהבה” (“עבודה מתוך קשר”), לא שרירות. השפעה על התלמידים: מעבר מכאוס למבנה, סדר יום ורצף שמייצרים מרחב בטוח עם עוגנים ומחזקים אצלם את ה′אני′ (ביבי ואח′, 2016).</w:t>
       </w:r>
     </w:p>
     <w:p>
@@ -394,7 +394,7 @@
           <w:szCs w:val="24"/>
           <w:rtl w:val="1"/>
         </w:rPr>
-        <w:t>סיטואציה: קלארק מחלק לתלמידים את מספר הטלפון שלו וזמין 24/7 (1:00:21), ומכריז מהיום הראשון “אנחנו נהיה משפחה”. כיצד זה מדגים את המאפיין: הוא מסכים להיות מוקד מכריע בחייהם, דמות שאליה מפנים תלות ואמון, ופועל כ“מדריך משקף” שהמבט שלו הוא המראה שדרכה הם רואים את עצמם. השפעה על התלמידים: הם מקבלים “ביטחון מורגש” ש“מישהו שומר עליהם”, חשים שהם שווים את המאמץ, והדימוי העצמי שלהם משתנה מ“לוזרים” לילדים מסוגלים (מצגות הקורס: “אנשי הצוות”; Calheiros et al., 2021).</w:t>
+        <w:t>סיטואציה: קלארק מחלק לתלמידים את מספר הטלפון שלו וזמין 24/7 (1:00:21), ומכריז מהיום הראשון “אנחנו נהיה משפחה”. כיצד זה מדגים את המאפיין: הוא מסכים להיות מוקד מכריע בחייהם, דמות שאליה מפנים תלות ואמון, ופועל כ“מדריך משקף” שהמבט שלו הוא המראה שדרכה הם רואים את עצמם. השפעה על התלמידים: הם מקבלים “ביטחון מורגש” ש“מישהו שומר עליהם”, חשים שהם שווים את המאמץ, והדימוי העצמי שלהם משתנה מ“לוזרים” לילדים מסוגלים (Calheiros et al., 2021).</w:t>
       </w:r>
     </w:p>
     <w:p>
@@ -424,7 +424,7 @@
           <w:szCs w:val="24"/>
           <w:rtl w:val="1"/>
         </w:rPr>
-        <w:t>סיטואציה: גם כשהוא חולה בדלקת ריאות קלארק מצלם את השיעורים מהמיטה ארבע שעות ביום עד שהוא מתמוטט (1:03:58), ונאבק נגד סילוקו של טיישון כשההורה האומן כבר ויתר עליו (59:23). כיצד זה מדגים את המאפיין: זו מסירות מתוך בחירה ואהבה שאינה מבקשת תמורה, ולצידה היכולת להיות משני, להשהות את צרכיו ולמקם את הילד במרכז. השפעה על התלמידים: דווקא העובדה שהוא שורד את ההרס ואת הדחייה ולא נשבר היא שמאפשרת להם בסופו של דבר לבטוח ולאהוב (מצגות הקורס: “אנשי הצוות”; ויניקוט, 1971).</w:t>
+        <w:t>סיטואציה: גם כשהוא חולה בדלקת ריאות קלארק מצלם את השיעורים מהמיטה ארבע שעות ביום עד שהוא מתמוטט (1:03:58), ונאבק נגד סילוקו של טיישון כשההורה האומן כבר ויתר עליו (59:23). כיצד זה מדגים את המאפיין: זו מסירות מתוך בחירה ואהבה שאינה מבקשת תמורה, ולצידה היכולת להיות משני, להשהות את צרכיו ולמקם את הילד במרכז. השפעה על התלמידים: דווקא העובדה שהוא שורד את ההרס ואת הדחייה ולא נשבר היא שמאפשרת להם בסופו של דבר לבטוח ולאהוב (ויניקוט, 1971).</w:t>
       </w:r>
     </w:p>
     <w:p>
@@ -454,7 +454,7 @@
           <w:szCs w:val="24"/>
           <w:rtl w:val="1"/>
         </w:rPr>
-        <w:t>[חלק זה יש להתאים אישית] מאפיין שאני מרגיש/ה שקיים בי הוא היכולת ליציבות. אני נוטה להחזיק גבול ברוגע גם כשסוער, ולחפש דרך יצירתית במקום להיגרר ל“מאבק כוחות”, כלומר לנוע בין עמידה לתנועה בלי ליפול ל“הליכה אל הקצוות”. מאפיין שחסר לי, לפחות חלקית, הוא היכולת לשאת תלות ולהיות משמעותי. יש בי חשש להיות המוקד שאליו נער מפנה תלות מוחלטת, ולעיתים אני שומר/ת מרחק כדי לא להסתכן. אני מבין/ה שזה קשור גם לצורך שלי ב“תגמול חיצוני”, בעוד שבעבודה הזאת ה“תגמול הפנימי” הוא הכוח המניע, וכדי לפתח את היכולת הזאת אני זקוק/ה בעצמי לסביבה יציבה ולהדרכה (מצגות הקורס: “אנשי הצוות”; ביבי ואח′, 2016).</w:t>
+        <w:t>[חלק זה יש להתאים אישית] מאפיין שאני מרגישה שקיים בי הוא היכולת ליציבות. אני נוטה להחזיק גבול ברוגע גם כשסוער, ולחפש דרך יצירתית במקום להיגרר ל“מאבק כוחות”, כלומר לנוע בין עמידה לתנועה בלי ליפול ל“הליכה אל הקצוות”. מאפיין שחסר לי, לפחות חלקית, הוא היכולת לשאת תלות ולהיות משמעותי. יש בי חשש להיות המוקד שאליו נער מפנה תלות מוחלטת, ולעיתים אני שומרת מרחק כדי לא להסתכן. אני מבינה שזה קשור גם לצורך שלי ב“תגמול חיצוני”, בעוד שבעבודה הזאת ה“תגמול הפנימי” הוא הכוח המניע, וכדי לפתח את היכולת הזאת אני זקוקה בעצמי לסביבה יציבה ולהדרכה (ביבי ואח′, 2016).</w:t>
       </w:r>
     </w:p>
     <w:p>
@@ -534,7 +534,7 @@
           <w:szCs w:val="24"/>
           <w:rtl w:val="1"/>
         </w:rPr>
-        <w:t>ברמה התיאורטית, הדבר שחידש והפתיע אותי יותר מכול הוא הרעיון ש“התנהגות היא שפה”. עד הקורס נטיתי לראות התפרצות או חוצפה כ“בעיית משמעת” שצריך לעצור, והיום אני שומע/ת מתחתה שאלה: מה הילד מנסה לספר ואיזה חוסר הוא מבטא. ברמה האישית נגע לליבי להבין כמה מהתגובות שלי לילדים נובעות מיחסי האובייקט המוקדמים שלי עצמי, ושגם אני, כאיש צוות, זקוק/ה להיות מוחזק/ת. דוגמה קונקרטית לשינוי תפיסה: מול נער שהתפרץ עליי בעבר הייתי מגיב/ה מיד בגבול ובעונש, והיום הייתי מתכוונן/ת ומכיל/ה קודם, ורק אז מציב/ה גבול כמעשה מיטיב (מצגות הקורס: “מאפייני הנערים.ות”).</w:t>
+        <w:t>ברמה התיאורטית, הדבר שחידש והפתיע אותי יותר מכול הוא הרעיון ש“התנהגות היא שפה”. עד הקורס נטיתי לראות התפרצות או חוצפה כ“בעיית משמעת” שצריך לעצור, והיום אני שומעת מתחתה שאלה: מה הילד מנסה לספר ואיזה חוסר הוא מבטא. ברמה האישית נגע לליבי להבין כמה מהתגובות שלי לילדים נובעות מיחסי האובייקט המוקדמים שלי עצמי, ושגם אני, כאיש צוות, זקוקה להיות מוחזקת. דוגמה קונקרטית לשינוי תפיסה: מול נער שהתפרץ עליי בעבר הייתי מגיבה מיד בגבול ובעונש, והיום הייתי מתכווננת ומכילה קודם, ורק אז מציבה גבול כמעשה מיטיב.</w:t>
       </w:r>
     </w:p>
     <w:p>
@@ -576,7 +576,7 @@
           <w:szCs w:val="24"/>
           <w:rtl w:val="1"/>
         </w:rPr>
-        <w:t>בעבודתי עם הנוער הקשר הזה מתבטא בשגרה, בסדר היום ובגבולות היומיומיים, שאני מבין/ה עכשיו כ-handling ו-holding ולא כ“רעש במערכת”, ובהבנה שהצבת גבול היא “נתינה”. גם מול הרס אני מנסה “לשרוד” בלי להישבר ולראות בהתנהגות מופע שמספר סיפור, במקום עבירת משמעת שיש להעניש (מצגות הקורס: “עבודה מתוך קשר”, “השאלת האימהות”).</w:t>
+        <w:t>בעבודתי עם הנוער הקשר הזה מתבטא בשגרה, בסדר היום ובגבולות היומיומיים, שאני מבינה עכשיו כ-handling ו-holding ולא כ“רעש במערכת”, ובהבנה שהצבת גבול היא “נתינה”. גם מול הרס אני מנסה “לשרוד” בלי להישבר ולראות בהתנהגות מופע שמספר סיפור, במקום עבירת משמעת שיש להעניש.</w:t>
       </w:r>
     </w:p>
     <w:p>
@@ -660,7 +660,7 @@
           <w:szCs w:val="24"/>
           <w:rtl w:val="1"/>
         </w:rPr>
-        <w:t>מה שהשפיע עליי יותר מכול הוא שהקורס נתן לי שפה למה שכבר עשיתי באינטואיציה, וההבנה שהעבודה הפשוטה והיומיומית היא עצמה הטיפול (מצגות הקורס; ביון, 1962; ביבי ואח′, 2016).</w:t>
+        <w:t>מה שהשפיע עליי יותר מכול הוא שהקורס נתן לי שפה למה שכבר עשיתי באינטואיציה, וההבנה שהעבודה הפשוטה והיומיומית היא עצמה הטיפול (ביון, 1962; ביבי ואח′, 2016).</w:t>
       </w:r>
     </w:p>
     <w:p>
@@ -680,24 +680,6 @@
           <w:rtl w:val="1"/>
         </w:rPr>
         <w:t>רשימת מקורות</w:t>
-      </w:r>
-    </w:p>
-    <w:p>
-      <w:pPr>
-        <w:spacing w:line="360" w:lineRule="auto" w:before="0" w:after="60"/>
-        <w:jc w:val="right"/>
-        <w:bidi w:val="1"/>
-      </w:pPr>
-      <w:r>
-        <w:rPr>
-          <w:rFonts w:ascii="David" w:hAnsi="David"/>
-          <w:b w:val="0"/>
-          <w:sz w:val="22"/>
-          <w:rFonts w:ascii="David" w:hAnsi="David" w:cs="David"/>
-          <w:szCs w:val="22"/>
-          <w:rtl w:val="1"/>
-        </w:rPr>
-        <w:t>אנשל, א′ (תשפ“ו). מצגות הקורס “נוער בסיכון: נושאים מתקדמים”: “עבודה מתוך קשר”, “מאפייני הנערים.ות”, “אנשי הצוות” (“השאלת האימהות”, “החזקה והכלה”, “תפקידי המדריך”). חומר לימוד לא מפורסם.</w:t>
       </w:r>
     </w:p>
     <w:p>

</xml_diff>

<commit_message>
Integrate presentation content directly instead of naming the slides
Rework references to the class presentations so the material's substance
is woven into the argument (behavior as language, destruction/reparation,
holding/handling, true/false self, containment) with attributions to the
underlying theorists (Winnicott, Bion), rather than pointing at "the
presentation" as a container. Course references now remain only in the
Q4 reflection, where they belong.

Co-Authored-By: Claude Opus 4.8 <noreply@anthropic.com>
Claude-Session: https://claude.ai/code/session_013eDJJACHg3huLEj7ZFfo9K
</commit_message>
<xml_diff>
--- a/עבודה_מסכמת_נוער_בסיכון_מורה_לחיים.docx
+++ b/עבודה_מסכמת_נוער_בסיכון_מורה_לחיים.docx
@@ -140,7 +140,7 @@
           <w:szCs w:val="24"/>
           <w:rtl w:val="1"/>
         </w:rPr>
-        <w:t>כפי שלמדתי בקורס, במצגת “מאפייני הנערים.ות”, ההתנהגות היא שפה, ומופע התנהגותי הוא הדרך שבה ילד מראה לעולם את מה שאין לו מילים לומר. כשנחסמת היכולת להמשיג ולהסביר, הילד “מתנהג את מצוקתו” במקום לספר אותה. המופע קיים משום שאצל ילדים שנשאו פגיעה ראשונית, סביבה שלא הצליחה לווסת אותם בראשית חייהם, לא נבנו מנגנוני ויסות וארגון עצמי, והחרדה, עד כדי חרדת כיליון, נותרת מציפה ובלתי מוכלת. לכן המופע הוא בעת ובעונה אחת פורקן של דחף לא מעובד וניסיון נואש לתקשר. במצגת מנו כמה מופעים, ובהם חרדה, פחד מקרבה, עצב וריקנות, מחשבה שאינה נחשבת, והרס וכיליון, ואצל האחד תתפרץ תוקפנות בעוד אצל האחר תופיע שקיעה ודכדוך. מה עלינו לעשות? לא להיבהל ולא לפעול מתוך העלבון, אלא להתכוונן אל המופע, לחפש את הסיפור שמתחתיו ולהחזיק אותו עבור הילד עד שנוכל להשיב לו אותו במילים (ביבי, אורן-צ′יפמן ובלנרו-אדיב, 2016; פונגי, אלן וביטמן, 2008).</w:t>
+        <w:t>ההתנהגות היא שפה, ומופע התנהגותי הוא הדרך שבה ילד מראה לעולם את מה שאין לו מילים לומר. כשנחסמת היכולת להמשיג ולהסביר, הילד “מתנהג את מצוקתו” במקום לספר אותה. המופע קיים משום שאצל ילדים שנשאו פגיעה ראשונית, סביבה שלא הצליחה לווסת אותם בראשית חייהם, לא נבנו מנגנוני ויסות וארגון עצמי, והחרדה, עד כדי חרדת כיליון, נותרת מציפה ובלתי מוכלת. לכן המופע הוא בעת ובעונה אחת פורקן של דחף לא מעובד וניסיון נואש לתקשר. מבין מופעי ההתנהגות אפשר למנות חרדה, פחד מקרבה, עצב וריקנות, מחשבה שאינה נחשבת, והרס וכיליון, ואצל האחד תתפרץ תוקפנות בעוד אצל האחר תופיע שקיעה ודכדוך. מה עלינו לעשות? לא להיבהל ולא לפעול מתוך העלבון, אלא להתכוונן אל המופע, לחפש את הסיפור שמתחתיו ולהחזיק אותו עבור הילד עד שנוכל להשיב לו אותו במילים (ביבי, אורן-צ′יפמן ובלנרו-אדיב, 2016; פונגי, אלן וביטמן, 2008).</w:t>
       </w:r>
     </w:p>
     <w:p>
@@ -170,7 +170,7 @@
           <w:szCs w:val="24"/>
           <w:rtl w:val="1"/>
         </w:rPr>
-        <w:t>המופע הבולט של טיישון הוא “הרס וכיליון”, על פי הטיפולוגיה שלמדנו. בימים הראשונים קלארק חוזר לכיתה מחוללת ומושחתת, וטיישון מודה בגאווה שהוא זה שעשה זאת (17:59–19:41). עוד קודם הוא מתגרה “תשעה אותי” (16:41), ובהמשך מסרב לכתוב ביומן החלומות, מתחצף ומאיים לעזוב, אף שכבר יש לו שני “סטרייקים” (31:44, 33:34). הגורמים שהובילו לכך ברורים מרקע הדמות: טיישון חי במשפחת אומנה, שלושה חודשים בעיר בלי שראה בה דבר, ילד שכבר תויג ומצוי בדרך למעצר נוער. מורה חדש שדורש קרבה וכללים נחווה כאיום קיומי, והתגובה היא זו של Fight, תקיפה. תגובות הסביבה הזינו את ההסלמה: המנהל טרנר נאחז בכללים ומוכן לסלק, מורים קודמים כבר ויתרו (הכיתה החליפה שישה מורים), וההורה האומן מוותר עליו בשימוע (59:23). התוצאה היא שימוע סילוק שהיה מדרדר אותו אל הרחוב, אלא שקלארק מסרב להגיב באותו מטבע, מחזיק את הגבול ברוגע ונלחם נגד הסילוק. וכך המופע, שנועד להרחיק, דווקא מזמן קרבה.</w:t>
+        <w:t>המופע הבולט של טיישון הוא “הרס וכיליון”. תוקפנות שלא עברה עידון וויסות הופכת להרסנות, מתוך תחושה שאין לו מה להפסיד. בימים הראשונים קלארק חוזר לכיתה מחוללת ומושחתת, וטיישון מודה בגאווה שהוא זה שעשה זאת (17:59–19:41). עוד קודם הוא מתגרה “תשעה אותי” (16:41), ובהמשך מסרב לכתוב ביומן החלומות, מתחצף ומאיים לעזוב, אף שכבר יש לו שני “סטרייקים” (31:44, 33:34). הגורמים שהובילו לכך ברורים מרקע הדמות: טיישון חי במשפחת אומנה, שלושה חודשים בעיר בלי שראה בה דבר, ילד שכבר תויג ומצוי בדרך למעצר נוער. מורה חדש שדורש קרבה וכללים נחווה כאיום קיומי, והתגובה היא זו של Fight, תקיפה. תגובות הסביבה הזינו את ההסלמה: המנהל טרנר נאחז בכללים ומוכן לסלק, מורים קודמים כבר ויתרו (הכיתה החליפה שישה מורים), וההורה האומן מוותר עליו בשימוע (59:23). התוצאה היא שימוע סילוק שהיה מדרדר אותו אל הרחוב, אלא שקלארק מסרב להגיב באותו מטבע, מחזיק את הגבול ברוגע ונלחם נגד הסילוק. וכך המופע, שנועד להרחיק, דווקא מזמן קרבה.</w:t>
       </w:r>
     </w:p>
     <w:p>
@@ -200,7 +200,7 @@
           <w:szCs w:val="24"/>
           <w:rtl w:val="1"/>
         </w:rPr>
-        <w:t>בעולמה הפנימי של הדמות פועלים יחסי אובייקט מוקדמים של חסך ונטישה. טיישון לא זכה לאם טובה דיה, ונותר בו אותו “חור שחור” של כמיהה לא ממומשת שעליו למדנו בכיתה. הוא הפנים אובייקט דוחה ובלתי מהימן (הפנמה והזדהות), והזדהה עם התוקפן, כלומר הפך להיות זה שהורס לפני שיהרסו או ינטשו אותו. בהעברה הוא פוגש בקלארק עוד מבוגר שיעזוב או ינצל אותו, ולכן הוא בוחן אותו, בדיוק כפי שלמדתי בהקשר של פחד מקרבה: משחית, מתריס ומאיים לעזוב, כדי לבדוק אם כשיש למבוגר כוח וקרבה הוא ינצל אותם נגדו. ההרס הזה הוא, במונחי “הרס האובייקט” של ויניקוט שהובאו בכיתה, תקיפה של האובייקט מתוך משאלה שישרוד וימשיך להתקיים עבורו. ההעברה הנגדית גלויה: קלארק מגיע לרגע שפל ואומר למריסה “אני מוותר”, בדיוק הייאוש שהילד מפקיד בו דרך הזדהות השלכתית (מושג שלמדתי במצגת “החזקה והכלה”). כשקלארק שורד את ההרס, רואה את עבודות האמנות של טיישון ואומר לו שהן יפהפיות, מתאפשר לראשונה שההרס יוחלף בתלות ובדמעות (1:18:04). מהלך זה עולה בקנה אחד עם ממצאים עדכניים שלפיהם האופן שבו הסביבה משקפת את הנער מעצב את הדימוי העצמי שלו ואת הסתגלותו. נער שמשקפים לו שהוא “לוזר” נושא בתוכו את הדימוי הזה, ומבט אחר מרפה אותו (ויניקוט, 1971; Calheiros et al., 2021).</w:t>
+        <w:t>בעולמה הפנימי של הדמות פועלים יחסי אובייקט מוקדמים של חסך ונטישה. טיישון לא זכה לאם טובה דיה, ונותר בו אותו “חור שחור” של כמיהה לא ממומשת למגע פיזי ונפשי. הוא הפנים אובייקט דוחה ובלתי מהימן (הפנמה והזדהות), והזדהה עם התוקפן, כלומר הפך להיות זה שהורס לפני שיהרסו או ינטשו אותו. בהעברה הוא פוגש בקלארק עוד מבוגר שיעזוב או ינצל אותו, ולכן הוא בוחן אותו, וזהו ביטוי מובהק של פחד מקרבה: משחית, מתריס ומאיים לעזוב, כדי לבדוק אם כשיש למבוגר כוח וקרבה הוא ינצל אותם נגדו. ההרס הזה הוא, במונחי “הרס האובייקט” של ויניקוט, תקיפה של האובייקט המטפל מתוך משאלה שישרוד וימשיך להתקיים עבורו. ההעברה הנגדית גלויה: קלארק מגיע לרגע שפל ואומר למריסה “אני מוותר”, בדיוק הייאוש שהילד מפקיד בו דרך הזדהות השלכתית, כפי שביון מתאר את ההכלה. כשקלארק שורד את ההרס, רואה את עבודות האמנות של טיישון ואומר לו שהן יפהפיות, מתאפשר לראשונה שההרס יוחלף בתלות ובדמעות (1:18:04). מהלך זה עולה בקנה אחד עם ממצאים עדכניים שלפיהם האופן שבו הסביבה משקפת את הנער מעצב את הדימוי העצמי שלו ואת הסתגלותו. נער שמשקפים לו שהוא “לוזר” נושא בתוכו את הדימוי הזה, ומבט אחר מרפה אותו (ויניקוט, 1971; Calheiros et al., 2021).</w:t>
       </w:r>
     </w:p>
     <w:p>
@@ -237,7 +237,7 @@
           <w:szCs w:val="24"/>
           <w:rtl w:val="1"/>
         </w:rPr>
-        <w:t>כפי שלמדתי בקורס, במצגת “השאלת האימהות”, אחזקה שלמה היא צירוף של שני רבדים מן הפונקציות האימהיות שאי אפשר להפריד ביניהם. ה-handling הוא הארגון והניהול הפיזי של הסביבה: ההאכלה, הניקיון, הבגדים, מעקב אחר הגוף וגבולות המציאות שיש להם משמעות התפתחותית. הוא זה שמחבר את הילד לגופו ויוצר “האנשה”. ה-holding הוא ההחזקה הרגשית: נוכחות רציפה ועקבית, אם שחושבת את הילד ומעניקה משמעות לחוויותיו, ומייצרת רציפות, עקביות והמשכיות, ובתוכה “מרחב ביניים” שבו הילד יכול לחקור בידיעה שהאם שם. יחד הם בונים אצל הילד את מה שחסר לו, ביטחון בסיסי, ומתוכו, בהדרגה, יכולת לווסת את עצמו ולהוציא את העצמי האמיתי מהמחבוא, במקום להתגונן דרך עצמי כוזב (כפי שלמדתי במצגת “החזקה והכלה”). זהו ההיבט ההתפתחותי: מה שהתחיל כטיפול פיזי חיצוני נעשה עם הזמן מבנה פנימי (ביבי, אורן-צ′יפמן ובלנרו-אדיב, 2016; ויניקוט, 1971).</w:t>
+        <w:t>אחזקה שלמה היא צירוף של שני רבדים מן הפונקציות האימהיות שאי אפשר להפריד ביניהם. ה-handling הוא הארגון והניהול הפיזי של הסביבה: ההאכלה, הניקיון, הבגדים, מעקב אחר הגוף וגבולות המציאות שיש להם משמעות התפתחותית. הוא זה שמחבר את הילד לגופו ויוצר “האנשה”. ה-holding הוא ההחזקה הרגשית: נוכחות רציפה ועקבית, אם שחושבת את הילד ומעניקה משמעות לחוויותיו, ומייצרת רציפות, עקביות והמשכיות, ובתוכה “מרחב ביניים” שבו הילד יכול לחקור בידיעה שהאם שם. יחד הם בונים אצל הילד את מה שחסר לו, ביטחון בסיסי, ומתוכו, בהדרגה, יכולת לווסת את עצמו ולהוציא את העצמי האמיתי מהמחבוא, במקום להתגונן דרך עצמי כוזב, בהבחנתו של ויניקוט בין עצמי אמיתי לעצמי כוזב. זהו ההיבט ההתפתחותי: מה שהתחיל כטיפול פיזי חיצוני נעשה עם הזמן מבנה פנימי (ביבי, אורן-צ′יפמן ובלנרו-אדיב, 2016; ויניקוט, 1971).</w:t>
       </w:r>
     </w:p>
     <w:p>
@@ -304,7 +304,7 @@
           <w:szCs w:val="24"/>
           <w:rtl w:val="1"/>
         </w:rPr>
-        <w:t>העיקרון המנחה, כפי שלמדתי בקורס במצגת “אנשי הצוות”, הוא לחפש “איש צוות טוב דיו”, אדם שניחן באיכויות אימהיות טבעיות מן הסוג שאם טובה דיה מעניקה לתינוקה, ושמסוגל ומוכן לפתח אותן לכדי יכולות מקצועיות. איננו מחפשים טכניקה, אלא נכונות להשאיל לילד את המקום האימהי המגדל, כלומר “השאלת אימהות” (ביבי, אורן-צ′יפמן ובלנרו-אדיב, 2016).</w:t>
+        <w:t>העיקרון המנחה הוא לחפש “איש צוות טוב דיו”, אדם שניחן באיכויות אימהיות טבעיות מן הסוג שאם טובה דיה מעניקה לתינוקה, ושמסוגל ומוכן לפתח אותן לכדי יכולות מקצועיות. איננו מחפשים טכניקה, אלא נכונות להשאיל לילד את המקום האימהי המגדל, כלומר “השאלת אימהות” (ביבי, אורן-צ′יפמן ובלנרו-אדיב, 2016).</w:t>
       </w:r>
     </w:p>
     <w:p>
@@ -334,7 +334,7 @@
           <w:szCs w:val="24"/>
           <w:rtl w:val="1"/>
         </w:rPr>
-        <w:t>המאפיינים המרכזיים הנדרשים מאיש צוות, כפי שלמדתי במצגת “אנשי הצוות”, הם ארבע יכולות: יציבות, משניות, משמעותיות והתמסרות. אדגים שלוש מהן דרך דמותו של המורה קלארק, ולכל אחת אביא סיטואציה מהסרט, אסביר כיצד היא מדגימה את המאפיין ואנתח את השפעת ההתנהלות על התלמידים.</w:t>
+        <w:t>המאפיינים המרכזיים הנדרשים מאיש צוות הם ארבע יכולות: יציבות, משניות, משמעותיות והתמסרות. אדגים שלוש מהן דרך דמותו של המורה קלארק, ולכל אחת אביא סיטואציה מהסרט, אסביר כיצד היא מדגימה את המאפיין ואנתח את השפעת ההתנהלות על התלמידים.</w:t>
       </w:r>
     </w:p>
     <w:p>
@@ -364,7 +364,7 @@
           <w:szCs w:val="24"/>
           <w:rtl w:val="1"/>
         </w:rPr>
-        <w:t>סיטואציה: כשטיישון משחית את הכיתה, קלארק אינו מתפרץ אלא אוסף בשקט את המסטיקים לצנצנת ומעמיד את הכללים בלי להתערער (17:59), ובמקביל הוא גמיש ויצירתי, מלמד דקדוק דרך משחק השוקו, מצטרף לקפיצה בחבל וכותב “ראפ הנשיאים”. כיצד זה מדגים את המאפיין: זו היציבות שלמדנו עליה, עמדה פנימית ברורה ועקבית לצד גמישות והתאמה, בלי “הליכה אל הקצוות”, והצבת הגבול כאן היא “גבול כנתינה” ו“מעשה של אהבה” (“עבודה מתוך קשר”), לא שרירות. השפעה על התלמידים: מעבר מכאוס למבנה, סדר יום ורצף שמייצרים מרחב בטוח עם עוגנים ומחזקים אצלם את ה′אני′ (ביבי ואח′, 2016).</w:t>
+        <w:t>סיטואציה: כשטיישון משחית את הכיתה, קלארק אינו מתפרץ אלא אוסף בשקט את המסטיקים לצנצנת ומעמיד את הכללים בלי להתערער (17:59), ובמקביל הוא גמיש ויצירתי, מלמד דקדוק דרך משחק השוקו, מצטרף לקפיצה בחבל וכותב “ראפ הנשיאים”. כיצד זה מדגים את המאפיין: זוהי היכולת ליציבות שבין עמידה לתנועה, עמדה פנימית ברורה ועקבית לצד גמישות והתאמה, בלי “הליכה אל הקצוות”, והצבת הגבול כאן היא “גבול כנתינה” ו“מעשה של אהבה”, לא שרירות. השפעה על התלמידים: מעבר מכאוס למבנה, סדר יום ורצף שמייצרים מרחב בטוח עם עוגנים ומחזקים אצלם את ה′אני′ (ביבי ואח′, 2016).</w:t>
       </w:r>
     </w:p>
     <w:p>

</xml_diff>

<commit_message>
Recolor Q2 appendix: handling in light blue, holding in yellow
Switch the handling highlight from green to cyan (light blue) per the
requested color scheme; holding stays yellow.

Co-Authored-By: Claude Opus 4.8 <noreply@anthropic.com>
Claude-Session: https://claude.ai/code/session_013eDJJACHg3huLEj7ZFfo9K
</commit_message>
<xml_diff>
--- a/עבודה_מסכמת_נוער_בסיכון_מורה_לחיים.docx
+++ b/עבודה_מסכמת_נוער_בסיכון_מורה_לחיים.docx
@@ -822,7 +822,7 @@
           <w:rFonts w:ascii="David" w:hAnsi="David" w:cs="David"/>
           <w:szCs w:val="24"/>
           <w:rtl w:val="1"/>
-          <w:highlight w:val="green"/>
+          <w:highlight w:val="cyan"/>
         </w:rPr>
         <w:t xml:space="preserve"> handling (ניהול פיזי / מציאות) </w:t>
       </w:r>
@@ -875,7 +875,7 @@
           <w:rFonts w:ascii="David" w:hAnsi="David" w:cs="David"/>
           <w:szCs w:val="24"/>
           <w:rtl w:val="1"/>
-          <w:highlight w:val="green"/>
+          <w:highlight w:val="cyan"/>
         </w:rPr>
         <w:t>יש לדאוג לכל ההתארגנות לקראת החורף. חשבתי איזה בגדים יש לכל אחת מהן, ולמי חסר מעיל. נדמה שהשנה כולן גדלו כל כך, וצריך יהיה לרכוש לרובן בגדים חדשים.</w:t>
       </w:r>
@@ -910,7 +910,7 @@
           <w:rFonts w:ascii="David" w:hAnsi="David" w:cs="David"/>
           <w:szCs w:val="24"/>
           <w:rtl w:val="1"/>
-          <w:highlight w:val="green"/>
+          <w:highlight w:val="cyan"/>
         </w:rPr>
         <w:t>צריך להמשיך לעקוב אחר המשקל והגובה. אדווח על כך למדריכים.</w:t>
       </w:r>
@@ -934,7 +934,7 @@
           <w:rFonts w:ascii="David" w:hAnsi="David" w:cs="David"/>
           <w:szCs w:val="24"/>
           <w:rtl w:val="1"/>
-          <w:highlight w:val="green"/>
+          <w:highlight w:val="cyan"/>
         </w:rPr>
         <w:t xml:space="preserve"> מה עוד אפשר לעשות בעניין האכילה?</w:t>
       </w:r>
@@ -970,7 +970,7 @@
           <w:rFonts w:ascii="David" w:hAnsi="David" w:cs="David"/>
           <w:szCs w:val="24"/>
           <w:rtl w:val="1"/>
-          <w:highlight w:val="green"/>
+          <w:highlight w:val="cyan"/>
         </w:rPr>
         <w:t>יושבת עכשיו אל השולחן בצורה מאורגנת, והאוכל נשאר בצלחת ולא נמרח לכל עבר. היא אפילו השתדלה להישאר נקייה, ובסיום הארוחה לא היה בהול להזדרז אל הכיור כדי לשטוף פנים וידיים.</w:t>
       </w:r>
@@ -1051,7 +1051,7 @@
           <w:rFonts w:ascii="David" w:hAnsi="David" w:cs="David"/>
           <w:szCs w:val="24"/>
           <w:rtl w:val="1"/>
-          <w:highlight w:val="green"/>
+          <w:highlight w:val="cyan"/>
         </w:rPr>
         <w:t>לאחת אני מדמיינת חלוק לבן, לרגע מודדת חום בכף ידי, לשנייה בודקת גרון, לשלישית מעסה את כף היד, ולכולן מבטיחה תה בסיום הארוחה.</w:t>
       </w:r>
@@ -1098,7 +1098,7 @@
           <w:rFonts w:ascii="David" w:hAnsi="David" w:cs="David"/>
           <w:szCs w:val="24"/>
           <w:rtl w:val="1"/>
-          <w:highlight w:val="green"/>
+          <w:highlight w:val="cyan"/>
         </w:rPr>
         <w:t>כשמתאמצים שתהיה ארוחת ערב טעימה, רק כדי שכמה בנות יפרקו אותה ולא יאפשרו ליהנות מהפיצה ומהמרק שהושקע בהם עמל,</w:t>
       </w:r>
@@ -1134,7 +1134,7 @@
           <w:rFonts w:ascii="David" w:hAnsi="David" w:cs="David"/>
           <w:szCs w:val="24"/>
           <w:rtl w:val="1"/>
-          <w:highlight w:val="green"/>
+          <w:highlight w:val="cyan"/>
         </w:rPr>
         <w:t xml:space="preserve"> אני יודעת עד כמה חשובים סדר, ניקיון ואוכל טוב. בלי זה יהיה תוהו ובוהו. מעולם לא ראיתי אמא שלא מחליפה טיטול רטוב ומלוכלך רק כי הילד לא רוצה. עוד עליי לעבור על התפריט השבועי, והנה הגיע המשלוח של שמיכות החורף והציפות.</w:t>
       </w:r>

</xml_diff>

<commit_message>
Fix highlight rendering in Q2 appendix
Rebuild each run's rPr in valid OOXML child order so Word honors the
highlight: a single rFonts element and the highlight placed before rtl
(previously highlight came after rtl with a duplicate rFonts, so Word
dropped the colors). Handling now shows in light blue, holding in yellow.

Co-Authored-By: Claude Opus 4.8 <noreply@anthropic.com>
Claude-Session: https://claude.ai/code/session_013eDJJACHg3huLEj7ZFfo9K
</commit_message>
<xml_diff>
--- a/עבודה_מסכמת_נוער_בסיכון_מורה_לחיים.docx
+++ b/עבודה_מסכמת_נוער_בסיכון_מורה_לחיים.docx
@@ -10,12 +10,11 @@
       </w:pPr>
       <w:r>
         <w:rPr>
-          <w:rFonts w:ascii="David" w:hAnsi="David"/>
+          <w:rFonts w:ascii="David" w:hAnsi="David" w:cs="David"/>
           <w:b/>
+          <w:bCs/>
           <w:sz w:val="28"/>
-          <w:rFonts w:ascii="David" w:hAnsi="David" w:cs="David"/>
           <w:szCs w:val="28"/>
-          <w:bCs/>
           <w:rtl w:val="1"/>
         </w:rPr>
         <w:t>עבודה מסכמת בקורס “נוער בסיכון: נושאים מתקדמים”</w:t>
@@ -29,10 +28,8 @@
       </w:pPr>
       <w:r>
         <w:rPr>
-          <w:rFonts w:ascii="David" w:hAnsi="David"/>
-          <w:b w:val="0"/>
+          <w:rFonts w:ascii="David" w:hAnsi="David" w:cs="David"/>
           <w:sz w:val="24"/>
-          <w:rFonts w:ascii="David" w:hAnsi="David" w:cs="David"/>
           <w:szCs w:val="24"/>
           <w:rtl w:val="1"/>
         </w:rPr>
@@ -47,10 +44,8 @@
       </w:pPr>
       <w:r>
         <w:rPr>
-          <w:rFonts w:ascii="David" w:hAnsi="David"/>
-          <w:b w:val="0"/>
+          <w:rFonts w:ascii="David" w:hAnsi="David" w:cs="David"/>
           <w:sz w:val="24"/>
-          <w:rFonts w:ascii="David" w:hAnsi="David" w:cs="David"/>
           <w:szCs w:val="24"/>
           <w:rtl w:val="1"/>
         </w:rPr>
@@ -65,10 +60,8 @@
       </w:pPr>
       <w:r>
         <w:rPr>
-          <w:rFonts w:ascii="David" w:hAnsi="David"/>
-          <w:b w:val="0"/>
+          <w:rFonts w:ascii="David" w:hAnsi="David" w:cs="David"/>
           <w:sz w:val="24"/>
-          <w:rFonts w:ascii="David" w:hAnsi="David" w:cs="David"/>
           <w:szCs w:val="24"/>
           <w:rtl w:val="1"/>
         </w:rPr>
@@ -83,12 +76,11 @@
       </w:pPr>
       <w:r>
         <w:rPr>
-          <w:rFonts w:ascii="David" w:hAnsi="David"/>
+          <w:rFonts w:ascii="David" w:hAnsi="David" w:cs="David"/>
           <w:b/>
+          <w:bCs/>
           <w:sz w:val="26"/>
-          <w:rFonts w:ascii="David" w:hAnsi="David" w:cs="David"/>
           <w:szCs w:val="26"/>
-          <w:bCs/>
           <w:rtl w:val="1"/>
         </w:rPr>
         <w:t>שאלה 1 – טיישון מיטשל: מופע התנהגותי וקריאתו דרך תאוריות יחסי אובייקט</w:t>
@@ -102,12 +94,11 @@
       </w:pPr>
       <w:r>
         <w:rPr>
-          <w:rFonts w:ascii="David" w:hAnsi="David"/>
+          <w:rFonts w:ascii="David" w:hAnsi="David" w:cs="David"/>
           <w:b/>
+          <w:bCs/>
           <w:sz w:val="24"/>
-          <w:rFonts w:ascii="David" w:hAnsi="David" w:cs="David"/>
           <w:szCs w:val="24"/>
-          <w:bCs/>
           <w:rtl w:val="1"/>
         </w:rPr>
         <w:t>(הדמות שבחרתי: טיישון)</w:t>
@@ -121,22 +112,19 @@
       </w:pPr>
       <w:r>
         <w:rPr>
-          <w:rFonts w:ascii="David" w:hAnsi="David"/>
+          <w:rFonts w:ascii="David" w:hAnsi="David" w:cs="David"/>
           <w:b/>
+          <w:bCs/>
           <w:sz w:val="24"/>
-          <w:rFonts w:ascii="David" w:hAnsi="David" w:cs="David"/>
           <w:szCs w:val="24"/>
-          <w:bCs/>
           <w:rtl w:val="1"/>
         </w:rPr>
         <w:t xml:space="preserve">א. </w:t>
       </w:r>
       <w:r>
         <w:rPr>
-          <w:rFonts w:ascii="David" w:hAnsi="David"/>
-          <w:b w:val="0"/>
+          <w:rFonts w:ascii="David" w:hAnsi="David" w:cs="David"/>
           <w:sz w:val="24"/>
-          <w:rFonts w:ascii="David" w:hAnsi="David" w:cs="David"/>
           <w:szCs w:val="24"/>
           <w:rtl w:val="1"/>
         </w:rPr>
@@ -151,22 +139,19 @@
       </w:pPr>
       <w:r>
         <w:rPr>
-          <w:rFonts w:ascii="David" w:hAnsi="David"/>
+          <w:rFonts w:ascii="David" w:hAnsi="David" w:cs="David"/>
           <w:b/>
+          <w:bCs/>
           <w:sz w:val="24"/>
-          <w:rFonts w:ascii="David" w:hAnsi="David" w:cs="David"/>
           <w:szCs w:val="24"/>
-          <w:bCs/>
           <w:rtl w:val="1"/>
         </w:rPr>
         <w:t xml:space="preserve">ב. </w:t>
       </w:r>
       <w:r>
         <w:rPr>
-          <w:rFonts w:ascii="David" w:hAnsi="David"/>
-          <w:b w:val="0"/>
+          <w:rFonts w:ascii="David" w:hAnsi="David" w:cs="David"/>
           <w:sz w:val="24"/>
-          <w:rFonts w:ascii="David" w:hAnsi="David" w:cs="David"/>
           <w:szCs w:val="24"/>
           <w:rtl w:val="1"/>
         </w:rPr>
@@ -181,22 +166,19 @@
       </w:pPr>
       <w:r>
         <w:rPr>
-          <w:rFonts w:ascii="David" w:hAnsi="David"/>
+          <w:rFonts w:ascii="David" w:hAnsi="David" w:cs="David"/>
           <w:b/>
+          <w:bCs/>
           <w:sz w:val="24"/>
-          <w:rFonts w:ascii="David" w:hAnsi="David" w:cs="David"/>
           <w:szCs w:val="24"/>
-          <w:bCs/>
           <w:rtl w:val="1"/>
         </w:rPr>
         <w:t xml:space="preserve">ג. </w:t>
       </w:r>
       <w:r>
         <w:rPr>
-          <w:rFonts w:ascii="David" w:hAnsi="David"/>
-          <w:b w:val="0"/>
+          <w:rFonts w:ascii="David" w:hAnsi="David" w:cs="David"/>
           <w:sz w:val="24"/>
-          <w:rFonts w:ascii="David" w:hAnsi="David" w:cs="David"/>
           <w:szCs w:val="24"/>
           <w:rtl w:val="1"/>
         </w:rPr>
@@ -211,12 +193,11 @@
       </w:pPr>
       <w:r>
         <w:rPr>
-          <w:rFonts w:ascii="David" w:hAnsi="David"/>
+          <w:rFonts w:ascii="David" w:hAnsi="David" w:cs="David"/>
           <w:b/>
+          <w:bCs/>
           <w:sz w:val="26"/>
-          <w:rFonts w:ascii="David" w:hAnsi="David" w:cs="David"/>
           <w:szCs w:val="26"/>
-          <w:bCs/>
           <w:rtl w:val="1"/>
         </w:rPr>
         <w:t>שאלה 2 – אחזקה שלמה: holding ו-handling בקטע של “אתי, אם הבית”</w:t>
@@ -230,10 +211,8 @@
       </w:pPr>
       <w:r>
         <w:rPr>
-          <w:rFonts w:ascii="David" w:hAnsi="David"/>
-          <w:b w:val="0"/>
+          <w:rFonts w:ascii="David" w:hAnsi="David" w:cs="David"/>
           <w:sz w:val="24"/>
-          <w:rFonts w:ascii="David" w:hAnsi="David" w:cs="David"/>
           <w:szCs w:val="24"/>
           <w:rtl w:val="1"/>
         </w:rPr>
@@ -248,10 +227,8 @@
       </w:pPr>
       <w:r>
         <w:rPr>
-          <w:rFonts w:ascii="David" w:hAnsi="David"/>
-          <w:b w:val="0"/>
+          <w:rFonts w:ascii="David" w:hAnsi="David" w:cs="David"/>
           <w:sz w:val="24"/>
-          <w:rFonts w:ascii="David" w:hAnsi="David" w:cs="David"/>
           <w:szCs w:val="24"/>
           <w:rtl w:val="1"/>
         </w:rPr>
@@ -266,12 +243,11 @@
       </w:pPr>
       <w:r>
         <w:rPr>
-          <w:rFonts w:ascii="David" w:hAnsi="David"/>
+          <w:rFonts w:ascii="David" w:hAnsi="David" w:cs="David"/>
           <w:b/>
+          <w:bCs/>
           <w:sz w:val="26"/>
-          <w:rFonts w:ascii="David" w:hAnsi="David" w:cs="David"/>
           <w:szCs w:val="26"/>
-          <w:bCs/>
           <w:rtl w:val="1"/>
         </w:rPr>
         <w:t>שאלה 3 – דמות איש הצוות: רון קלארק</w:t>
@@ -285,22 +261,19 @@
       </w:pPr>
       <w:r>
         <w:rPr>
-          <w:rFonts w:ascii="David" w:hAnsi="David"/>
+          <w:rFonts w:ascii="David" w:hAnsi="David" w:cs="David"/>
           <w:b/>
+          <w:bCs/>
           <w:sz w:val="24"/>
-          <w:rFonts w:ascii="David" w:hAnsi="David" w:cs="David"/>
           <w:szCs w:val="24"/>
-          <w:bCs/>
           <w:rtl w:val="1"/>
         </w:rPr>
         <w:t xml:space="preserve">א. </w:t>
       </w:r>
       <w:r>
         <w:rPr>
-          <w:rFonts w:ascii="David" w:hAnsi="David"/>
-          <w:b w:val="0"/>
+          <w:rFonts w:ascii="David" w:hAnsi="David" w:cs="David"/>
           <w:sz w:val="24"/>
-          <w:rFonts w:ascii="David" w:hAnsi="David" w:cs="David"/>
           <w:szCs w:val="24"/>
           <w:rtl w:val="1"/>
         </w:rPr>
@@ -315,22 +288,19 @@
       </w:pPr>
       <w:r>
         <w:rPr>
-          <w:rFonts w:ascii="David" w:hAnsi="David"/>
+          <w:rFonts w:ascii="David" w:hAnsi="David" w:cs="David"/>
           <w:b/>
+          <w:bCs/>
           <w:sz w:val="24"/>
-          <w:rFonts w:ascii="David" w:hAnsi="David" w:cs="David"/>
           <w:szCs w:val="24"/>
-          <w:bCs/>
           <w:rtl w:val="1"/>
         </w:rPr>
         <w:t xml:space="preserve">ב. </w:t>
       </w:r>
       <w:r>
         <w:rPr>
-          <w:rFonts w:ascii="David" w:hAnsi="David"/>
-          <w:b w:val="0"/>
+          <w:rFonts w:ascii="David" w:hAnsi="David" w:cs="David"/>
           <w:sz w:val="24"/>
-          <w:rFonts w:ascii="David" w:hAnsi="David" w:cs="David"/>
           <w:szCs w:val="24"/>
           <w:rtl w:val="1"/>
         </w:rPr>
@@ -345,22 +315,19 @@
       </w:pPr>
       <w:r>
         <w:rPr>
-          <w:rFonts w:ascii="David" w:hAnsi="David"/>
+          <w:rFonts w:ascii="David" w:hAnsi="David" w:cs="David"/>
           <w:b/>
+          <w:bCs/>
           <w:sz w:val="24"/>
-          <w:rFonts w:ascii="David" w:hAnsi="David" w:cs="David"/>
           <w:szCs w:val="24"/>
-          <w:bCs/>
           <w:rtl w:val="1"/>
         </w:rPr>
         <w:t xml:space="preserve">מאפיין ראשון – היכולת ליציבות, בין עמידה לתנועה. </w:t>
       </w:r>
       <w:r>
         <w:rPr>
-          <w:rFonts w:ascii="David" w:hAnsi="David"/>
-          <w:b w:val="0"/>
+          <w:rFonts w:ascii="David" w:hAnsi="David" w:cs="David"/>
           <w:sz w:val="24"/>
-          <w:rFonts w:ascii="David" w:hAnsi="David" w:cs="David"/>
           <w:szCs w:val="24"/>
           <w:rtl w:val="1"/>
         </w:rPr>
@@ -375,22 +342,19 @@
       </w:pPr>
       <w:r>
         <w:rPr>
-          <w:rFonts w:ascii="David" w:hAnsi="David"/>
+          <w:rFonts w:ascii="David" w:hAnsi="David" w:cs="David"/>
           <w:b/>
+          <w:bCs/>
           <w:sz w:val="24"/>
-          <w:rFonts w:ascii="David" w:hAnsi="David" w:cs="David"/>
           <w:szCs w:val="24"/>
-          <w:bCs/>
           <w:rtl w:val="1"/>
         </w:rPr>
         <w:t xml:space="preserve">מאפיין שני – היכולת להיות משמעותי ולשאת תלות. </w:t>
       </w:r>
       <w:r>
         <w:rPr>
-          <w:rFonts w:ascii="David" w:hAnsi="David"/>
-          <w:b w:val="0"/>
+          <w:rFonts w:ascii="David" w:hAnsi="David" w:cs="David"/>
           <w:sz w:val="24"/>
-          <w:rFonts w:ascii="David" w:hAnsi="David" w:cs="David"/>
           <w:szCs w:val="24"/>
           <w:rtl w:val="1"/>
         </w:rPr>
@@ -405,22 +369,19 @@
       </w:pPr>
       <w:r>
         <w:rPr>
-          <w:rFonts w:ascii="David" w:hAnsi="David"/>
+          <w:rFonts w:ascii="David" w:hAnsi="David" w:cs="David"/>
           <w:b/>
+          <w:bCs/>
           <w:sz w:val="24"/>
-          <w:rFonts w:ascii="David" w:hAnsi="David" w:cs="David"/>
           <w:szCs w:val="24"/>
-          <w:bCs/>
           <w:rtl w:val="1"/>
         </w:rPr>
         <w:t xml:space="preserve">מאפיין שלישי – היכולת להתמסר, הבחירה להעניק. </w:t>
       </w:r>
       <w:r>
         <w:rPr>
-          <w:rFonts w:ascii="David" w:hAnsi="David"/>
-          <w:b w:val="0"/>
+          <w:rFonts w:ascii="David" w:hAnsi="David" w:cs="David"/>
           <w:sz w:val="24"/>
-          <w:rFonts w:ascii="David" w:hAnsi="David" w:cs="David"/>
           <w:szCs w:val="24"/>
           <w:rtl w:val="1"/>
         </w:rPr>
@@ -435,22 +396,19 @@
       </w:pPr>
       <w:r>
         <w:rPr>
-          <w:rFonts w:ascii="David" w:hAnsi="David"/>
+          <w:rFonts w:ascii="David" w:hAnsi="David" w:cs="David"/>
           <w:b/>
+          <w:bCs/>
           <w:sz w:val="24"/>
-          <w:rFonts w:ascii="David" w:hAnsi="David" w:cs="David"/>
           <w:szCs w:val="24"/>
-          <w:bCs/>
           <w:rtl w:val="1"/>
         </w:rPr>
         <w:t xml:space="preserve">ג. ומה אתי? (רפלקציה אישית). </w:t>
       </w:r>
       <w:r>
         <w:rPr>
-          <w:rFonts w:ascii="David" w:hAnsi="David"/>
-          <w:b w:val="0"/>
+          <w:rFonts w:ascii="David" w:hAnsi="David" w:cs="David"/>
           <w:sz w:val="24"/>
-          <w:rFonts w:ascii="David" w:hAnsi="David" w:cs="David"/>
           <w:szCs w:val="24"/>
           <w:rtl w:val="1"/>
         </w:rPr>
@@ -465,12 +423,11 @@
       </w:pPr>
       <w:r>
         <w:rPr>
-          <w:rFonts w:ascii="David" w:hAnsi="David"/>
+          <w:rFonts w:ascii="David" w:hAnsi="David" w:cs="David"/>
           <w:b/>
+          <w:bCs/>
           <w:sz w:val="26"/>
-          <w:rFonts w:ascii="David" w:hAnsi="David" w:cs="David"/>
           <w:szCs w:val="26"/>
-          <w:bCs/>
           <w:rtl w:val="1"/>
         </w:rPr>
         <w:t>שאלה 4 – שאלת רפלקציה</w:t>
@@ -484,12 +441,11 @@
       </w:pPr>
       <w:r>
         <w:rPr>
-          <w:rFonts w:ascii="David" w:hAnsi="David"/>
+          <w:rFonts w:ascii="David" w:hAnsi="David" w:cs="David"/>
           <w:b/>
+          <w:bCs/>
           <w:sz w:val="22"/>
-          <w:rFonts w:ascii="David" w:hAnsi="David" w:cs="David"/>
           <w:szCs w:val="22"/>
-          <w:bCs/>
           <w:rtl w:val="1"/>
         </w:rPr>
         <w:t>[חלק זה יש להתאים אישית] בעקבות שלוש השאלות של אתי אברמוביץ, מה שהפתיע אותי, נגע לליבי והשפיע עליי במהלך הקורס.</w:t>
@@ -503,34 +459,30 @@
       </w:pPr>
       <w:r>
         <w:rPr>
-          <w:rFonts w:ascii="David" w:hAnsi="David"/>
+          <w:rFonts w:ascii="David" w:hAnsi="David" w:cs="David"/>
           <w:b/>
+          <w:bCs/>
           <w:sz w:val="24"/>
-          <w:rFonts w:ascii="David" w:hAnsi="David" w:cs="David"/>
           <w:szCs w:val="24"/>
-          <w:bCs/>
           <w:rtl w:val="1"/>
         </w:rPr>
         <w:t xml:space="preserve">א. </w:t>
       </w:r>
       <w:r>
         <w:rPr>
-          <w:rFonts w:ascii="David" w:hAnsi="David"/>
+          <w:rFonts w:ascii="David" w:hAnsi="David" w:cs="David"/>
           <w:b/>
+          <w:bCs/>
           <w:sz w:val="24"/>
-          <w:rFonts w:ascii="David" w:hAnsi="David" w:cs="David"/>
           <w:szCs w:val="24"/>
-          <w:bCs/>
           <w:rtl w:val="1"/>
         </w:rPr>
         <w:t xml:space="preserve">מה שחידש לי. </w:t>
       </w:r>
       <w:r>
         <w:rPr>
-          <w:rFonts w:ascii="David" w:hAnsi="David"/>
-          <w:b w:val="0"/>
+          <w:rFonts w:ascii="David" w:hAnsi="David" w:cs="David"/>
           <w:sz w:val="24"/>
-          <w:rFonts w:ascii="David" w:hAnsi="David" w:cs="David"/>
           <w:szCs w:val="24"/>
           <w:rtl w:val="1"/>
         </w:rPr>
@@ -545,34 +497,30 @@
       </w:pPr>
       <w:r>
         <w:rPr>
-          <w:rFonts w:ascii="David" w:hAnsi="David"/>
+          <w:rFonts w:ascii="David" w:hAnsi="David" w:cs="David"/>
           <w:b/>
+          <w:bCs/>
           <w:sz w:val="24"/>
-          <w:rFonts w:ascii="David" w:hAnsi="David" w:cs="David"/>
           <w:szCs w:val="24"/>
-          <w:bCs/>
           <w:rtl w:val="1"/>
         </w:rPr>
         <w:t xml:space="preserve">ב. </w:t>
       </w:r>
       <w:r>
         <w:rPr>
-          <w:rFonts w:ascii="David" w:hAnsi="David"/>
+          <w:rFonts w:ascii="David" w:hAnsi="David" w:cs="David"/>
           <w:b/>
+          <w:bCs/>
           <w:sz w:val="24"/>
-          <w:rFonts w:ascii="David" w:hAnsi="David" w:cs="David"/>
           <w:szCs w:val="24"/>
-          <w:bCs/>
           <w:rtl w:val="1"/>
         </w:rPr>
         <w:t xml:space="preserve">הקשר בין התיאוריה לפרקטיקה. </w:t>
       </w:r>
       <w:r>
         <w:rPr>
-          <w:rFonts w:ascii="David" w:hAnsi="David"/>
-          <w:b w:val="0"/>
+          <w:rFonts w:ascii="David" w:hAnsi="David" w:cs="David"/>
           <w:sz w:val="24"/>
-          <w:rFonts w:ascii="David" w:hAnsi="David" w:cs="David"/>
           <w:szCs w:val="24"/>
           <w:rtl w:val="1"/>
         </w:rPr>
@@ -587,34 +535,30 @@
       </w:pPr>
       <w:r>
         <w:rPr>
-          <w:rFonts w:ascii="David" w:hAnsi="David"/>
+          <w:rFonts w:ascii="David" w:hAnsi="David" w:cs="David"/>
           <w:b/>
+          <w:bCs/>
           <w:sz w:val="24"/>
-          <w:rFonts w:ascii="David" w:hAnsi="David" w:cs="David"/>
           <w:szCs w:val="24"/>
-          <w:bCs/>
           <w:rtl w:val="1"/>
         </w:rPr>
         <w:t xml:space="preserve">ג. </w:t>
       </w:r>
       <w:r>
         <w:rPr>
-          <w:rFonts w:ascii="David" w:hAnsi="David"/>
+          <w:rFonts w:ascii="David" w:hAnsi="David" w:cs="David"/>
           <w:b/>
+          <w:bCs/>
           <w:sz w:val="24"/>
-          <w:rFonts w:ascii="David" w:hAnsi="David" w:cs="David"/>
           <w:szCs w:val="24"/>
-          <w:bCs/>
           <w:rtl w:val="1"/>
         </w:rPr>
         <w:t xml:space="preserve">מה שהיה חסר. </w:t>
       </w:r>
       <w:r>
         <w:rPr>
-          <w:rFonts w:ascii="David" w:hAnsi="David"/>
-          <w:b w:val="0"/>
+          <w:rFonts w:ascii="David" w:hAnsi="David" w:cs="David"/>
           <w:sz w:val="24"/>
-          <w:rFonts w:ascii="David" w:hAnsi="David" w:cs="David"/>
           <w:szCs w:val="24"/>
           <w:rtl w:val="1"/>
         </w:rPr>
@@ -629,34 +573,30 @@
       </w:pPr>
       <w:r>
         <w:rPr>
-          <w:rFonts w:ascii="David" w:hAnsi="David"/>
+          <w:rFonts w:ascii="David" w:hAnsi="David" w:cs="David"/>
           <w:b/>
+          <w:bCs/>
           <w:sz w:val="24"/>
-          <w:rFonts w:ascii="David" w:hAnsi="David" w:cs="David"/>
           <w:szCs w:val="24"/>
-          <w:bCs/>
           <w:rtl w:val="1"/>
         </w:rPr>
         <w:t xml:space="preserve">ד. </w:t>
       </w:r>
       <w:r>
         <w:rPr>
-          <w:rFonts w:ascii="David" w:hAnsi="David"/>
+          <w:rFonts w:ascii="David" w:hAnsi="David" w:cs="David"/>
           <w:b/>
+          <w:bCs/>
           <w:sz w:val="24"/>
-          <w:rFonts w:ascii="David" w:hAnsi="David" w:cs="David"/>
           <w:szCs w:val="24"/>
-          <w:bCs/>
           <w:rtl w:val="1"/>
         </w:rPr>
         <w:t xml:space="preserve">הערה לסיום. </w:t>
       </w:r>
       <w:r>
         <w:rPr>
-          <w:rFonts w:ascii="David" w:hAnsi="David"/>
-          <w:b w:val="0"/>
+          <w:rFonts w:ascii="David" w:hAnsi="David" w:cs="David"/>
           <w:sz w:val="24"/>
-          <w:rFonts w:ascii="David" w:hAnsi="David" w:cs="David"/>
           <w:szCs w:val="24"/>
           <w:rtl w:val="1"/>
         </w:rPr>
@@ -671,12 +611,11 @@
       </w:pPr>
       <w:r>
         <w:rPr>
-          <w:rFonts w:ascii="David" w:hAnsi="David"/>
+          <w:rFonts w:ascii="David" w:hAnsi="David" w:cs="David"/>
           <w:b/>
+          <w:bCs/>
           <w:sz w:val="26"/>
-          <w:rFonts w:ascii="David" w:hAnsi="David" w:cs="David"/>
           <w:szCs w:val="26"/>
-          <w:bCs/>
           <w:rtl w:val="1"/>
         </w:rPr>
         <w:t>רשימת מקורות</w:t>
@@ -690,10 +629,8 @@
       </w:pPr>
       <w:r>
         <w:rPr>
-          <w:rFonts w:ascii="David" w:hAnsi="David"/>
-          <w:b w:val="0"/>
+          <w:rFonts w:ascii="David" w:hAnsi="David" w:cs="David"/>
           <w:sz w:val="22"/>
-          <w:rFonts w:ascii="David" w:hAnsi="David" w:cs="David"/>
           <w:szCs w:val="22"/>
           <w:rtl w:val="1"/>
         </w:rPr>
@@ -708,10 +645,8 @@
       </w:pPr>
       <w:r>
         <w:rPr>
-          <w:rFonts w:ascii="David" w:hAnsi="David"/>
-          <w:b w:val="0"/>
+          <w:rFonts w:ascii="David" w:hAnsi="David" w:cs="David"/>
           <w:sz w:val="22"/>
-          <w:rFonts w:ascii="David" w:hAnsi="David" w:cs="David"/>
           <w:szCs w:val="22"/>
           <w:rtl w:val="1"/>
         </w:rPr>
@@ -726,10 +661,8 @@
       </w:pPr>
       <w:r>
         <w:rPr>
-          <w:rFonts w:ascii="David" w:hAnsi="David"/>
-          <w:b w:val="0"/>
+          <w:rFonts w:ascii="David" w:hAnsi="David" w:cs="David"/>
           <w:sz w:val="22"/>
-          <w:rFonts w:ascii="David" w:hAnsi="David" w:cs="David"/>
           <w:szCs w:val="22"/>
           <w:rtl w:val="1"/>
         </w:rPr>
@@ -744,10 +677,8 @@
       </w:pPr>
       <w:r>
         <w:rPr>
-          <w:rFonts w:ascii="David" w:hAnsi="David"/>
-          <w:b w:val="0"/>
+          <w:rFonts w:ascii="David" w:hAnsi="David" w:cs="David"/>
           <w:sz w:val="22"/>
-          <w:rFonts w:ascii="David" w:hAnsi="David" w:cs="David"/>
           <w:szCs w:val="22"/>
           <w:rtl w:val="1"/>
         </w:rPr>
@@ -762,10 +693,8 @@
       </w:pPr>
       <w:r>
         <w:rPr>
-          <w:rFonts w:ascii="David" w:hAnsi="David"/>
-          <w:b w:val="0"/>
+          <w:rFonts w:ascii="David" w:hAnsi="David" w:cs="David"/>
           <w:sz w:val="22"/>
-          <w:rFonts w:ascii="David" w:hAnsi="David" w:cs="David"/>
           <w:szCs w:val="22"/>
           <w:rtl w:val="1"/>
         </w:rPr>
@@ -785,12 +714,11 @@
       </w:pPr>
       <w:r>
         <w:rPr>
-          <w:rFonts w:ascii="David" w:hAnsi="David"/>
+          <w:rFonts w:ascii="David" w:hAnsi="David" w:cs="David"/>
           <w:b/>
+          <w:bCs/>
           <w:sz w:val="26"/>
-          <w:rFonts w:ascii="David" w:hAnsi="David" w:cs="David"/>
           <w:szCs w:val="26"/>
-          <w:bCs/>
           <w:rtl w:val="1"/>
         </w:rPr>
         <w:t>נספח לשאלה 2 – סימון handling ו-holding בקטע “אתי, אם הבית” (עמ′ 91–94)</w:t>
@@ -804,34 +732,29 @@
       </w:pPr>
       <w:r>
         <w:rPr>
-          <w:rFonts w:ascii="David" w:hAnsi="David"/>
+          <w:rFonts w:ascii="David" w:hAnsi="David" w:cs="David"/>
           <w:b/>
+          <w:bCs/>
           <w:sz w:val="24"/>
-          <w:rFonts w:ascii="David" w:hAnsi="David" w:cs="David"/>
           <w:szCs w:val="24"/>
-          <w:bCs/>
           <w:rtl w:val="1"/>
         </w:rPr>
         <w:t xml:space="preserve">מקרא:  </w:t>
       </w:r>
       <w:r>
         <w:rPr>
-          <w:rFonts w:ascii="David" w:hAnsi="David"/>
-          <w:b w:val="0"/>
+          <w:rFonts w:ascii="David" w:hAnsi="David" w:cs="David"/>
           <w:sz w:val="24"/>
-          <w:rFonts w:ascii="David" w:hAnsi="David" w:cs="David"/>
           <w:szCs w:val="24"/>
+          <w:highlight w:val="cyan"/>
           <w:rtl w:val="1"/>
-          <w:highlight w:val="cyan"/>
         </w:rPr>
         <w:t xml:space="preserve"> handling (ניהול פיזי / מציאות) </w:t>
       </w:r>
       <w:r>
         <w:rPr>
-          <w:rFonts w:ascii="David" w:hAnsi="David"/>
-          <w:b w:val="0"/>
+          <w:rFonts w:ascii="David" w:hAnsi="David" w:cs="David"/>
           <w:sz w:val="24"/>
-          <w:rFonts w:ascii="David" w:hAnsi="David" w:cs="David"/>
           <w:szCs w:val="24"/>
           <w:rtl w:val="1"/>
         </w:rPr>
@@ -839,13 +762,11 @@
       </w:r>
       <w:r>
         <w:rPr>
-          <w:rFonts w:ascii="David" w:hAnsi="David"/>
-          <w:b w:val="0"/>
+          <w:rFonts w:ascii="David" w:hAnsi="David" w:cs="David"/>
           <w:sz w:val="24"/>
-          <w:rFonts w:ascii="David" w:hAnsi="David" w:cs="David"/>
           <w:szCs w:val="24"/>
+          <w:highlight w:val="yellow"/>
           <w:rtl w:val="1"/>
-          <w:highlight w:val="yellow"/>
         </w:rPr>
         <w:t xml:space="preserve"> holding (החזקה רגשית / משמעות) </w:t>
       </w:r>
@@ -858,10 +779,8 @@
       </w:pPr>
       <w:r>
         <w:rPr>
-          <w:rFonts w:ascii="David" w:hAnsi="David"/>
-          <w:b w:val="0"/>
+          <w:rFonts w:ascii="David" w:hAnsi="David" w:cs="David"/>
           <w:sz w:val="24"/>
-          <w:rFonts w:ascii="David" w:hAnsi="David" w:cs="David"/>
           <w:szCs w:val="24"/>
           <w:rtl w:val="1"/>
         </w:rPr>
@@ -869,34 +788,28 @@
       </w:r>
       <w:r>
         <w:rPr>
-          <w:rFonts w:ascii="David" w:hAnsi="David"/>
-          <w:b w:val="0"/>
+          <w:rFonts w:ascii="David" w:hAnsi="David" w:cs="David"/>
           <w:sz w:val="24"/>
-          <w:rFonts w:ascii="David" w:hAnsi="David" w:cs="David"/>
           <w:szCs w:val="24"/>
+          <w:highlight w:val="cyan"/>
           <w:rtl w:val="1"/>
-          <w:highlight w:val="cyan"/>
         </w:rPr>
         <w:t>יש לדאוג לכל ההתארגנות לקראת החורף. חשבתי איזה בגדים יש לכל אחת מהן, ולמי חסר מעיל. נדמה שהשנה כולן גדלו כל כך, וצריך יהיה לרכוש לרובן בגדים חדשים.</w:t>
       </w:r>
       <w:r>
         <w:rPr>
-          <w:rFonts w:ascii="David" w:hAnsi="David"/>
-          <w:b w:val="0"/>
+          <w:rFonts w:ascii="David" w:hAnsi="David" w:cs="David"/>
           <w:sz w:val="24"/>
-          <w:rFonts w:ascii="David" w:hAnsi="David" w:cs="David"/>
           <w:szCs w:val="24"/>
+          <w:highlight w:val="yellow"/>
           <w:rtl w:val="1"/>
-          <w:highlight w:val="yellow"/>
         </w:rPr>
         <w:t xml:space="preserve"> אמנם יש את אלה שנותרו מיניאטוריות, בעיקר בת-אל, שמטרידה אותי.</w:t>
       </w:r>
       <w:r>
         <w:rPr>
-          <w:rFonts w:ascii="David" w:hAnsi="David"/>
-          <w:b w:val="0"/>
+          <w:rFonts w:ascii="David" w:hAnsi="David" w:cs="David"/>
           <w:sz w:val="24"/>
-          <w:rFonts w:ascii="David" w:hAnsi="David" w:cs="David"/>
           <w:szCs w:val="24"/>
           <w:rtl w:val="1"/>
         </w:rPr>
@@ -904,82 +817,68 @@
       </w:r>
       <w:r>
         <w:rPr>
-          <w:rFonts w:ascii="David" w:hAnsi="David"/>
-          <w:b w:val="0"/>
+          <w:rFonts w:ascii="David" w:hAnsi="David" w:cs="David"/>
           <w:sz w:val="24"/>
-          <w:rFonts w:ascii="David" w:hAnsi="David" w:cs="David"/>
           <w:szCs w:val="24"/>
+          <w:highlight w:val="cyan"/>
           <w:rtl w:val="1"/>
-          <w:highlight w:val="cyan"/>
         </w:rPr>
         <w:t>צריך להמשיך לעקוב אחר המשקל והגובה. אדווח על כך למדריכים.</w:t>
       </w:r>
       <w:r>
         <w:rPr>
-          <w:rFonts w:ascii="David" w:hAnsi="David"/>
-          <w:b w:val="0"/>
+          <w:rFonts w:ascii="David" w:hAnsi="David" w:cs="David"/>
           <w:sz w:val="24"/>
-          <w:rFonts w:ascii="David" w:hAnsi="David" w:cs="David"/>
           <w:szCs w:val="24"/>
+          <w:highlight w:val="yellow"/>
           <w:rtl w:val="1"/>
-          <w:highlight w:val="yellow"/>
         </w:rPr>
         <w:t xml:space="preserve"> בתוך ים המחשבות, בעודי מוציאה את קלסר ה“תזונה”, אני חשה בתסכול שעולה בי ומציף אותי.</w:t>
       </w:r>
       <w:r>
         <w:rPr>
-          <w:rFonts w:ascii="David" w:hAnsi="David"/>
-          <w:b w:val="0"/>
+          <w:rFonts w:ascii="David" w:hAnsi="David" w:cs="David"/>
           <w:sz w:val="24"/>
-          <w:rFonts w:ascii="David" w:hAnsi="David" w:cs="David"/>
           <w:szCs w:val="24"/>
+          <w:highlight w:val="cyan"/>
           <w:rtl w:val="1"/>
-          <w:highlight w:val="cyan"/>
         </w:rPr>
         <w:t xml:space="preserve"> מה עוד אפשר לעשות בעניין האכילה?</w:t>
       </w:r>
       <w:r>
         <w:rPr>
-          <w:rFonts w:ascii="David" w:hAnsi="David"/>
-          <w:b w:val="0"/>
+          <w:rFonts w:ascii="David" w:hAnsi="David" w:cs="David"/>
           <w:sz w:val="24"/>
-          <w:rFonts w:ascii="David" w:hAnsi="David" w:cs="David"/>
           <w:szCs w:val="24"/>
+          <w:highlight w:val="yellow"/>
           <w:rtl w:val="1"/>
-          <w:highlight w:val="yellow"/>
         </w:rPr>
         <w:t xml:space="preserve"> למדתי שדרך האוכל והאכילה הבנות מספרות לנו הרבה על עצמן, אבל לפעמים אני מעדיפה שיספרו פחות. </w:t>
       </w:r>
       <w:r>
         <w:rPr>
-          <w:rFonts w:ascii="David" w:hAnsi="David"/>
-          <w:b w:val="0"/>
+          <w:rFonts w:ascii="David" w:hAnsi="David" w:cs="David"/>
           <w:sz w:val="24"/>
-          <w:rFonts w:ascii="David" w:hAnsi="David" w:cs="David"/>
           <w:szCs w:val="24"/>
+          <w:highlight w:val="yellow"/>
           <w:rtl w:val="1"/>
-          <w:highlight w:val="yellow"/>
         </w:rPr>
         <w:t xml:space="preserve">אתמול הרגשתי כאילו חלום מתגשם. נטלי, שבמשך שנה אכלה בצורה שדוחה את הבנות שלידה, </w:t>
       </w:r>
       <w:r>
         <w:rPr>
-          <w:rFonts w:ascii="David" w:hAnsi="David"/>
-          <w:b w:val="0"/>
+          <w:rFonts w:ascii="David" w:hAnsi="David" w:cs="David"/>
           <w:sz w:val="24"/>
-          <w:rFonts w:ascii="David" w:hAnsi="David" w:cs="David"/>
           <w:szCs w:val="24"/>
+          <w:highlight w:val="cyan"/>
           <w:rtl w:val="1"/>
-          <w:highlight w:val="cyan"/>
         </w:rPr>
         <w:t>יושבת עכשיו אל השולחן בצורה מאורגנת, והאוכל נשאר בצלחת ולא נמרח לכל עבר. היא אפילו השתדלה להישאר נקייה, ובסיום הארוחה לא היה בהול להזדרז אל הכיור כדי לשטוף פנים וידיים.</w:t>
       </w:r>
       <w:r>
         <w:rPr>
-          <w:rFonts w:ascii="David" w:hAnsi="David"/>
-          <w:b w:val="0"/>
+          <w:rFonts w:ascii="David" w:hAnsi="David" w:cs="David"/>
           <w:sz w:val="24"/>
-          <w:rFonts w:ascii="David" w:hAnsi="David" w:cs="David"/>
           <w:szCs w:val="24"/>
           <w:rtl w:val="1"/>
         </w:rPr>
@@ -987,22 +886,18 @@
       </w:r>
       <w:r>
         <w:rPr>
-          <w:rFonts w:ascii="David" w:hAnsi="David"/>
-          <w:b w:val="0"/>
+          <w:rFonts w:ascii="David" w:hAnsi="David" w:cs="David"/>
           <w:sz w:val="24"/>
-          <w:rFonts w:ascii="David" w:hAnsi="David" w:cs="David"/>
           <w:szCs w:val="24"/>
+          <w:highlight w:val="yellow"/>
           <w:rtl w:val="1"/>
-          <w:highlight w:val="yellow"/>
         </w:rPr>
         <w:t>ברגעים כאלה תמיד עולה בי שוב ושוב השאלה: מהיכן העוצמות ההרסניות האלה? למה להרוס ולנתץ? הרי אחר כך הן מצטערות כל כך.</w:t>
       </w:r>
       <w:r>
         <w:rPr>
-          <w:rFonts w:ascii="David" w:hAnsi="David"/>
-          <w:b w:val="0"/>
+          <w:rFonts w:ascii="David" w:hAnsi="David" w:cs="David"/>
           <w:sz w:val="24"/>
-          <w:rFonts w:ascii="David" w:hAnsi="David" w:cs="David"/>
           <w:szCs w:val="24"/>
           <w:rtl w:val="1"/>
         </w:rPr>
@@ -1010,34 +905,28 @@
       </w:r>
       <w:r>
         <w:rPr>
-          <w:rFonts w:ascii="David" w:hAnsi="David"/>
-          <w:b w:val="0"/>
+          <w:rFonts w:ascii="David" w:hAnsi="David" w:cs="David"/>
           <w:sz w:val="24"/>
-          <w:rFonts w:ascii="David" w:hAnsi="David" w:cs="David"/>
           <w:szCs w:val="24"/>
+          <w:highlight w:val="yellow"/>
           <w:rtl w:val="1"/>
-          <w:highlight w:val="yellow"/>
         </w:rPr>
         <w:t>אני חושבת שליאת חסרת שקט מאז החופשה האחרונה, ונראה לי שלא כדאי שתצא בפעם הבאה. הבנות החדשות עדיין לא מרגישות שהמקום הזה שייך להן.</w:t>
       </w:r>
       <w:r>
         <w:rPr>
-          <w:rFonts w:ascii="David" w:hAnsi="David"/>
-          <w:b w:val="0"/>
+          <w:rFonts w:ascii="David" w:hAnsi="David" w:cs="David"/>
           <w:sz w:val="24"/>
-          <w:rFonts w:ascii="David" w:hAnsi="David" w:cs="David"/>
           <w:szCs w:val="24"/>
+          <w:highlight w:val="yellow"/>
           <w:rtl w:val="1"/>
-          <w:highlight w:val="yellow"/>
         </w:rPr>
         <w:t xml:space="preserve"> האמת היא שאני לא יודעת אם הייתי שורדת כאן אם לא הייתי רואה את ההתקדמות של הבוגרות, איך המקום חשוב להן ואיך הן שומרות עליו. אני חוזרת לידיעה הזאת כדי לקבל כוחות ואופטימיות.</w:t>
       </w:r>
       <w:r>
         <w:rPr>
-          <w:rFonts w:ascii="David" w:hAnsi="David"/>
-          <w:b w:val="0"/>
+          <w:rFonts w:ascii="David" w:hAnsi="David" w:cs="David"/>
           <w:sz w:val="24"/>
-          <w:rFonts w:ascii="David" w:hAnsi="David" w:cs="David"/>
           <w:szCs w:val="24"/>
           <w:rtl w:val="1"/>
         </w:rPr>
@@ -1045,46 +934,38 @@
       </w:r>
       <w:r>
         <w:rPr>
-          <w:rFonts w:ascii="David" w:hAnsi="David"/>
-          <w:b w:val="0"/>
+          <w:rFonts w:ascii="David" w:hAnsi="David" w:cs="David"/>
           <w:sz w:val="24"/>
-          <w:rFonts w:ascii="David" w:hAnsi="David" w:cs="David"/>
           <w:szCs w:val="24"/>
+          <w:highlight w:val="cyan"/>
           <w:rtl w:val="1"/>
-          <w:highlight w:val="cyan"/>
         </w:rPr>
         <w:t>לאחת אני מדמיינת חלוק לבן, לרגע מודדת חום בכף ידי, לשנייה בודקת גרון, לשלישית מעסה את כף היד, ולכולן מבטיחה תה בסיום הארוחה.</w:t>
       </w:r>
       <w:r>
         <w:rPr>
-          <w:rFonts w:ascii="David" w:hAnsi="David"/>
-          <w:b w:val="0"/>
+          <w:rFonts w:ascii="David" w:hAnsi="David" w:cs="David"/>
           <w:sz w:val="24"/>
-          <w:rFonts w:ascii="David" w:hAnsi="David" w:cs="David"/>
           <w:szCs w:val="24"/>
+          <w:highlight w:val="yellow"/>
           <w:rtl w:val="1"/>
-          <w:highlight w:val="yellow"/>
         </w:rPr>
         <w:t xml:space="preserve"> הן יודעות שאני יודעת, ובכל זאת. נחמד לדעת שאני לא מפספסת את אלה שבאמת חולות.</w:t>
       </w:r>
       <w:r>
         <w:rPr>
-          <w:rFonts w:ascii="David" w:hAnsi="David"/>
-          <w:b w:val="0"/>
+          <w:rFonts w:ascii="David" w:hAnsi="David" w:cs="David"/>
           <w:sz w:val="24"/>
-          <w:rFonts w:ascii="David" w:hAnsi="David" w:cs="David"/>
           <w:szCs w:val="24"/>
+          <w:highlight w:val="yellow"/>
           <w:rtl w:val="1"/>
-          <w:highlight w:val="yellow"/>
         </w:rPr>
         <w:t xml:space="preserve"> אתמול חשבתי: למה דווקא לתפקיד שלי החליטו לקרוא ′אם בית′? זכיתי בתואר ′אם′ וגם ′בית′, ורק בשם התפקיד נמצא כל כך הרבה ממה שרוצים אותו הכי-הכי.</w:t>
       </w:r>
       <w:r>
         <w:rPr>
-          <w:rFonts w:ascii="David" w:hAnsi="David"/>
-          <w:b w:val="0"/>
+          <w:rFonts w:ascii="David" w:hAnsi="David" w:cs="David"/>
           <w:sz w:val="24"/>
-          <w:rFonts w:ascii="David" w:hAnsi="David" w:cs="David"/>
           <w:szCs w:val="24"/>
           <w:rtl w:val="1"/>
         </w:rPr>
@@ -1092,58 +973,48 @@
       </w:r>
       <w:r>
         <w:rPr>
-          <w:rFonts w:ascii="David" w:hAnsi="David"/>
-          <w:b w:val="0"/>
+          <w:rFonts w:ascii="David" w:hAnsi="David" w:cs="David"/>
           <w:sz w:val="24"/>
-          <w:rFonts w:ascii="David" w:hAnsi="David" w:cs="David"/>
           <w:szCs w:val="24"/>
+          <w:highlight w:val="cyan"/>
           <w:rtl w:val="1"/>
-          <w:highlight w:val="cyan"/>
         </w:rPr>
         <w:t>כשמתאמצים שתהיה ארוחת ערב טעימה, רק כדי שכמה בנות יפרקו אותה ולא יאפשרו ליהנות מהפיצה ומהמרק שהושקע בהם עמל,</w:t>
       </w:r>
       <w:r>
         <w:rPr>
-          <w:rFonts w:ascii="David" w:hAnsi="David"/>
-          <w:b w:val="0"/>
+          <w:rFonts w:ascii="David" w:hAnsi="David" w:cs="David"/>
           <w:sz w:val="24"/>
-          <w:rFonts w:ascii="David" w:hAnsi="David" w:cs="David"/>
           <w:szCs w:val="24"/>
+          <w:highlight w:val="yellow"/>
           <w:rtl w:val="1"/>
-          <w:highlight w:val="yellow"/>
         </w:rPr>
         <w:t xml:space="preserve"> שם קשה לי להיות האמא של הבית. כמו כל אמא, אני רוצה שהן יצליחו וישמחו, והן כל כך נלחמות בזה. יש פעמים שאני נושמת עמוק לפני שאני נכנסת, מגייסת מתוכי את כל הקולות והצבעים של אמא ובית, מביאה אותם איתי פנימה. איזה קסם זה עושה לפעמים.</w:t>
       </w:r>
       <w:r>
         <w:rPr>
-          <w:rFonts w:ascii="David" w:hAnsi="David"/>
-          <w:b w:val="0"/>
+          <w:rFonts w:ascii="David" w:hAnsi="David" w:cs="David"/>
           <w:sz w:val="24"/>
-          <w:rFonts w:ascii="David" w:hAnsi="David" w:cs="David"/>
           <w:szCs w:val="24"/>
+          <w:highlight w:val="yellow"/>
           <w:rtl w:val="1"/>
-          <w:highlight w:val="yellow"/>
         </w:rPr>
         <w:t xml:space="preserve"> במטלות השגרתיות אין את תחושת הקסם, אבל בלעדיהן אי אפשר לטפל.</w:t>
       </w:r>
       <w:r>
         <w:rPr>
-          <w:rFonts w:ascii="David" w:hAnsi="David"/>
-          <w:b w:val="0"/>
+          <w:rFonts w:ascii="David" w:hAnsi="David" w:cs="David"/>
           <w:sz w:val="24"/>
-          <w:rFonts w:ascii="David" w:hAnsi="David" w:cs="David"/>
           <w:szCs w:val="24"/>
+          <w:highlight w:val="cyan"/>
           <w:rtl w:val="1"/>
-          <w:highlight w:val="cyan"/>
         </w:rPr>
         <w:t xml:space="preserve"> אני יודעת עד כמה חשובים סדר, ניקיון ואוכל טוב. בלי זה יהיה תוהו ובוהו. מעולם לא ראיתי אמא שלא מחליפה טיטול רטוב ומלוכלך רק כי הילד לא רוצה. עוד עליי לעבור על התפריט השבועי, והנה הגיע המשלוח של שמיכות החורף והציפות.</w:t>
       </w:r>
       <w:r>
         <w:rPr>
-          <w:rFonts w:ascii="David" w:hAnsi="David"/>
-          <w:b w:val="0"/>
+          <w:rFonts w:ascii="David" w:hAnsi="David" w:cs="David"/>
           <w:sz w:val="24"/>
-          <w:rFonts w:ascii="David" w:hAnsi="David" w:cs="David"/>
           <w:szCs w:val="24"/>
           <w:rtl w:val="1"/>
         </w:rPr>
@@ -1151,13 +1022,11 @@
       </w:r>
       <w:r>
         <w:rPr>
-          <w:rFonts w:ascii="David" w:hAnsi="David"/>
-          <w:b w:val="0"/>
+          <w:rFonts w:ascii="David" w:hAnsi="David" w:cs="David"/>
           <w:sz w:val="24"/>
-          <w:rFonts w:ascii="David" w:hAnsi="David" w:cs="David"/>
           <w:szCs w:val="24"/>
+          <w:highlight w:val="yellow"/>
           <w:rtl w:val="1"/>
-          <w:highlight w:val="yellow"/>
         </w:rPr>
         <w:t>ילדים צריכים להרגיש עטופים בחום.</w:t>
       </w:r>
@@ -1170,10 +1039,8 @@
       </w:pPr>
       <w:r>
         <w:rPr>
-          <w:rFonts w:ascii="David" w:hAnsi="David"/>
-          <w:b w:val="0"/>
+          <w:rFonts w:ascii="David" w:hAnsi="David" w:cs="David"/>
           <w:sz w:val="20"/>
-          <w:rFonts w:ascii="David" w:hAnsi="David" w:cs="David"/>
           <w:szCs w:val="20"/>
           <w:rtl w:val="1"/>
         </w:rPr>

</xml_diff>

<commit_message>
Deepen the personal reflections (Q3c and Q4)
Expand the reflections with more introspective depth and richer use of
course concepts: distinguishing stability from rigidity, retreating to
handling when holding is called for, rescue fantasy, reading
countertransference as projective identification/reverie, destruction as
a survival test, and the humility that the daily work is the treatment.

Co-Authored-By: Claude Opus 4.8 <noreply@anthropic.com>
Claude-Session: https://claude.ai/code/session_013eDJJACHg3huLEj7ZFfo9K
</commit_message>
<xml_diff>
--- a/עבודה_מסכמת_נוער_בסיכון_מורה_לחיים.docx
+++ b/עבודה_מסכמת_נוער_בסיכון_מורה_לחיים.docx
@@ -412,7 +412,7 @@
           <w:szCs w:val="24"/>
           <w:rtl w:val="1"/>
         </w:rPr>
-        <w:t>[חלק זה יש להתאים אישית] מאפיין שאני מרגישה שקיים בי הוא היכולת ליציבות. אני נוטה להחזיק גבול ברוגע גם כשסוער, ולחפש דרך יצירתית במקום להיגרר ל“מאבק כוחות”, כלומר לנוע בין עמידה לתנועה בלי ליפול ל“הליכה אל הקצוות”. מאפיין שחסר לי, לפחות חלקית, הוא היכולת לשאת תלות ולהיות משמעותי. יש בי חשש להיות המוקד שאליו נער מפנה תלות מוחלטת, ולעיתים אני שומרת מרחק כדי לא להסתכן. אני מבינה שזה קשור גם לצורך שלי ב“תגמול חיצוני”, בעוד שבעבודה הזאת ה“תגמול הפנימי” הוא הכוח המניע, וכדי לפתח את היכולת הזאת אני זקוקה בעצמי לסביבה יציבה ולהדרכה (ביבי ואח′, 2016).</w:t>
+        <w:t>[חלק זה יש להתאים אישית] המאפיין שאני מרגישה שקיים בי הוא היכולת ליציבות. גם כשמולי נער סוער אני מצליחה לרוב להחזיק את הגבול בלי להתפרק ובלי להיסחף למאבק כוחות, ולזכור שהגבול קיים גם כשהנער לא מצליח לעמוד בו. עם זאת, ככל שאני מתבוננת בעצמי אני מבחינה שהיציבות הזאת לא תמיד מגיעה ממקום רגוע. לפעמים היא באה לי דווקא מתוך צורך לשלוט, ואני לומדת להבדיל בין יציבות שנשענת על עמדה פנימית שקטה לבין קשיחות שמתחפשת לרוגע. האתגר שלי הוא לשמור על הקוטב השני, על התנועה והגמישות, בלי ליפול ל“הליכה אל הקצוות”. המאפיין שחסר לי, לפחות חלקית, הוא היכולת לשאת תלות ולהיות משמעותית. יש בי חשש אמיתי להיות הדמות שאליה נער מפנה תלות מוחלטת, ולא פעם אני מגלה שאני נסוגה אל ה-handling, אל המשימות והארגון, בדיוק ברגעים שבהם נדרשת ממני נוכחות רגשית מחזיקה. קל לי יותר לדאוג לסדר מאשר להישאר בתוך המפגש הרגשי עצמו. אני חושבת שזה קשור גם לצורך שלי בתגמול חיצוני, בהכרה ובתודה, בעוד שבעבודה עם נוער בסיכון התגמול הוא לרוב פנימי, ולעיתים אין תמורה כלל. אני גם מזהה בי מדי פעם את פנטזיית ההצלה, המשאלה להיות זו שתרפא, ואת האכזבה שמציפה אותי כשהנער דוחה דווקא את הקרבה שהצעתי. כדי לפתח את היכולת הזאת אני מבינה שאני עצמי זקוקה להיות מוחזקת, לסביבה יציבה ולהדרכה שתאפשר לי לעבד את מה שהמפגש מעורר בי (ביבי ואח′, 2016).</w:t>
       </w:r>
     </w:p>
     <w:p>
@@ -486,7 +486,7 @@
           <w:szCs w:val="24"/>
           <w:rtl w:val="1"/>
         </w:rPr>
-        <w:t>ברמה התיאורטית, הדבר שחידש והפתיע אותי יותר מכול הוא הרעיון ש“התנהגות היא שפה”. עד הקורס נטיתי לראות התפרצות או חוצפה כ“בעיית משמעת” שצריך לעצור, והיום אני שומעת מתחתה שאלה: מה הילד מנסה לספר ואיזה חוסר הוא מבטא. ברמה האישית נגע לליבי להבין כמה מהתגובות שלי לילדים נובעות מיחסי האובייקט המוקדמים שלי עצמי, ושגם אני, כאיש צוות, זקוקה להיות מוחזקת. דוגמה קונקרטית לשינוי תפיסה: מול נער שהתפרץ עליי בעבר הייתי מגיבה מיד בגבול ובעונש, והיום הייתי מתכווננת ומכילה קודם, ורק אז מציבה גבול כמעשה מיטיב.</w:t>
+        <w:t>ברמה התיאורטית, מה שחידש והפתיע אותי יותר מכול הוא התפיסה ש“התנהגות היא שפה”. עד הקורס נטיתי לראות התפרצות, חוצפה או הרס כ“בעיית משמעת” שיש לעצור, והיום אני שומעת מתחתם שאלה אחרת: מה הנער מנסה לספר, ואיזה חוסר מוקדם מדבר דרך ההתנהגות. במיוחד נגע בי הרעיון שההרס הוא לעיתים מבחן של הישרדות, שהנער תוקף כדי לבדוק אם אשרוד ואשאר, ושאם אעמוד בזה בלי להישבר ובלי להיעלב, דווקא אז תיפתח האפשרות לקרבה. ברמה האישית, מה שנגע לליבי הוא ההבנה עד כמה התגובות שלי לנערים נובעות מיחסי האובייקט המוקדמים שלי עצמי, ושהכעס או חוסר האונים שעולים בי במפגש אינם רק שלי, אלא לעיתים הזדהות השלכתית, מסר על עולמו הפנימי של הנער. דוגמה קונקרטית לשינוי תפיסה: מול נער שהתפרץ עליי בעבר הייתי מגיבה מיד בגבול ובעונש, מתוך העלבון; היום הייתי מנסה קודם להתכוונן ולהכיל, לזהות את החרדה שמתחת לזעם, ורק אז להציב גבול, לא כענישה אלא כמעשה מיטיב.</w:t>
       </w:r>
     </w:p>
     <w:p>
@@ -524,7 +524,7 @@
           <w:szCs w:val="24"/>
           <w:rtl w:val="1"/>
         </w:rPr>
-        <w:t>בעבודתי עם הנוער הקשר הזה מתבטא בשגרה, בסדר היום ובגבולות היומיומיים, שאני מבינה עכשיו כ-handling ו-holding ולא כ“רעש במערכת”, ובהבנה שהצבת גבול היא “נתינה”. גם מול הרס אני מנסה “לשרוד” בלי להישבר ולראות בהתנהגות מופע שמספר סיפור, במקום עבירת משמעת שיש להעניש.</w:t>
+        <w:t>הקשר בין התיאוריה לפרקטיקה נעשה עבורי מוחשי מאוד. השגרה, סדר היום והגבולות, שנראו לי פעם טכניים, מובנים לי היום כ-handling וכ-holding, כמעטפת שמעניקה לנער רציפות וביטחון, ולא כ“רעש במערכת”. אני מקשיבה אחרת גם להעברה הנגדית שלי: הרגש שמתעורר בי במפגש הפך לכלי, לרוורי שדרכו אני מנסה להבין מה הנער מפקיד בי, ומתי אני נשאבת לפנטזיית הצלה במקום פשוט לשרוד ולהישאר נוכחת. ההבנה שהמרחב עצמו, הקשר היומיומי, הוא הכלי הטיפולי המרכזי, שינתה את האופן שבו אני רואה את מה שאני עושה בכל יום.</w:t>
       </w:r>
     </w:p>
     <w:p>
@@ -562,7 +562,7 @@
           <w:szCs w:val="24"/>
           <w:rtl w:val="1"/>
         </w:rPr>
-        <w:t>הייתי רוצה שנרחיב בכלים מעשיים לרגעים של הצפה בזמן אמת, וכן במקום מובנה לעבד את מה שהעבודה הזאת מעוררת בנו כאנשי צוות, אולי דרך הדרכה קבוצתית כ-on-going-process.</w:t>
+        <w:t>הייתי רוצה שנרחיב בכלים מעשיים לרגעים של הצפה בזמן אמת, כשההכלה שלי מתמלאת והיכולת לחשוב מצטמצמת. הייתי רוצה גם מקום מובנה יותר לעבד את מה שהעבודה מעוררת בנו כאנשי צוות, אולי דרך הדרכה קבוצתית כ-on-going-process, וכן התייחסות רחבה יותר לעבודה עם ההורים ועם המערכת שסביב הנער.</w:t>
       </w:r>
     </w:p>
     <w:p>
@@ -600,7 +600,7 @@
           <w:szCs w:val="24"/>
           <w:rtl w:val="1"/>
         </w:rPr>
-        <w:t>מה שהשפיע עליי יותר מכול הוא שהקורס נתן לי שפה למה שכבר עשיתי באינטואיציה, וההבנה שהעבודה הפשוטה והיומיומית היא עצמה הטיפול (ביון, 1962; ביבי ואח′, 2016).</w:t>
+        <w:t>מה שהשפיע עליי יותר מכול הוא ההבנה שהעבודה הפשוטה והיומיומית היא עצמה הטיפול, ושאיני צריכה להיות גיבורה שמצילה. יש בזה גם ענווה וגם הקלה: איני חייבת לסיים את המלאכה, אך גם איני חופשייה להיבטל ממנה. הקורס נתן לי שפה ומסגרת למה שחלק ממנו כבר עשיתי באינטואיציה, וזה מה שיישאר איתי (ביון, 1962; ביבי ואח′, 2016).</w:t>
       </w:r>
     </w:p>
     <w:p>

</xml_diff>

<commit_message>
Mark handling/holding on the actual book pages (Q2 appendix)
Replace the typed color-coded passage with the real book pages 91-94,
highlighted in place: handling in light blue, holding in yellow. Embed
the four marked pages in the Word appendix and add a standalone PDF of
them for attaching as a separate file per the assignment instructions.

Co-Authored-By: Claude Opus 4.8 <noreply@anthropic.com>
Claude-Session: https://claude.ai/code/session_013eDJJACHg3huLEj7ZFfo9K
</commit_message>
<xml_diff>
--- a/עבודה_מסכמת_נוער_בסיכון_מורה_לחיים.docx
+++ b/עבודה_מסכמת_נוער_בסיכון_מורה_לחיים.docx
@@ -773,268 +773,168 @@
     </w:p>
     <w:p>
       <w:pPr>
-        <w:spacing w:line="360" w:lineRule="auto" w:before="0" w:after="120"/>
-        <w:jc w:val="both"/>
-        <w:bidi w:val="1"/>
+        <w:spacing w:after="80"/>
+        <w:jc w:val="center"/>
       </w:pPr>
       <w:r>
-        <w:rPr>
-          <w:rFonts w:ascii="David" w:hAnsi="David" w:cs="David"/>
-          <w:sz w:val="24"/>
-          <w:szCs w:val="24"/>
-          <w:rtl w:val="1"/>
-        </w:rPr>
-        <w:t xml:space="preserve">המטלות נחתו עלינו היום בזו אחר זו, </w:t>
+        <w:drawing>
+          <wp:inline xmlns:a="http://schemas.openxmlformats.org/drawingml/2006/main" xmlns:pic="http://schemas.openxmlformats.org/drawingml/2006/picture">
+            <wp:extent cx="5029200" cy="7113620"/>
+            <wp:docPr id="1" name="Picture 1"/>
+            <wp:cNvGraphicFramePr>
+              <a:graphicFrameLocks noChangeAspect="1"/>
+            </wp:cNvGraphicFramePr>
+            <a:graphic>
+              <a:graphicData uri="http://schemas.openxmlformats.org/drawingml/2006/picture">
+                <pic:pic>
+                  <pic:nvPicPr>
+                    <pic:cNvPr id="0" name="p91_hl.png"/>
+                    <pic:cNvPicPr/>
+                  </pic:nvPicPr>
+                  <pic:blipFill>
+                    <a:blip r:embed="rId9"/>
+                    <a:stretch>
+                      <a:fillRect/>
+                    </a:stretch>
+                  </pic:blipFill>
+                  <pic:spPr>
+                    <a:xfrm>
+                      <a:off x="0" y="0"/>
+                      <a:ext cx="5029200" cy="7113620"/>
+                    </a:xfrm>
+                    <a:prstGeom prst="rect"/>
+                  </pic:spPr>
+                </pic:pic>
+              </a:graphicData>
+            </a:graphic>
+          </wp:inline>
+        </w:drawing>
       </w:r>
+    </w:p>
+    <w:p>
+      <w:pPr>
+        <w:spacing w:after="80"/>
+        <w:jc w:val="center"/>
+      </w:pPr>
       <w:r>
-        <w:rPr>
-          <w:rFonts w:ascii="David" w:hAnsi="David" w:cs="David"/>
-          <w:sz w:val="24"/>
-          <w:szCs w:val="24"/>
-          <w:highlight w:val="cyan"/>
-          <w:rtl w:val="1"/>
-        </w:rPr>
-        <w:t>יש לדאוג לכל ההתארגנות לקראת החורף. חשבתי איזה בגדים יש לכל אחת מהן, ולמי חסר מעיל. נדמה שהשנה כולן גדלו כל כך, וצריך יהיה לרכוש לרובן בגדים חדשים.</w:t>
+        <w:drawing>
+          <wp:inline xmlns:a="http://schemas.openxmlformats.org/drawingml/2006/main" xmlns:pic="http://schemas.openxmlformats.org/drawingml/2006/picture">
+            <wp:extent cx="5029200" cy="7113620"/>
+            <wp:docPr id="2" name="Picture 2"/>
+            <wp:cNvGraphicFramePr>
+              <a:graphicFrameLocks noChangeAspect="1"/>
+            </wp:cNvGraphicFramePr>
+            <a:graphic>
+              <a:graphicData uri="http://schemas.openxmlformats.org/drawingml/2006/picture">
+                <pic:pic>
+                  <pic:nvPicPr>
+                    <pic:cNvPr id="0" name="p92_hl.png"/>
+                    <pic:cNvPicPr/>
+                  </pic:nvPicPr>
+                  <pic:blipFill>
+                    <a:blip r:embed="rId10"/>
+                    <a:stretch>
+                      <a:fillRect/>
+                    </a:stretch>
+                  </pic:blipFill>
+                  <pic:spPr>
+                    <a:xfrm>
+                      <a:off x="0" y="0"/>
+                      <a:ext cx="5029200" cy="7113620"/>
+                    </a:xfrm>
+                    <a:prstGeom prst="rect"/>
+                  </pic:spPr>
+                </pic:pic>
+              </a:graphicData>
+            </a:graphic>
+          </wp:inline>
+        </w:drawing>
       </w:r>
+    </w:p>
+    <w:p>
+      <w:pPr>
+        <w:spacing w:after="80"/>
+        <w:jc w:val="center"/>
+      </w:pPr>
       <w:r>
-        <w:rPr>
-          <w:rFonts w:ascii="David" w:hAnsi="David" w:cs="David"/>
-          <w:sz w:val="24"/>
-          <w:szCs w:val="24"/>
-          <w:highlight w:val="yellow"/>
-          <w:rtl w:val="1"/>
-        </w:rPr>
-        <w:t xml:space="preserve"> אמנם יש את אלה שנותרו מיניאטוריות, בעיקר בת-אל, שמטרידה אותי.</w:t>
+        <w:drawing>
+          <wp:inline xmlns:a="http://schemas.openxmlformats.org/drawingml/2006/main" xmlns:pic="http://schemas.openxmlformats.org/drawingml/2006/picture">
+            <wp:extent cx="5029200" cy="7113620"/>
+            <wp:docPr id="3" name="Picture 3"/>
+            <wp:cNvGraphicFramePr>
+              <a:graphicFrameLocks noChangeAspect="1"/>
+            </wp:cNvGraphicFramePr>
+            <a:graphic>
+              <a:graphicData uri="http://schemas.openxmlformats.org/drawingml/2006/picture">
+                <pic:pic>
+                  <pic:nvPicPr>
+                    <pic:cNvPr id="0" name="p93_hl.png"/>
+                    <pic:cNvPicPr/>
+                  </pic:nvPicPr>
+                  <pic:blipFill>
+                    <a:blip r:embed="rId11"/>
+                    <a:stretch>
+                      <a:fillRect/>
+                    </a:stretch>
+                  </pic:blipFill>
+                  <pic:spPr>
+                    <a:xfrm>
+                      <a:off x="0" y="0"/>
+                      <a:ext cx="5029200" cy="7113620"/>
+                    </a:xfrm>
+                    <a:prstGeom prst="rect"/>
+                  </pic:spPr>
+                </pic:pic>
+              </a:graphicData>
+            </a:graphic>
+          </wp:inline>
+        </w:drawing>
       </w:r>
+    </w:p>
+    <w:p>
+      <w:pPr>
+        <w:spacing w:after="80"/>
+        <w:jc w:val="center"/>
+      </w:pPr>
       <w:r>
-        <w:rPr>
-          <w:rFonts w:ascii="David" w:hAnsi="David" w:cs="David"/>
-          <w:sz w:val="24"/>
-          <w:szCs w:val="24"/>
-          <w:rtl w:val="1"/>
-        </w:rPr>
-        <w:t xml:space="preserve"> </w:t>
-      </w:r>
-      <w:r>
-        <w:rPr>
-          <w:rFonts w:ascii="David" w:hAnsi="David" w:cs="David"/>
-          <w:sz w:val="24"/>
-          <w:szCs w:val="24"/>
-          <w:highlight w:val="cyan"/>
-          <w:rtl w:val="1"/>
-        </w:rPr>
-        <w:t>צריך להמשיך לעקוב אחר המשקל והגובה. אדווח על כך למדריכים.</w:t>
-      </w:r>
-      <w:r>
-        <w:rPr>
-          <w:rFonts w:ascii="David" w:hAnsi="David" w:cs="David"/>
-          <w:sz w:val="24"/>
-          <w:szCs w:val="24"/>
-          <w:highlight w:val="yellow"/>
-          <w:rtl w:val="1"/>
-        </w:rPr>
-        <w:t xml:space="preserve"> בתוך ים המחשבות, בעודי מוציאה את קלסר ה“תזונה”, אני חשה בתסכול שעולה בי ומציף אותי.</w:t>
-      </w:r>
-      <w:r>
-        <w:rPr>
-          <w:rFonts w:ascii="David" w:hAnsi="David" w:cs="David"/>
-          <w:sz w:val="24"/>
-          <w:szCs w:val="24"/>
-          <w:highlight w:val="cyan"/>
-          <w:rtl w:val="1"/>
-        </w:rPr>
-        <w:t xml:space="preserve"> מה עוד אפשר לעשות בעניין האכילה?</w:t>
-      </w:r>
-      <w:r>
-        <w:rPr>
-          <w:rFonts w:ascii="David" w:hAnsi="David" w:cs="David"/>
-          <w:sz w:val="24"/>
-          <w:szCs w:val="24"/>
-          <w:highlight w:val="yellow"/>
-          <w:rtl w:val="1"/>
-        </w:rPr>
-        <w:t xml:space="preserve"> למדתי שדרך האוכל והאכילה הבנות מספרות לנו הרבה על עצמן, אבל לפעמים אני מעדיפה שיספרו פחות. </w:t>
-      </w:r>
-      <w:r>
-        <w:rPr>
-          <w:rFonts w:ascii="David" w:hAnsi="David" w:cs="David"/>
-          <w:sz w:val="24"/>
-          <w:szCs w:val="24"/>
-          <w:highlight w:val="yellow"/>
-          <w:rtl w:val="1"/>
-        </w:rPr>
-        <w:t xml:space="preserve">אתמול הרגשתי כאילו חלום מתגשם. נטלי, שבמשך שנה אכלה בצורה שדוחה את הבנות שלידה, </w:t>
-      </w:r>
-      <w:r>
-        <w:rPr>
-          <w:rFonts w:ascii="David" w:hAnsi="David" w:cs="David"/>
-          <w:sz w:val="24"/>
-          <w:szCs w:val="24"/>
-          <w:highlight w:val="cyan"/>
-          <w:rtl w:val="1"/>
-        </w:rPr>
-        <w:t>יושבת עכשיו אל השולחן בצורה מאורגנת, והאוכל נשאר בצלחת ולא נמרח לכל עבר. היא אפילו השתדלה להישאר נקייה, ובסיום הארוחה לא היה בהול להזדרז אל הכיור כדי לשטוף פנים וידיים.</w:t>
-      </w:r>
-      <w:r>
-        <w:rPr>
-          <w:rFonts w:ascii="David" w:hAnsi="David" w:cs="David"/>
-          <w:sz w:val="24"/>
-          <w:szCs w:val="24"/>
-          <w:rtl w:val="1"/>
-        </w:rPr>
-        <w:t xml:space="preserve"> דווקא כשנהניתי מנטלי, החלום התמסמס. נילי המדריכה שקיבלה את פניי היתה כעוסה וסיפרה שהבנות שוב התפרצו ושברו ציוד. ידעתי שאני הולכת לכעוס. </w:t>
-      </w:r>
-      <w:r>
-        <w:rPr>
-          <w:rFonts w:ascii="David" w:hAnsi="David" w:cs="David"/>
-          <w:sz w:val="24"/>
-          <w:szCs w:val="24"/>
-          <w:highlight w:val="yellow"/>
-          <w:rtl w:val="1"/>
-        </w:rPr>
-        <w:t>ברגעים כאלה תמיד עולה בי שוב ושוב השאלה: מהיכן העוצמות ההרסניות האלה? למה להרוס ולנתץ? הרי אחר כך הן מצטערות כל כך.</w:t>
-      </w:r>
-      <w:r>
-        <w:rPr>
-          <w:rFonts w:ascii="David" w:hAnsi="David" w:cs="David"/>
-          <w:sz w:val="24"/>
-          <w:szCs w:val="24"/>
-          <w:rtl w:val="1"/>
-        </w:rPr>
-        <w:t xml:space="preserve"> נילי מספרת לי על ההתפרצות של מיכל וליאת, ושהיה קשה מאוד להרגיע אותן. </w:t>
-      </w:r>
-      <w:r>
-        <w:rPr>
-          <w:rFonts w:ascii="David" w:hAnsi="David" w:cs="David"/>
-          <w:sz w:val="24"/>
-          <w:szCs w:val="24"/>
-          <w:highlight w:val="yellow"/>
-          <w:rtl w:val="1"/>
-        </w:rPr>
-        <w:t>אני חושבת שליאת חסרת שקט מאז החופשה האחרונה, ונראה לי שלא כדאי שתצא בפעם הבאה. הבנות החדשות עדיין לא מרגישות שהמקום הזה שייך להן.</w:t>
-      </w:r>
-      <w:r>
-        <w:rPr>
-          <w:rFonts w:ascii="David" w:hAnsi="David" w:cs="David"/>
-          <w:sz w:val="24"/>
-          <w:szCs w:val="24"/>
-          <w:highlight w:val="yellow"/>
-          <w:rtl w:val="1"/>
-        </w:rPr>
-        <w:t xml:space="preserve"> האמת היא שאני לא יודעת אם הייתי שורדת כאן אם לא הייתי רואה את ההתקדמות של הבוגרות, איך המקום חשוב להן ואיך הן שומרות עליו. אני חוזרת לידיעה הזאת כדי לקבל כוחות ואופטימיות.</w:t>
-      </w:r>
-      <w:r>
-        <w:rPr>
-          <w:rFonts w:ascii="David" w:hAnsi="David" w:cs="David"/>
-          <w:sz w:val="24"/>
-          <w:szCs w:val="24"/>
-          <w:rtl w:val="1"/>
-        </w:rPr>
-        <w:t xml:space="preserve"> קבוצת הבנות ששבה מבית הספר ממטירה עליי טענות על מחושים שונים. </w:t>
-      </w:r>
-      <w:r>
-        <w:rPr>
-          <w:rFonts w:ascii="David" w:hAnsi="David" w:cs="David"/>
-          <w:sz w:val="24"/>
-          <w:szCs w:val="24"/>
-          <w:highlight w:val="cyan"/>
-          <w:rtl w:val="1"/>
-        </w:rPr>
-        <w:t>לאחת אני מדמיינת חלוק לבן, לרגע מודדת חום בכף ידי, לשנייה בודקת גרון, לשלישית מעסה את כף היד, ולכולן מבטיחה תה בסיום הארוחה.</w:t>
-      </w:r>
-      <w:r>
-        <w:rPr>
-          <w:rFonts w:ascii="David" w:hAnsi="David" w:cs="David"/>
-          <w:sz w:val="24"/>
-          <w:szCs w:val="24"/>
-          <w:highlight w:val="yellow"/>
-          <w:rtl w:val="1"/>
-        </w:rPr>
-        <w:t xml:space="preserve"> הן יודעות שאני יודעת, ובכל זאת. נחמד לדעת שאני לא מפספסת את אלה שבאמת חולות.</w:t>
-      </w:r>
-      <w:r>
-        <w:rPr>
-          <w:rFonts w:ascii="David" w:hAnsi="David" w:cs="David"/>
-          <w:sz w:val="24"/>
-          <w:szCs w:val="24"/>
-          <w:highlight w:val="yellow"/>
-          <w:rtl w:val="1"/>
-        </w:rPr>
-        <w:t xml:space="preserve"> אתמול חשבתי: למה דווקא לתפקיד שלי החליטו לקרוא ′אם בית′? זכיתי בתואר ′אם′ וגם ′בית′, ורק בשם התפקיד נמצא כל כך הרבה ממה שרוצים אותו הכי-הכי.</w:t>
-      </w:r>
-      <w:r>
-        <w:rPr>
-          <w:rFonts w:ascii="David" w:hAnsi="David" w:cs="David"/>
-          <w:sz w:val="24"/>
-          <w:szCs w:val="24"/>
-          <w:rtl w:val="1"/>
-        </w:rPr>
-        <w:t xml:space="preserve"> לפעמים קשה להיות אם בית. </w:t>
-      </w:r>
-      <w:r>
-        <w:rPr>
-          <w:rFonts w:ascii="David" w:hAnsi="David" w:cs="David"/>
-          <w:sz w:val="24"/>
-          <w:szCs w:val="24"/>
-          <w:highlight w:val="cyan"/>
-          <w:rtl w:val="1"/>
-        </w:rPr>
-        <w:t>כשמתאמצים שתהיה ארוחת ערב טעימה, רק כדי שכמה בנות יפרקו אותה ולא יאפשרו ליהנות מהפיצה ומהמרק שהושקע בהם עמל,</w:t>
-      </w:r>
-      <w:r>
-        <w:rPr>
-          <w:rFonts w:ascii="David" w:hAnsi="David" w:cs="David"/>
-          <w:sz w:val="24"/>
-          <w:szCs w:val="24"/>
-          <w:highlight w:val="yellow"/>
-          <w:rtl w:val="1"/>
-        </w:rPr>
-        <w:t xml:space="preserve"> שם קשה לי להיות האמא של הבית. כמו כל אמא, אני רוצה שהן יצליחו וישמחו, והן כל כך נלחמות בזה. יש פעמים שאני נושמת עמוק לפני שאני נכנסת, מגייסת מתוכי את כל הקולות והצבעים של אמא ובית, מביאה אותם איתי פנימה. איזה קסם זה עושה לפעמים.</w:t>
-      </w:r>
-      <w:r>
-        <w:rPr>
-          <w:rFonts w:ascii="David" w:hAnsi="David" w:cs="David"/>
-          <w:sz w:val="24"/>
-          <w:szCs w:val="24"/>
-          <w:highlight w:val="yellow"/>
-          <w:rtl w:val="1"/>
-        </w:rPr>
-        <w:t xml:space="preserve"> במטלות השגרתיות אין את תחושת הקסם, אבל בלעדיהן אי אפשר לטפל.</w:t>
-      </w:r>
-      <w:r>
-        <w:rPr>
-          <w:rFonts w:ascii="David" w:hAnsi="David" w:cs="David"/>
-          <w:sz w:val="24"/>
-          <w:szCs w:val="24"/>
-          <w:highlight w:val="cyan"/>
-          <w:rtl w:val="1"/>
-        </w:rPr>
-        <w:t xml:space="preserve"> אני יודעת עד כמה חשובים סדר, ניקיון ואוכל טוב. בלי זה יהיה תוהו ובוהו. מעולם לא ראיתי אמא שלא מחליפה טיטול רטוב ומלוכלך רק כי הילד לא רוצה. עוד עליי לעבור על התפריט השבועי, והנה הגיע המשלוח של שמיכות החורף והציפות.</w:t>
-      </w:r>
-      <w:r>
-        <w:rPr>
-          <w:rFonts w:ascii="David" w:hAnsi="David" w:cs="David"/>
-          <w:sz w:val="24"/>
-          <w:szCs w:val="24"/>
-          <w:rtl w:val="1"/>
-        </w:rPr>
-        <w:t xml:space="preserve"> </w:t>
-      </w:r>
-      <w:r>
-        <w:rPr>
-          <w:rFonts w:ascii="David" w:hAnsi="David" w:cs="David"/>
-          <w:sz w:val="24"/>
-          <w:szCs w:val="24"/>
-          <w:highlight w:val="yellow"/>
-          <w:rtl w:val="1"/>
-        </w:rPr>
-        <w:t>ילדים צריכים להרגיש עטופים בחום.</w:t>
+        <w:drawing>
+          <wp:inline xmlns:a="http://schemas.openxmlformats.org/drawingml/2006/main" xmlns:pic="http://schemas.openxmlformats.org/drawingml/2006/picture">
+            <wp:extent cx="5029200" cy="7113620"/>
+            <wp:docPr id="4" name="Picture 4"/>
+            <wp:cNvGraphicFramePr>
+              <a:graphicFrameLocks noChangeAspect="1"/>
+            </wp:cNvGraphicFramePr>
+            <a:graphic>
+              <a:graphicData uri="http://schemas.openxmlformats.org/drawingml/2006/picture">
+                <pic:pic>
+                  <pic:nvPicPr>
+                    <pic:cNvPr id="0" name="p94_hl.png"/>
+                    <pic:cNvPicPr/>
+                  </pic:nvPicPr>
+                  <pic:blipFill>
+                    <a:blip r:embed="rId12"/>
+                    <a:stretch>
+                      <a:fillRect/>
+                    </a:stretch>
+                  </pic:blipFill>
+                  <pic:spPr>
+                    <a:xfrm>
+                      <a:off x="0" y="0"/>
+                      <a:ext cx="5029200" cy="7113620"/>
+                    </a:xfrm>
+                    <a:prstGeom prst="rect"/>
+                  </pic:spPr>
+                </pic:pic>
+              </a:graphicData>
+            </a:graphic>
+          </wp:inline>
+        </w:drawing>
       </w:r>
     </w:p>
     <w:p>
       <w:pPr>
         <w:spacing w:line="360" w:lineRule="auto" w:before="120" w:after="120"/>
-        <w:jc w:val="right"/>
+        <w:jc w:val="center"/>
         <w:bidi w:val="1"/>
       </w:pPr>
       <w:r>
@@ -1044,7 +944,7 @@
           <w:szCs w:val="20"/>
           <w:rtl w:val="1"/>
         </w:rPr>
-        <w:t>* מומלץ לסמן באותם שני צבעים גם על גבי דפי הספר המצולמים ולצרפם, כפי שמבקשת המטלה.</w:t>
+        <w:t>הסימון בוצע על דפי הספר עצמם (עמ′ 91–94): כחול בהיר = handling, צהוב = holding.</w:t>
       </w:r>
     </w:p>
     <w:sectPr>

</xml_diff>

<commit_message>
Name the book chapters explicitly in the answers
Attribute key claims to their chapters in the source book ("behavior as
language", the borrowing-of-motherhood chapter, the good-enough staff
member), so the grounding in Bibi, Oren-Chipman & Blenro-Adiv (2016) is
explicit; shorten the now-redundant end citations to "et al.".

Co-Authored-By: Claude Opus 4.8 <noreply@anthropic.com>
Claude-Session: https://claude.ai/code/session_013eDJJACHg3huLEj7ZFfo9K
</commit_message>
<xml_diff>
--- a/עבודה_מסכמת_נוער_בסיכון_מורה_לחיים.docx
+++ b/עבודה_מסכמת_נוער_בסיכון_מורה_לחיים.docx
@@ -128,7 +128,7 @@
           <w:szCs w:val="24"/>
           <w:rtl w:val="1"/>
         </w:rPr>
-        <w:t>ההתנהגות היא שפה, ומופע התנהגותי הוא הדרך שבה ילד מראה לעולם את מה שאין לו מילים לומר. כשנחסמת היכולת להמשיג ולהסביר, הילד “מתנהג את מצוקתו” במקום לספר אותה. המופע קיים משום שאצל ילדים שנשאו פגיעה ראשונית, סביבה שלא הצליחה לווסת אותם בראשית חייהם, לא נבנו מנגנוני ויסות וארגון עצמי, והחרדה, עד כדי חרדת כיליון, נותרת מציפה ובלתי מוכלת. לכן המופע הוא בעת ובעונה אחת פורקן של דחף לא מעובד וניסיון נואש לתקשר. מבין מופעי ההתנהגות אפשר למנות חרדה, פחד מקרבה, עצב וריקנות, מחשבה שאינה נחשבת, והרס וכיליון, ואצל האחד תתפרץ תוקפנות בעוד אצל האחר תופיע שקיעה ודכדוך. מה עלינו לעשות? לא להיבהל ולא לפעול מתוך העלבון, אלא להתכוונן אל המופע, לחפש את הסיפור שמתחתיו ולהחזיק אותו עבור הילד עד שנוכל להשיב לו אותו במילים (ביבי, אורן-צ′יפמן ובלנרו-אדיב, 2016; פונגי, אלן וביטמן, 2008).</w:t>
+        <w:t>בפרק “התנהגות כשפה” טוענים ביבי, אורן-צ′יפמן ובלנרו-אדיב שההתנהגות היא שפה, ומופע התנהגותי הוא הדרך שבה ילד מראה לעולם את מה שאין לו מילים לומר. כשנחסמת היכולת להמשיג ולהסביר, הילד “מתנהג את מצוקתו” במקום לספר אותה. המופע קיים משום שאצל ילדים שנשאו פגיעה ראשונית, סביבה שלא הצליחה לווסת אותם בראשית חייהם, לא נבנו מנגנוני ויסות וארגון עצמי, והחרדה, עד כדי חרדת כיליון, נותרת מציפה ובלתי מוכלת. לכן המופע הוא בעת ובעונה אחת פורקן של דחף לא מעובד וניסיון נואש לתקשר. מבין מופעי ההתנהגות אפשר למנות חרדה, פחד מקרבה, עצב וריקנות, מחשבה שאינה נחשבת, והרס וכיליון, ואצל האחד תתפרץ תוקפנות בעוד אצל האחר תופיע שקיעה ודכדוך. מה עלינו לעשות? לא להיבהל ולא לפעול מתוך העלבון, אלא להתכוונן אל המופע, לחפש את הסיפור שמתחתיו ולהחזיק אותו עבור הילד עד שנוכל להשיב לו אותו במילים (ביבי ואח′, 2016; פונגי, אלן וביטמן, 2008).</w:t>
       </w:r>
     </w:p>
     <w:p>
@@ -216,7 +216,7 @@
           <w:szCs w:val="24"/>
           <w:rtl w:val="1"/>
         </w:rPr>
-        <w:t>אחזקה שלמה היא צירוף של שני רבדים מן הפונקציות האימהיות שאי אפשר להפריד ביניהם. ה-handling הוא הארגון והניהול הפיזי של הסביבה: ההאכלה, הניקיון, הבגדים, מעקב אחר הגוף וגבולות המציאות שיש להם משמעות התפתחותית. הוא זה שמחבר את הילד לגופו ויוצר “האנשה”. ה-holding הוא ההחזקה הרגשית: נוכחות רציפה ועקבית, אם שחושבת את הילד ומעניקה משמעות לחוויותיו, ומייצרת רציפות, עקביות והמשכיות, ובתוכה “מרחב ביניים” שבו הילד יכול לחקור בידיעה שהאם שם. יחד הם בונים אצל הילד את מה שחסר לו, ביטחון בסיסי, ומתוכו, בהדרגה, יכולת לווסת את עצמו ולהוציא את העצמי האמיתי מהמחבוא, במקום להתגונן דרך עצמי כוזב, בהבחנתו של ויניקוט בין עצמי אמיתי לעצמי כוזב. זהו ההיבט ההתפתחותי: מה שהתחיל כטיפול פיזי חיצוני נעשה עם הזמן מבנה פנימי (ביבי, אורן-צ′יפמן ובלנרו-אדיב, 2016; ויניקוט, 1971).</w:t>
+        <w:t>בפרק העוסק בהשאלת האימהות מתארים ביבי, אורן-צ′יפמן ובלנרו-אדיב את האחזקה השלמה כצירוף של שני רבדים מן הפונקציות האימהיות שאי אפשר להפריד ביניהם. ה-handling הוא הארגון והניהול הפיזי של הסביבה: ההאכלה, הניקיון, הבגדים, מעקב אחר הגוף וגבולות המציאות שיש להם משמעות התפתחותית. הוא זה שמחבר את הילד לגופו ויוצר “האנשה”. ה-holding הוא ההחזקה הרגשית: נוכחות רציפה ועקבית, אם שחושבת את הילד ומעניקה משמעות לחוויותיו, ומייצרת רציפות, עקביות והמשכיות, ובתוכה “מרחב ביניים” שבו הילד יכול לחקור בידיעה שהאם שם. יחד הם בונים אצל הילד את מה שחסר לו, ביטחון בסיסי, ומתוכו, בהדרגה, יכולת לווסת את עצמו ולהוציא את העצמי האמיתי מהמחבוא, במקום להתגונן דרך עצמי כוזב, בהבחנתו של ויניקוט בין עצמי אמיתי לעצמי כוזב. זהו ההיבט ההתפתחותי: מה שהתחיל כטיפול פיזי חיצוני נעשה עם הזמן מבנה פנימי (ביבי ואח′, 2016; ויניקוט, 1971).</w:t>
       </w:r>
     </w:p>
     <w:p>
@@ -277,7 +277,7 @@
           <w:szCs w:val="24"/>
           <w:rtl w:val="1"/>
         </w:rPr>
-        <w:t>העיקרון המנחה הוא לחפש “איש צוות טוב דיו”, אדם שניחן באיכויות אימהיות טבעיות מן הסוג שאם טובה דיה מעניקה לתינוקה, ושמסוגל ומוכן לפתח אותן לכדי יכולות מקצועיות. איננו מחפשים טכניקה, אלא נכונות להשאיל לילד את המקום האימהי המגדל, כלומר “השאלת אימהות” (ביבי, אורן-צ′יפמן ובלנרו-אדיב, 2016).</w:t>
+        <w:t>העיקרון המנחה, כפי שמנסחים אותו ביבי, אורן-צ′יפמן ובלנרו-אדיב, הוא לחפש “איש צוות טוב דיו”, אדם שניחן באיכויות אימהיות טבעיות מן הסוג שאם טובה דיה מעניקה לתינוקה, ושמסוגל ומוכן לפתח אותן לכדי יכולות מקצועיות. איננו מחפשים טכניקה, אלא נכונות להשאיל לילד את המקום האימהי המגדל, כלומר “השאלת אימהות” (ביבי ואח′, 2016).</w:t>
       </w:r>
     </w:p>
     <w:p>

</xml_diff>

<commit_message>
Add a title page with the Ono Academic College logo
Turn the header into a proper cover page: centered college logo, the
"summary assignment" title, course, film, lecturer, semester, and
name/ID lines, followed by a page break so the body starts on page 2.

Co-Authored-By: Claude Opus 4.8 <noreply@anthropic.com>
Claude-Session: https://claude.ai/code/session_013eDJJACHg3huLEj7ZFfo9K
</commit_message>
<xml_diff>
--- a/עבודה_מסכמת_נוער_בסיכון_מורה_לחיים.docx
+++ b/עבודה_מסכמת_נוער_בסיכון_מורה_לחיים.docx
@@ -4,7 +4,47 @@
   <w:body>
     <w:p>
       <w:pPr>
-        <w:spacing w:line="360" w:lineRule="auto" w:before="0" w:after="40"/>
+        <w:spacing w:before="1200" w:after="600"/>
+        <w:jc w:val="center"/>
+      </w:pPr>
+      <w:r>
+        <w:drawing>
+          <wp:inline xmlns:a="http://schemas.openxmlformats.org/drawingml/2006/main" xmlns:pic="http://schemas.openxmlformats.org/drawingml/2006/picture">
+            <wp:extent cx="2377440" cy="1166909"/>
+            <wp:docPr id="1" name="Picture 1"/>
+            <wp:cNvGraphicFramePr>
+              <a:graphicFrameLocks noChangeAspect="1"/>
+            </wp:cNvGraphicFramePr>
+            <a:graphic>
+              <a:graphicData uri="http://schemas.openxmlformats.org/drawingml/2006/picture">
+                <pic:pic>
+                  <pic:nvPicPr>
+                    <pic:cNvPr id="0" name="56af741d-IMG_5776.png"/>
+                    <pic:cNvPicPr/>
+                  </pic:nvPicPr>
+                  <pic:blipFill>
+                    <a:blip r:embed="rId9"/>
+                    <a:stretch>
+                      <a:fillRect/>
+                    </a:stretch>
+                  </pic:blipFill>
+                  <pic:spPr>
+                    <a:xfrm>
+                      <a:off x="0" y="0"/>
+                      <a:ext cx="2377440" cy="1166909"/>
+                    </a:xfrm>
+                    <a:prstGeom prst="rect"/>
+                  </pic:spPr>
+                </pic:pic>
+              </a:graphicData>
+            </a:graphic>
+          </wp:inline>
+        </w:drawing>
+      </w:r>
+    </w:p>
+    <w:p>
+      <w:pPr>
+        <w:spacing w:line="360" w:lineRule="auto" w:before="200" w:after="160"/>
         <w:jc w:val="center"/>
         <w:bidi w:val="1"/>
       </w:pPr>
@@ -13,59 +53,114 @@
           <w:rFonts w:ascii="David" w:hAnsi="David" w:cs="David"/>
           <w:b/>
           <w:bCs/>
-          <w:sz w:val="28"/>
-          <w:szCs w:val="28"/>
+          <w:sz w:val="48"/>
+          <w:szCs w:val="48"/>
           <w:rtl w:val="1"/>
         </w:rPr>
-        <w:t>עבודה מסכמת בקורס “נוער בסיכון: נושאים מתקדמים”</w:t>
+        <w:t>עבודה מסכמת</w:t>
       </w:r>
     </w:p>
     <w:p>
       <w:pPr>
-        <w:spacing w:line="360" w:lineRule="auto" w:before="0" w:after="40"/>
+        <w:spacing w:line="360" w:lineRule="auto" w:before="0" w:after="80"/>
         <w:jc w:val="center"/>
         <w:bidi w:val="1"/>
       </w:pPr>
       <w:r>
         <w:rPr>
           <w:rFonts w:ascii="David" w:hAnsi="David" w:cs="David"/>
-          <w:sz w:val="24"/>
-          <w:szCs w:val="24"/>
+          <w:b/>
+          <w:bCs/>
+          <w:sz w:val="30"/>
+          <w:szCs w:val="30"/>
           <w:rtl w:val="1"/>
         </w:rPr>
-        <w:t>מרצה: אתי אנשל  |  סמסטר ב′, תשפ“ו</w:t>
+        <w:t>קורס: נוער בסיכון – נושאים מתקדמים</w:t>
       </w:r>
     </w:p>
     <w:p>
       <w:pPr>
-        <w:spacing w:line="360" w:lineRule="auto" w:before="0" w:after="40"/>
+        <w:spacing w:line="360" w:lineRule="auto" w:before="0" w:after="800"/>
         <w:jc w:val="center"/>
         <w:bidi w:val="1"/>
       </w:pPr>
       <w:r>
         <w:rPr>
           <w:rFonts w:ascii="David" w:hAnsi="David" w:cs="David"/>
-          <w:sz w:val="24"/>
-          <w:szCs w:val="24"/>
+          <w:sz w:val="26"/>
+          <w:szCs w:val="26"/>
           <w:rtl w:val="1"/>
         </w:rPr>
-        <w:t>הסרט: “מורה לחיים” (The Ron Clark Story)</w:t>
+        <w:t>ניתוח הסרט “מורה לחיים” (The Ron Clark Story)</w:t>
       </w:r>
     </w:p>
     <w:p>
       <w:pPr>
-        <w:spacing w:line="360" w:lineRule="auto" w:before="0" w:after="200"/>
+        <w:spacing w:line="360" w:lineRule="auto" w:before="0" w:after="60"/>
         <w:jc w:val="center"/>
         <w:bidi w:val="1"/>
       </w:pPr>
       <w:r>
         <w:rPr>
           <w:rFonts w:ascii="David" w:hAnsi="David" w:cs="David"/>
-          <w:sz w:val="24"/>
-          <w:szCs w:val="24"/>
+          <w:sz w:val="26"/>
+          <w:szCs w:val="26"/>
           <w:rtl w:val="1"/>
         </w:rPr>
-        <w:t>שם: ______________    ת“ז: ______________</w:t>
+        <w:t>מרצה: אתי אנשל</w:t>
+      </w:r>
+    </w:p>
+    <w:p>
+      <w:pPr>
+        <w:spacing w:line="360" w:lineRule="auto" w:before="0" w:after="800"/>
+        <w:jc w:val="center"/>
+        <w:bidi w:val="1"/>
+      </w:pPr>
+      <w:r>
+        <w:rPr>
+          <w:rFonts w:ascii="David" w:hAnsi="David" w:cs="David"/>
+          <w:sz w:val="26"/>
+          <w:szCs w:val="26"/>
+          <w:rtl w:val="1"/>
+        </w:rPr>
+        <w:t>סמסטר ב′, תשפ“ו</w:t>
+      </w:r>
+    </w:p>
+    <w:p>
+      <w:pPr>
+        <w:spacing w:line="360" w:lineRule="auto" w:before="0" w:after="60"/>
+        <w:jc w:val="center"/>
+        <w:bidi w:val="1"/>
+      </w:pPr>
+      <w:r>
+        <w:rPr>
+          <w:rFonts w:ascii="David" w:hAnsi="David" w:cs="David"/>
+          <w:sz w:val="26"/>
+          <w:szCs w:val="26"/>
+          <w:rtl w:val="1"/>
+        </w:rPr>
+        <w:t>שם: ______________________</w:t>
+      </w:r>
+    </w:p>
+    <w:p>
+      <w:pPr>
+        <w:spacing w:line="360" w:lineRule="auto" w:before="0" w:after="60"/>
+        <w:jc w:val="center"/>
+        <w:bidi w:val="1"/>
+      </w:pPr>
+      <w:r>
+        <w:rPr>
+          <w:rFonts w:ascii="David" w:hAnsi="David" w:cs="David"/>
+          <w:sz w:val="26"/>
+          <w:szCs w:val="26"/>
+          <w:rtl w:val="1"/>
+        </w:rPr>
+        <w:t>תעודת זהות: ______________________</w:t>
+      </w:r>
+    </w:p>
+    <w:p>
+      <w:r>
+        <w:br w:type="page"/>
       </w:r>
     </w:p>
     <w:p>
@@ -780,7 +875,7 @@
         <w:drawing>
           <wp:inline xmlns:a="http://schemas.openxmlformats.org/drawingml/2006/main" xmlns:pic="http://schemas.openxmlformats.org/drawingml/2006/picture">
             <wp:extent cx="5029200" cy="7113620"/>
-            <wp:docPr id="1" name="Picture 1"/>
+            <wp:docPr id="2" name="Picture 2"/>
             <wp:cNvGraphicFramePr>
               <a:graphicFrameLocks noChangeAspect="1"/>
             </wp:cNvGraphicFramePr>
@@ -789,46 +884,6 @@
                 <pic:pic>
                   <pic:nvPicPr>
                     <pic:cNvPr id="0" name="p91_hl.png"/>
-                    <pic:cNvPicPr/>
-                  </pic:nvPicPr>
-                  <pic:blipFill>
-                    <a:blip r:embed="rId9"/>
-                    <a:stretch>
-                      <a:fillRect/>
-                    </a:stretch>
-                  </pic:blipFill>
-                  <pic:spPr>
-                    <a:xfrm>
-                      <a:off x="0" y="0"/>
-                      <a:ext cx="5029200" cy="7113620"/>
-                    </a:xfrm>
-                    <a:prstGeom prst="rect"/>
-                  </pic:spPr>
-                </pic:pic>
-              </a:graphicData>
-            </a:graphic>
-          </wp:inline>
-        </w:drawing>
-      </w:r>
-    </w:p>
-    <w:p>
-      <w:pPr>
-        <w:spacing w:after="80"/>
-        <w:jc w:val="center"/>
-      </w:pPr>
-      <w:r>
-        <w:drawing>
-          <wp:inline xmlns:a="http://schemas.openxmlformats.org/drawingml/2006/main" xmlns:pic="http://schemas.openxmlformats.org/drawingml/2006/picture">
-            <wp:extent cx="5029200" cy="7113620"/>
-            <wp:docPr id="2" name="Picture 2"/>
-            <wp:cNvGraphicFramePr>
-              <a:graphicFrameLocks noChangeAspect="1"/>
-            </wp:cNvGraphicFramePr>
-            <a:graphic>
-              <a:graphicData uri="http://schemas.openxmlformats.org/drawingml/2006/picture">
-                <pic:pic>
-                  <pic:nvPicPr>
-                    <pic:cNvPr id="0" name="p92_hl.png"/>
                     <pic:cNvPicPr/>
                   </pic:nvPicPr>
                   <pic:blipFill>
@@ -868,7 +923,7 @@
               <a:graphicData uri="http://schemas.openxmlformats.org/drawingml/2006/picture">
                 <pic:pic>
                   <pic:nvPicPr>
-                    <pic:cNvPr id="0" name="p93_hl.png"/>
+                    <pic:cNvPr id="0" name="p92_hl.png"/>
                     <pic:cNvPicPr/>
                   </pic:nvPicPr>
                   <pic:blipFill>
@@ -908,11 +963,51 @@
               <a:graphicData uri="http://schemas.openxmlformats.org/drawingml/2006/picture">
                 <pic:pic>
                   <pic:nvPicPr>
+                    <pic:cNvPr id="0" name="p93_hl.png"/>
+                    <pic:cNvPicPr/>
+                  </pic:nvPicPr>
+                  <pic:blipFill>
+                    <a:blip r:embed="rId12"/>
+                    <a:stretch>
+                      <a:fillRect/>
+                    </a:stretch>
+                  </pic:blipFill>
+                  <pic:spPr>
+                    <a:xfrm>
+                      <a:off x="0" y="0"/>
+                      <a:ext cx="5029200" cy="7113620"/>
+                    </a:xfrm>
+                    <a:prstGeom prst="rect"/>
+                  </pic:spPr>
+                </pic:pic>
+              </a:graphicData>
+            </a:graphic>
+          </wp:inline>
+        </w:drawing>
+      </w:r>
+    </w:p>
+    <w:p>
+      <w:pPr>
+        <w:spacing w:after="80"/>
+        <w:jc w:val="center"/>
+      </w:pPr>
+      <w:r>
+        <w:drawing>
+          <wp:inline xmlns:a="http://schemas.openxmlformats.org/drawingml/2006/main" xmlns:pic="http://schemas.openxmlformats.org/drawingml/2006/picture">
+            <wp:extent cx="5029200" cy="7113620"/>
+            <wp:docPr id="5" name="Picture 5"/>
+            <wp:cNvGraphicFramePr>
+              <a:graphicFrameLocks noChangeAspect="1"/>
+            </wp:cNvGraphicFramePr>
+            <a:graphic>
+              <a:graphicData uri="http://schemas.openxmlformats.org/drawingml/2006/picture">
+                <pic:pic>
+                  <pic:nvPicPr>
                     <pic:cNvPr id="0" name="p94_hl.png"/>
                     <pic:cNvPicPr/>
                   </pic:nvPicPr>
                   <pic:blipFill>
-                    <a:blip r:embed="rId12"/>
+                    <a:blip r:embed="rId13"/>
                     <a:stretch>
                       <a:fillRect/>
                     </a:stretch>

</xml_diff>